<commit_message>
Retarget the ECS-vs-EKS DAR to eClaims and scrub the DAR set
- ECS vs EKS: rebuilt for eClaims on AWS Fargate with requirements traced to
  the case study, US East pricing verified on 30 Sep 2026, on-premise options,
  a sensitivity analysis and risks with mitigations; its point matrix equals
  Compute DAR Section 4.5 (ECS 4.45 vs EKS 3.97). Old EC2 launch-type text,
  the Mumbai calculator screenshots and non-primary references are gone.
- Backend, Compute, Orchestration: the prior-cycle provenance narrative is
  removed, the client is YCompany throughout, SAD citations point at v1.1,
  the Compute DAR cross-references the companion document, and the EKS node
  costing in Compute Section 4.4 is corrected (nine m6i.xlarge nodes).
- Version and price claims re-checked at the document date: FastAPI 0.142,
  Uvicorn 0.54, Temporal Cloud from USD 50 per million actions.
- All four re-dated 30-09-2026, titled 'YCompany – eClaims', and renamed to
  the file names the SAD references.
</commit_message>
<xml_diff>
--- a/docs/dar/Utsav_eClaims_DAR_Backend.docx
+++ b/docs/dar/Utsav_eClaims_DAR_Backend.docx
@@ -1,6 +1,6 @@
 
 <file path=word/document.xml><?xml version="1.0" encoding="utf-8"?>
-<w:document xmlns:wpc="http://schemas.microsoft.com/office/word/2010/wordprocessingCanvas" xmlns:cx="http://schemas.microsoft.com/office/drawing/2014/chartex" xmlns:cx1="http://schemas.microsoft.com/office/drawing/2015/9/8/chartex" xmlns:cx2="http://schemas.microsoft.com/office/drawing/2015/10/21/chartex" xmlns:cx3="http://schemas.microsoft.com/office/drawing/2016/5/9/chartex" xmlns:cx4="http://schemas.microsoft.com/office/drawing/2016/5/10/chartex" xmlns:cx5="http://schemas.microsoft.com/office/drawing/2016/5/11/chartex" xmlns:cx6="http://schemas.microsoft.com/office/drawing/2016/5/12/chartex" xmlns:cx7="http://schemas.microsoft.com/office/drawing/2016/5/13/chartex" xmlns:cx8="http://schemas.microsoft.com/office/drawing/2016/5/14/chartex" xmlns:mc="http://schemas.openxmlformats.org/markup-compatibility/2006" xmlns:aink="http://schemas.microsoft.com/office/drawing/2016/ink" xmlns:am3d="http://schemas.microsoft.com/office/drawing/2017/model3d" xmlns:o="urn:schemas-microsoft-com:office:office" xmlns:oel="http://schemas.microsoft.com/office/2019/extlst" xmlns:r="http://schemas.openxmlformats.org/officeDocument/2006/relationships" xmlns:m="http://schemas.openxmlformats.org/officeDocument/2006/math" xmlns:v="urn:schemas-microsoft-com:vml" xmlns:wp14="http://schemas.microsoft.com/office/word/2010/wordprocessingDrawing" xmlns:wp="http://schemas.openxmlformats.org/drawingml/2006/wordprocessingDrawing" xmlns:w10="urn:schemas-microsoft-com:office:word" xmlns:w="http://schemas.openxmlformats.org/wordprocessingml/2006/main" xmlns:w14="http://schemas.microsoft.com/office/word/2010/wordml" xmlns:w15="http://schemas.microsoft.com/office/word/2012/wordml" xmlns:w16cei="http://schemas.microsoft.com/office/word/2026/wordml/cei" xmlns:w16cex="http://schemas.microsoft.com/office/word/2018/wordml/cex" xmlns:w16cid="http://schemas.microsoft.com/office/word/2016/wordml/cid" xmlns:w16="http://schemas.microsoft.com/office/word/2018/wordml" xmlns:w16du="http://schemas.microsoft.com/office/word/2023/wordml/word16du" xmlns:w16sdtdh="http://schemas.microsoft.com/office/word/2020/wordml/sdtdatahash" xmlns:w16sdtfl="http://schemas.microsoft.com/office/word/2024/wordml/sdtformatlock" xmlns:w16se="http://schemas.microsoft.com/office/word/2015/wordml/symex" xmlns:wpg="http://schemas.microsoft.com/office/word/2010/wordprocessingGroup" xmlns:wpi="http://schemas.microsoft.com/office/word/2010/wordprocessingInk" xmlns:wne="http://schemas.microsoft.com/office/word/2006/wordml" xmlns:wps="http://schemas.microsoft.com/office/word/2010/wordprocessingShape" mc:Ignorable="w14 w15 w16se w16cid w16 w16cex w16sdtdh w16sdtfl w16du wp14">
+<w:document xmlns:wpc="http://schemas.microsoft.com/office/word/2010/wordprocessingCanvas" xmlns:cx="http://schemas.microsoft.com/office/drawing/2014/chartex" xmlns:cx1="http://schemas.microsoft.com/office/drawing/2015/9/8/chartex" xmlns:cx2="http://schemas.microsoft.com/office/drawing/2015/10/21/chartex" xmlns:cx3="http://schemas.microsoft.com/office/drawing/2016/5/9/chartex" xmlns:cx4="http://schemas.microsoft.com/office/drawing/2016/5/10/chartex" xmlns:cx5="http://schemas.microsoft.com/office/drawing/2016/5/11/chartex" xmlns:cx6="http://schemas.microsoft.com/office/drawing/2016/5/12/chartex" xmlns:cx7="http://schemas.microsoft.com/office/drawing/2016/5/13/chartex" xmlns:cx8="http://schemas.microsoft.com/office/drawing/2016/5/14/chartex" xmlns:mc="http://schemas.openxmlformats.org/markup-compatibility/2006" xmlns:aink="http://schemas.microsoft.com/office/drawing/2016/ink" xmlns:am3d="http://schemas.microsoft.com/office/drawing/2017/model3d" xmlns:o="urn:schemas-microsoft-com:office:office" xmlns:oel="http://schemas.microsoft.com/office/2019/extlst" xmlns:r="http://schemas.openxmlformats.org/officeDocument/2006/relationships" xmlns:m="http://schemas.openxmlformats.org/officeDocument/2006/math" xmlns:v="urn:schemas-microsoft-com:vml" xmlns:wp14="http://schemas.microsoft.com/office/word/2010/wordprocessingDrawing" xmlns:wp="http://schemas.openxmlformats.org/drawingml/2006/wordprocessingDrawing" xmlns:w10="urn:schemas-microsoft-com:office:word" xmlns:w="http://schemas.openxmlformats.org/wordprocessingml/2006/main" xmlns:w14="http://schemas.microsoft.com/office/word/2010/wordml" xmlns:w15="http://schemas.microsoft.com/office/word/2012/wordml" xmlns:w16cei="http://schemas.microsoft.com/office/word/2026/wordml/cei" xmlns:w16cex="http://schemas.microsoft.com/office/word/2018/wordml/cex" xmlns:w16cid="http://schemas.microsoft.com/office/word/2016/wordml/cid" xmlns:w16="http://schemas.microsoft.com/office/word/2018/wordml" xmlns:w16du="http://schemas.microsoft.com/office/word/2023/wordml/word16du" xmlns:w16sdtdh="http://schemas.microsoft.com/office/word/2020/wordml/sdtdatahash" xmlns:w16sdtfl="http://schemas.microsoft.com/office/word/2024/wordml/sdtformatlock" xmlns:w16se="http://schemas.microsoft.com/office/word/2015/wordml/symex" xmlns:wpg="http://schemas.microsoft.com/office/word/2010/wordprocessingGroup" xmlns:wpi="http://schemas.microsoft.com/office/word/2010/wordprocessingInk" xmlns:wne="http://schemas.microsoft.com/office/word/2006/wordml" xmlns:wps="http://schemas.microsoft.com/office/word/2010/wordprocessingShape" xmlns:a="http://schemas.openxmlformats.org/drawingml/2006/main" xmlns:a14="http://schemas.microsoft.com/office/drawing/2010/main" xmlns:pic="http://schemas.openxmlformats.org/drawingml/2006/picture" mc:Ignorable="w14 w15 w16se w16cid w16 w16cex w16sdtdh w16sdtfl w16du wp14">
   <w:body>
     <w:sdt>
       <w:sdtPr>
@@ -40,20 +40,20 @@
                 <w:rPr>
                   <w:lang w:val="en-IN"/>
                 </w:rPr>
-                <w:t>Nagarro</w:t>
+                <w:t>YCompany – eClaims</w:t>
               </w:r>
               <w:r>
                 <w:rPr>
                   <w:lang w:val="en-IN"/>
                 </w:rPr>
-                <w:t xml:space="preserve"> – </w:t>
+                <w:t xml:space="preserve"/>
               </w:r>
               <w:proofErr w:type="spellStart"/>
               <w:r>
                 <w:rPr>
                   <w:lang w:val="en-IN"/>
                 </w:rPr>
-                <w:t>eClaims</w:t>
+                <w:t/>
               </w:r>
               <w:proofErr w:type="spellEnd"/>
             </w:sdtContent>
@@ -91,9 +91,9 @@
                     <wp:wrapNone/>
                     <wp:docPr id="18" name="Rectangle 2"/>
                     <wp:cNvGraphicFramePr>
-                      <a:graphicFrameLocks xmlns:a="http://schemas.openxmlformats.org/drawingml/2006/main"/>
+                      <a:graphicFrameLocks/>
                     </wp:cNvGraphicFramePr>
-                    <a:graphic xmlns:a="http://schemas.openxmlformats.org/drawingml/2006/main">
+                    <a:graphic>
                       <a:graphicData uri="http://schemas.microsoft.com/office/word/2010/wordprocessingShape">
                         <wps:wsp>
                           <wps:cNvSpPr>
@@ -170,9 +170,9 @@
                     <wp:wrapNone/>
                     <wp:docPr id="17" name="Rectangle 5"/>
                     <wp:cNvGraphicFramePr>
-                      <a:graphicFrameLocks xmlns:a="http://schemas.openxmlformats.org/drawingml/2006/main"/>
+                      <a:graphicFrameLocks/>
                     </wp:cNvGraphicFramePr>
-                    <a:graphic xmlns:a="http://schemas.openxmlformats.org/drawingml/2006/main">
+                    <a:graphic>
                       <a:graphicData uri="http://schemas.microsoft.com/office/word/2010/wordprocessingShape">
                         <wps:wsp>
                           <wps:cNvSpPr>
@@ -252,9 +252,9 @@
                     <wp:wrapNone/>
                     <wp:docPr id="16" name="Rectangle 4"/>
                     <wp:cNvGraphicFramePr>
-                      <a:graphicFrameLocks xmlns:a="http://schemas.openxmlformats.org/drawingml/2006/main"/>
+                      <a:graphicFrameLocks/>
                     </wp:cNvGraphicFramePr>
-                    <a:graphic xmlns:a="http://schemas.openxmlformats.org/drawingml/2006/main">
+                    <a:graphic>
                       <a:graphicData uri="http://schemas.microsoft.com/office/word/2010/wordprocessingShape">
                         <wps:wsp>
                           <wps:cNvSpPr>
@@ -334,9 +334,9 @@
                     <wp:wrapNone/>
                     <wp:docPr id="14" name="Rectangle 3"/>
                     <wp:cNvGraphicFramePr>
-                      <a:graphicFrameLocks xmlns:a="http://schemas.openxmlformats.org/drawingml/2006/main"/>
+                      <a:graphicFrameLocks/>
                     </wp:cNvGraphicFramePr>
-                    <a:graphic xmlns:a="http://schemas.openxmlformats.org/drawingml/2006/main">
+                    <a:graphic>
                       <a:graphicData uri="http://schemas.microsoft.com/office/word/2010/wordprocessingShape">
                         <wps:wsp>
                           <wps:cNvSpPr>
@@ -589,9 +589,9 @@
                 <wp:effectExtent l="0" t="0" r="0" b="0"/>
                 <wp:docPr id="1" name="Picture 1"/>
                 <wp:cNvGraphicFramePr/>
-                <a:graphic xmlns:a="http://schemas.openxmlformats.org/drawingml/2006/main">
+                <a:graphic>
                   <a:graphicData uri="http://schemas.openxmlformats.org/drawingml/2006/picture">
-                    <pic:pic xmlns:pic="http://schemas.openxmlformats.org/drawingml/2006/picture">
+                    <pic:pic>
                       <pic:nvPicPr>
                         <pic:cNvPr id="3" name="Picture 3"/>
                         <pic:cNvPicPr/>
@@ -600,7 +600,7 @@
                         <a:blip r:embed="rId8" cstate="print">
                           <a:extLst>
                             <a:ext uri="{28A0092B-C50C-407E-A947-70E740481C1C}">
-                              <a14:useLocalDpi xmlns:a14="http://schemas.microsoft.com/office/drawing/2010/main" val="0"/>
+                              <a14:useLocalDpi val="0"/>
                             </a:ext>
                           </a:extLst>
                         </a:blip>
@@ -896,190 +896,82 @@
               <w:rPr>
                 <w:rFonts w:asciiTheme="majorHAnsi" w:hAnsiTheme="majorHAnsi"/>
               </w:rPr>
-              <w:t>1</w:t>
-            </w:r>
-            <w:r>
+              <w:t xml:space="preserve">1.0</w:t>
+            </w:r>
+          </w:p>
+        </w:tc>
+        <w:tc>
+          <w:tcPr>
+            <w:tcW w:w="1648" w:type="dxa"/>
+            <w:tcBorders>
+              <w:top w:val="dotted" w:sz="4" w:space="0" w:color="auto"/>
+              <w:left w:val="dotted" w:sz="4" w:space="0" w:color="auto"/>
+              <w:bottom w:val="dotted" w:sz="4" w:space="0" w:color="auto"/>
+              <w:right w:val="dotted" w:sz="4" w:space="0" w:color="auto"/>
+            </w:tcBorders>
+          </w:tcPr>
+          <w:p>
+            <w:pPr>
+              <w:pStyle w:val="NoSpacing"/>
               <w:rPr>
                 <w:rFonts w:asciiTheme="majorHAnsi" w:hAnsiTheme="majorHAnsi"/>
               </w:rPr>
-              <w:t>.0</w:t>
-            </w:r>
-          </w:p>
-        </w:tc>
-        <w:tc>
-          <w:tcPr>
-            <w:tcW w:w="1648" w:type="dxa"/>
-            <w:tcBorders>
-              <w:top w:val="dotted" w:sz="4" w:space="0" w:color="auto"/>
-              <w:left w:val="dotted" w:sz="4" w:space="0" w:color="auto"/>
-              <w:bottom w:val="dotted" w:sz="4" w:space="0" w:color="auto"/>
-              <w:right w:val="dotted" w:sz="4" w:space="0" w:color="auto"/>
-            </w:tcBorders>
-          </w:tcPr>
-          <w:p>
-            <w:pPr>
-              <w:pStyle w:val="NoSpacing"/>
+            </w:pPr>
+            <w:r>
               <w:rPr>
                 <w:rFonts w:asciiTheme="majorHAnsi" w:hAnsiTheme="majorHAnsi"/>
               </w:rPr>
-            </w:pPr>
-            <w:r>
+              <w:t>30-09-2026</w:t>
+            </w:r>
+          </w:p>
+        </w:tc>
+        <w:tc>
+          <w:tcPr>
+            <w:tcW w:w="2295" w:type="dxa"/>
+            <w:tcBorders>
+              <w:top w:val="dotted" w:sz="4" w:space="0" w:color="auto"/>
+              <w:left w:val="dotted" w:sz="4" w:space="0" w:color="auto"/>
+              <w:bottom w:val="dotted" w:sz="4" w:space="0" w:color="auto"/>
+              <w:right w:val="dotted" w:sz="4" w:space="0" w:color="auto"/>
+            </w:tcBorders>
+          </w:tcPr>
+          <w:p>
+            <w:pPr>
+              <w:pStyle w:val="NoSpacing"/>
               <w:rPr>
                 <w:rFonts w:asciiTheme="majorHAnsi" w:hAnsiTheme="majorHAnsi"/>
               </w:rPr>
-              <w:t>20-08-2026</w:t>
-            </w:r>
-          </w:p>
-        </w:tc>
-        <w:tc>
-          <w:tcPr>
-            <w:tcW w:w="2295" w:type="dxa"/>
-            <w:tcBorders>
-              <w:top w:val="dotted" w:sz="4" w:space="0" w:color="auto"/>
-              <w:left w:val="dotted" w:sz="4" w:space="0" w:color="auto"/>
-              <w:bottom w:val="dotted" w:sz="4" w:space="0" w:color="auto"/>
-              <w:right w:val="dotted" w:sz="4" w:space="0" w:color="auto"/>
-            </w:tcBorders>
-          </w:tcPr>
-          <w:p>
-            <w:pPr>
-              <w:pStyle w:val="NoSpacing"/>
+            </w:pPr>
+            <w:r>
               <w:rPr>
                 <w:rFonts w:asciiTheme="majorHAnsi" w:hAnsiTheme="majorHAnsi"/>
               </w:rPr>
-            </w:pPr>
-            <w:r>
+              <w:t>Utsav Verma</w:t>
+            </w:r>
+          </w:p>
+        </w:tc>
+        <w:tc>
+          <w:tcPr>
+            <w:tcW w:w="3897" w:type="dxa"/>
+            <w:tcBorders>
+              <w:top w:val="dotted" w:sz="4" w:space="0" w:color="auto"/>
+              <w:left w:val="dotted" w:sz="4" w:space="0" w:color="auto"/>
+              <w:bottom w:val="dotted" w:sz="4" w:space="0" w:color="auto"/>
+              <w:right w:val="dotted" w:sz="4" w:space="0" w:color="auto"/>
+            </w:tcBorders>
+          </w:tcPr>
+          <w:p>
+            <w:pPr>
+              <w:pStyle w:val="NoSpacing"/>
               <w:rPr>
                 <w:rFonts w:asciiTheme="majorHAnsi" w:hAnsiTheme="majorHAnsi"/>
               </w:rPr>
-              <w:t>Utsav Verma</w:t>
-            </w:r>
-          </w:p>
-        </w:tc>
-        <w:tc>
-          <w:tcPr>
-            <w:tcW w:w="3897" w:type="dxa"/>
-            <w:tcBorders>
-              <w:top w:val="dotted" w:sz="4" w:space="0" w:color="auto"/>
-              <w:left w:val="dotted" w:sz="4" w:space="0" w:color="auto"/>
-              <w:bottom w:val="dotted" w:sz="4" w:space="0" w:color="auto"/>
-              <w:right w:val="dotted" w:sz="4" w:space="0" w:color="auto"/>
-            </w:tcBorders>
-          </w:tcPr>
-          <w:p>
-            <w:pPr>
-              <w:pStyle w:val="NoSpacing"/>
+            </w:pPr>
+            <w:r>
               <w:rPr>
                 <w:rFonts w:asciiTheme="majorHAnsi" w:hAnsiTheme="majorHAnsi"/>
               </w:rPr>
-            </w:pPr>
-            <w:r>
-              <w:rPr>
-                <w:rFonts w:asciiTheme="majorHAnsi" w:hAnsiTheme="majorHAnsi"/>
-              </w:rPr>
-              <w:t>Initial Draft</w:t>
-            </w:r>
-          </w:p>
-        </w:tc>
-      </w:tr>
-      <w:tr>
-        <w:tc>
-          <w:tcPr>
-            <w:tcW w:w="1176" w:type="dxa"/>
-            <w:tcBorders>
-              <w:top w:val="dotted" w:sz="4" w:space="0" w:color="auto"/>
-              <w:left w:val="dotted" w:sz="4" w:space="0" w:color="auto"/>
-              <w:bottom w:val="dotted" w:sz="4" w:space="0" w:color="auto"/>
-              <w:right w:val="dotted" w:sz="4" w:space="0" w:color="auto"/>
-            </w:tcBorders>
-          </w:tcPr>
-          <w:p>
-            <w:pPr>
-              <w:pStyle w:val="NoSpacing"/>
-              <w:rPr>
-                <w:rFonts w:asciiTheme="majorHAnsi" w:hAnsiTheme="majorHAnsi"/>
-              </w:rPr>
-            </w:pPr>
-            <w:r>
-              <w:rPr>
-                <w:rFonts w:asciiTheme="majorHAnsi" w:hAnsiTheme="majorHAnsi"/>
-              </w:rPr>
-              <w:t>2.0</w:t>
-            </w:r>
-          </w:p>
-        </w:tc>
-        <w:tc>
-          <w:tcPr>
-            <w:tcW w:w="1648" w:type="dxa"/>
-            <w:tcBorders>
-              <w:top w:val="dotted" w:sz="4" w:space="0" w:color="auto"/>
-              <w:left w:val="dotted" w:sz="4" w:space="0" w:color="auto"/>
-              <w:bottom w:val="dotted" w:sz="4" w:space="0" w:color="auto"/>
-              <w:right w:val="dotted" w:sz="4" w:space="0" w:color="auto"/>
-            </w:tcBorders>
-          </w:tcPr>
-          <w:p>
-            <w:pPr>
-              <w:pStyle w:val="NoSpacing"/>
-              <w:rPr>
-                <w:rFonts w:asciiTheme="majorHAnsi" w:hAnsiTheme="majorHAnsi"/>
-              </w:rPr>
-            </w:pPr>
-            <w:r>
-              <w:rPr>
-                <w:rFonts w:asciiTheme="majorHAnsi" w:hAnsiTheme="majorHAnsi"/>
-              </w:rPr>
-              <w:t>20-08-2026</w:t>
-            </w:r>
-          </w:p>
-        </w:tc>
-        <w:tc>
-          <w:tcPr>
-            <w:tcW w:w="2295" w:type="dxa"/>
-            <w:tcBorders>
-              <w:top w:val="dotted" w:sz="4" w:space="0" w:color="auto"/>
-              <w:left w:val="dotted" w:sz="4" w:space="0" w:color="auto"/>
-              <w:bottom w:val="dotted" w:sz="4" w:space="0" w:color="auto"/>
-              <w:right w:val="dotted" w:sz="4" w:space="0" w:color="auto"/>
-            </w:tcBorders>
-          </w:tcPr>
-          <w:p>
-            <w:pPr>
-              <w:pStyle w:val="NoSpacing"/>
-              <w:rPr>
-                <w:rFonts w:asciiTheme="majorHAnsi" w:hAnsiTheme="majorHAnsi"/>
-              </w:rPr>
-            </w:pPr>
-            <w:r>
-              <w:rPr>
-                <w:rFonts w:asciiTheme="majorHAnsi" w:hAnsiTheme="majorHAnsi"/>
-              </w:rPr>
-              <w:t>Utsav Verma</w:t>
-            </w:r>
-          </w:p>
-        </w:tc>
-        <w:tc>
-          <w:tcPr>
-            <w:tcW w:w="3897" w:type="dxa"/>
-            <w:tcBorders>
-              <w:top w:val="dotted" w:sz="4" w:space="0" w:color="auto"/>
-              <w:left w:val="dotted" w:sz="4" w:space="0" w:color="auto"/>
-              <w:bottom w:val="dotted" w:sz="4" w:space="0" w:color="auto"/>
-              <w:right w:val="dotted" w:sz="4" w:space="0" w:color="auto"/>
-            </w:tcBorders>
-          </w:tcPr>
-          <w:p>
-            <w:pPr>
-              <w:pStyle w:val="NoSpacing"/>
-              <w:rPr>
-                <w:rFonts w:asciiTheme="majorHAnsi" w:hAnsiTheme="majorHAnsi"/>
-              </w:rPr>
-            </w:pPr>
-            <w:r>
-              <w:rPr>
-                <w:rFonts w:asciiTheme="majorHAnsi" w:hAnsiTheme="majorHAnsi"/>
-              </w:rPr>
-              <w:t>Version currency review — candidate releases updated to Flask 3.1.3, FastAPI 0.141 and Django 6.1; no score or recommendation changed</w:t>
+              <w:t>Issued for review</w:t>
             </w:r>
           </w:p>
         </w:tc>
@@ -3760,21 +3652,15 @@
         <w:pStyle w:val="Body"/>
       </w:pPr>
       <w:r>
-        <w:t xml:space="preserve">This Decision Analysis and Recommendation (DAR) document records the evaluation behind the choice of backend web framework for the </w:t>
-      </w:r>
-      <w:r>
-        <w:t>Nagarro</w:t>
-      </w:r>
-      <w:r>
-        <w:t xml:space="preserve"> </w:t>
+        <w:t xml:space="preserve">This Decision Analysis and Recommendation (DAR) document records the evaluation behind the choice of backend web framework for the YCompany eClaims platform — the framework in which every eClaims backend microservice is implemented: the Layer 3 services in SAD Section 4 and the Auth Service.</w:t>
       </w:r>
       <w:proofErr w:type="spellStart"/>
       <w:r>
-        <w:t>eClaims</w:t>
+        <w:t xml:space="preserve"/>
       </w:r>
       <w:proofErr w:type="spellEnd"/>
       <w:r>
-        <w:t xml:space="preserve"> platform — the framework in which the Claims, Auth, Policy, Incident Management, Payment, Document, Notification and Reporting services are implemented.</w:t>
+        <w:t xml:space="preserve"/>
       </w:r>
     </w:p>
     <w:p>
@@ -3799,22 +3685,6 @@
       <w:proofErr w:type="spellEnd"/>
       <w:r>
         <w:t xml:space="preserve"> as the backend API technology. That document states the conclusion; this DAR supplies the evidence for it — the candidates considered, the evaluation attributes and their weights, the scoring, and the assumptions and risks that the recommendation carries with it.</w:t>
-      </w:r>
-    </w:p>
-    <w:p>
-      <w:pPr>
-        <w:pStyle w:val="Body"/>
-      </w:pPr>
-      <w:r>
-        <w:t xml:space="preserve">This document supersedes, for </w:t>
-      </w:r>
-      <w:proofErr w:type="spellStart"/>
-      <w:r>
-        <w:t>eClaims</w:t>
-      </w:r>
-      <w:proofErr w:type="spellEnd"/>
-      <w:r>
-        <w:t>, the prior-cycle DAR on backend technologies that was prepared for a different case study. That analysis compared the same three frameworks and recommended Flask. Its candidate set and tool descriptions are reused here; its evaluation attributes, weights and conclusion are not, because they were derived from the requirements of a retail web application rather than those of an API-first claims platform. Section 8.2 records exactly which attributes changed and why.</w:t>
       </w:r>
     </w:p>
     <w:p>
@@ -3866,13 +3736,7 @@
         <w:t>Candidate identification</w:t>
       </w:r>
       <w:r>
-        <w:t xml:space="preserve"> — the Python web frameworks that are credible for a microservices-based claims platform at </w:t>
-      </w:r>
-      <w:r>
-        <w:t>Nagarro</w:t>
-      </w:r>
-      <w:r>
-        <w:t>’s scale.</w:t>
+        <w:t xml:space="preserve"> — the Python web frameworks that are credible for a microservices-based claims platform at YCompany’s scale.</w:t>
       </w:r>
     </w:p>
     <w:p>
@@ -4024,7 +3888,7 @@
       </w:r>
       <w:proofErr w:type="spellEnd"/>
       <w:r>
-        <w:t xml:space="preserve"> is that it is an API-first platform, not a server-rendered web application. Three separate React front ends — the Customer Portal, the Internal Portal and the Partner Portal — plus external partner integration all consume the same backend over HTTP. Nothing in the backend renders HTML. That single fact is what moves interface documentation and payload validation from convenience to requirement, and it is the principal reason this evaluation reaches a different conclusion from the prior-cycle analysis of the same three frameworks.</w:t>
+        <w:t xml:space="preserve"> is that it is an API-first platform, not a server-rendered web application. Three separate React front ends — the Customer Portal, the Internal Portal and the Partner Portal — plus external partner integration all consume the same backend over HTTP. Nothing in the backend renders HTML. That single fact is what moves interface documentation and payload validation from convenience to requirement.</w:t>
       </w:r>
     </w:p>
     <w:p>
@@ -4541,7 +4405,7 @@
               <w:pStyle w:val="NoSpacing"/>
             </w:pPr>
             <w:r>
-              <w:t>0.141</w:t>
+              <w:t xml:space="preserve">0.142</w:t>
             </w:r>
           </w:p>
         </w:tc>
@@ -5149,7 +5013,7 @@
       </w:r>
       <w:proofErr w:type="spellEnd"/>
       <w:r>
-        <w:t xml:space="preserve"> dependency-injection system is the mechanism through which cross-cutting concerns — authentication, role checks, database sessions, request correlation — are declared per endpoint and overridden in tests. The pairing of FastAPI with Uvicorn is mature and widely deployed; after more than thirty minor releases since the prior-cycle analysis was written, the framework is no longer the new entrant it was then.</w:t>
+        <w:t xml:space="preserve"> dependency-injection system is the mechanism through which cross-cutting concerns — authentication, role checks, database sessions, request correlation — are declared per endpoint and overridden in tests. The pairing of FastAPI with Uvicorn is mature and widely deployed, and the framework is well established in production use.</w:t>
       </w:r>
     </w:p>
     <w:p>
@@ -6378,7 +6242,7 @@
               <w:pStyle w:val="NoSpacing"/>
             </w:pPr>
             <w:r>
-              <w:t>Services ship as containers on ECS Fargate; ASGI is now standard</w:t>
+              <w:t xml:space="preserve">Services ship as containers on ECS Fargate; the ASGI or WSGI server runs inside each image</w:t>
             </w:r>
           </w:p>
         </w:tc>
@@ -6645,23 +6509,7 @@
         <w:pStyle w:val="Body"/>
       </w:pPr>
       <w:r>
-        <w:t xml:space="preserve">Four of these attributes did not appear in the prior-cycle matrix prepared for the earlier retail case study: performance under load, automatic API documentation, request validation with type safety, and ecosystem and community maturity. Three of the four </w:t>
-      </w:r>
-      <w:proofErr w:type="spellStart"/>
-      <w:r>
-        <w:t>favour</w:t>
-      </w:r>
-      <w:proofErr w:type="spellEnd"/>
-      <w:r>
-        <w:t xml:space="preserve"> </w:t>
-      </w:r>
-      <w:proofErr w:type="spellStart"/>
-      <w:r>
-        <w:t>FastAPI</w:t>
-      </w:r>
-      <w:proofErr w:type="spellEnd"/>
-      <w:r>
-        <w:t xml:space="preserve"> and the fourth counts against it. Section 8.2 states plainly why each appears now, so that the change in conclusion can be audited rather than taken on trust.</w:t>
+        <w:t xml:space="preserve">The attribute set is deliberately not one-sided: ecosystem and community maturity is included although it counts against FastAPI. Section 8.2 sets out the weighting rationale and a sensitivity check.</w:t>
       </w:r>
     </w:p>
     <w:p>
@@ -6820,13 +6668,7 @@
               <w:rPr>
                 <w:b/>
               </w:rPr>
-              <w:t xml:space="preserve"> (0.141)</w:t>
-            </w:r>
-            <w:r>
-              <w:rPr>
-                <w:b/>
-              </w:rPr>
-              <w:t xml:space="preserve"> </w:t>
+              <w:t xml:space="preserve"> (0.142) </w:t>
             </w:r>
             <w:r>
               <w:rPr>
@@ -8116,39 +7958,7 @@
         <w:pStyle w:val="Body"/>
       </w:pPr>
       <w:r>
-        <w:t xml:space="preserve">One row deserves explicit comment, because it is where this matrix differs most sharply from the prior-cycle one. Deployment is scored 5 for all three options. The earlier analysis </w:t>
-      </w:r>
-      <w:proofErr w:type="spellStart"/>
-      <w:r>
-        <w:t>penalised</w:t>
-      </w:r>
-      <w:proofErr w:type="spellEnd"/>
-      <w:r>
-        <w:t xml:space="preserve"> </w:t>
-      </w:r>
-      <w:proofErr w:type="spellStart"/>
-      <w:r>
-        <w:t>FastAPI</w:t>
-      </w:r>
-      <w:proofErr w:type="spellEnd"/>
-      <w:r>
-        <w:t xml:space="preserve"> on deployment on the grounds that it requires an ASGI-compatible server, while Flask and Django could be deployed to any WSGI host. That penalty no longer corresponds to how </w:t>
-      </w:r>
-      <w:proofErr w:type="spellStart"/>
-      <w:r>
-        <w:t>eClaims</w:t>
-      </w:r>
-      <w:proofErr w:type="spellEnd"/>
-      <w:r>
-        <w:t xml:space="preserve"> ships. Every service is built as a container image and started by </w:t>
-      </w:r>
-      <w:proofErr w:type="spellStart"/>
-      <w:r>
-        <w:t>Uvicorn</w:t>
-      </w:r>
-      <w:proofErr w:type="spellEnd"/>
-      <w:r>
-        <w:t xml:space="preserve"> inside it; the container is the deployment unit, and the WSGI-versus-ASGI distinction costs nothing on a serverless-container platform. Correcting that single row accounts for most of the movement between the two analyses, and it is a correction of fact rather than of judgement.</w:t>
+        <w:t xml:space="preserve">One row deserves explicit comment. Deployment is scored 5 for all three options, although FastAPI requires an ASGI-compatible server while Flask and Django can also be deployed to any WSGI host. That distinction does not affect how eClaims ships: every service is built as a container image and started by its own server inside it — Uvicorn in the case of FastAPI — so the container is the deployment unit, and the WSGI-versus-ASGI distinction costs nothing on a serverless-container platform.</w:t>
       </w:r>
     </w:p>
     <w:p>
@@ -9770,7 +9580,7 @@
       </w:r>
       <w:proofErr w:type="spellEnd"/>
       <w:r>
-        <w:t xml:space="preserve"> (0.141) on </w:t>
+        <w:t xml:space="preserve"> (0.142) on </w:t>
       </w:r>
       <w:proofErr w:type="spellStart"/>
       <w:r>
@@ -9947,7 +9757,7 @@
         <w:pStyle w:val="Body"/>
       </w:pPr>
       <w:r>
-        <w:t xml:space="preserve">Flask at 3.83 is the closest alternative and would be the recommendation if the platform were synchronous and its interface contract informal — which is the situation the prior-cycle analysis was evaluating, and why it reasonably reached a different answer. It is not recommended here because every capability that closes the gap to </w:t>
+        <w:t xml:space="preserve">Flask at 3.83 is the closest alternative and would be the recommendation if the platform were synchronous and its interface contract informal. It is not recommended here because every capability that closes the gap to </w:t>
       </w:r>
       <w:proofErr w:type="spellStart"/>
       <w:r>
@@ -10256,7 +10066,7 @@
         <w:t>Latest stable versions are considered</w:t>
       </w:r>
       <w:r>
-        <w:t xml:space="preserve"> — Flask 3.1.3, FastAPI 0.141 and Django 6.1, with Django 5.2 as the current long-term-support line. Comparisons against earlier releases, particularly of FastAPI, do not hold. The proof of concept runs behind on two of these pins, FastAPI 0.111 and Uvicorn 0.29; that gap is one of currency rather than capability, it changes no score in Section 4.2, and closing it is tracked under risk R3.</w:t>
+        <w:t xml:space="preserve"> — Flask 3.1.3, FastAPI 0.142 and Django 6.1, with Django 5.2 as the current long-term-support line. Comparisons against earlier releases, particularly of FastAPI, do not hold. The proof of concept runs behind on two of these pins, FastAPI 0.111 and Uvicorn 0.29; that gap is one of currency rather than capability, it changes no score in Section 4.2, and closing it is tracked under risk R3.</w:t>
       </w:r>
     </w:p>
     <w:p>
@@ -10315,11 +10125,14 @@
     </w:p>
     <w:p>
       <w:pPr>
-        <w:pStyle w:val="Body"/>
-      </w:pPr>
-      <w:r>
-        <w:lastRenderedPageBreak/>
-        <w:t>One assumption from the prior-cycle analysis is deliberately not carried forward: that development cost is not an issue. For a platform of this size the effort to assemble and maintain capabilities that a framework could supply natively is a real cost, and it is one of the grounds on which this evaluation separates the candidates.</w:t>
+        <w:pStyle w:val="ListParagraph"/>
+        <w:numPr>
+          <w:ilvl w:val="0"/>
+          <w:numId w:val="8"/>
+        </w:numPr>
+      </w:pPr>
+      <w:r>
+        <w:t xml:space="preserve">Development effort is a cost — for a platform of this size, assembling and maintaining capabilities that a framework could supply natively is a real and recurring expense, and it is one of the grounds on which this evaluation separates the candidates.</w:t>
       </w:r>
     </w:p>
     <w:p>
@@ -10653,11 +10466,11 @@
             </w:pPr>
             <w:proofErr w:type="spellStart"/>
             <w:r>
-              <w:t>FastAPI</w:t>
+              <w:t xml:space="preserve">FastAPI remains on a 0.x version line (0.142 at the date of this document) and continues to introduce breaking changes between minor releases, at 0.112, 0.127, 0.129 and 0.132 among others;</w:t>
             </w:r>
             <w:proofErr w:type="spellEnd"/>
             <w:r>
-              <w:t xml:space="preserve"> remains on a 0.x version line after more than thirty minor releases and continues to introduce breaking changes between them, at 0.112, 0.127, 0.129 and 0.132 among others; </w:t>
+              <w:t xml:space="preserve"> </w:t>
             </w:r>
             <w:proofErr w:type="spellStart"/>
             <w:r>
@@ -10789,7 +10602,7 @@
               <w:pStyle w:val="NoSpacing"/>
             </w:pPr>
             <w:r>
-              <w:t>Automated dependency and vulnerability scanning in the CI pipeline with build failure on high-severity findings; a scheduled upgrade cadence rather than upgrade-on-incident; the container base image rebuilt and redeployed on the same cadence. The first item on that cadence is the proof-of-concept stack itself: FastAPI 0.111 to 0.141 and Uvicorn 0.29 to 0.52, validated service by service.</w:t>
+              <w:t xml:space="preserve">Automated dependency and vulnerability scanning in the CI pipeline with build failure on high-severity findings; a scheduled upgrade cadence rather than upgrade-on-incident; the container base image rebuilt and redeployed on the same cadence. The first item on that cadence is the proof-of-concept stack itself: FastAPI 0.111 to 0.142 and Uvicorn 0.29 to 0.54, validated service by service.</w:t>
             </w:r>
           </w:p>
         </w:tc>
@@ -11256,11 +11069,11 @@
       </w:pPr>
       <w:proofErr w:type="spellStart"/>
       <w:r>
-        <w:t>eClaims</w:t>
+        <w:t xml:space="preserve">eClaims Solution Approach Document (SAD) v1.1 — docs/sad/solution-approach-document.md, Section 7 Non-Functional Requirements and Section 8 Technology Stack</w:t>
       </w:r>
       <w:proofErr w:type="spellEnd"/>
       <w:r>
-        <w:t xml:space="preserve"> Solution Approach Document — docs/sad/solution-approach-document.md (v1.0, Final), Section 8 Technology Stack and Section 7 Non-Functional Requirements</w:t>
+        <w:t xml:space="preserve"/>
       </w:r>
     </w:p>
     <w:p>
@@ -11347,7 +11160,7 @@
         </w:numPr>
       </w:pPr>
       <w:r>
-        <w:t>DAR — Compute and Deployment Platform Selection (companion document, ECS Fargate recommendation)</w:t>
+        <w:t xml:space="preserve">DAR — Compute and Deployment Platform Selection — docs/dar/Utsav_eClaims_DAR_Compute.docx (companion document: ECS Fargate recommendation)</w:t>
       </w:r>
     </w:p>
     <w:p>
@@ -11492,6 +11305,32 @@
     </w:p>
     <w:p>
       <w:pPr>
+        <w:pStyle w:val="Heading2"/>
+      </w:pPr>
+      <w:bookmarkStart w:id="24" w:name="_Toc238143542"/>
+      <w:r>
+        <w:t>Scoring Methodology</w:t>
+      </w:r>
+      <w:bookmarkEnd w:id="24"/>
+    </w:p>
+    <w:p>
+      <w:pPr>
+        <w:pStyle w:val="Body"/>
+      </w:pPr>
+      <w:r>
+        <w:t xml:space="preserve">The method was fixed before scoring, in this order, so that the weighting could not be chosen to </w:t>
+      </w:r>
+      <w:proofErr w:type="spellStart"/>
+      <w:r>
+        <w:t>favour</w:t>
+      </w:r>
+      <w:proofErr w:type="spellEnd"/>
+      <w:r>
+        <w:t xml:space="preserve"> a conclusion:</w:t>
+      </w:r>
+    </w:p>
+    <w:p>
+      <w:pPr>
         <w:pStyle w:val="ListParagraph"/>
         <w:numPr>
           <w:ilvl w:val="0"/>
@@ -11499,7 +11338,7 @@
         </w:numPr>
       </w:pPr>
       <w:r>
-        <w:t xml:space="preserve">Prior-cycle DAR — Backend Technologies (different case study; superseded for </w:t>
+        <w:t xml:space="preserve">Evaluation attributes were derived from the </w:t>
       </w:r>
       <w:proofErr w:type="spellStart"/>
       <w:r>
@@ -11507,33 +11346,15 @@
       </w:r>
       <w:proofErr w:type="spellEnd"/>
       <w:r>
-        <w:t xml:space="preserve"> by this document)</w:t>
-      </w:r>
-    </w:p>
-    <w:p>
-      <w:pPr>
-        <w:pStyle w:val="Heading2"/>
-      </w:pPr>
-      <w:bookmarkStart w:id="24" w:name="_Toc238143542"/>
-      <w:r>
-        <w:t>Scoring Methodology</w:t>
-      </w:r>
-      <w:bookmarkEnd w:id="24"/>
-    </w:p>
-    <w:p>
-      <w:pPr>
-        <w:pStyle w:val="Body"/>
-      </w:pPr>
-      <w:r>
-        <w:t xml:space="preserve">The method was fixed before scoring, in this order, so that the weighting could not be chosen to </w:t>
+        <w:t xml:space="preserve"> functional and non-functional requirements </w:t>
       </w:r>
       <w:proofErr w:type="spellStart"/>
       <w:r>
-        <w:t>favour</w:t>
+        <w:t>summarised</w:t>
       </w:r>
       <w:proofErr w:type="spellEnd"/>
       <w:r>
-        <w:t xml:space="preserve"> a conclusion:</w:t>
+        <w:t xml:space="preserve"> in Section 2, and each attribute is traced back to the requirement that justifies it in Section 4.1.</w:t>
       </w:r>
     </w:p>
     <w:p>
@@ -11545,23 +11366,7 @@
         </w:numPr>
       </w:pPr>
       <w:r>
-        <w:t xml:space="preserve">Evaluation attributes were derived from the </w:t>
-      </w:r>
-      <w:proofErr w:type="spellStart"/>
-      <w:r>
-        <w:t>eClaims</w:t>
-      </w:r>
-      <w:proofErr w:type="spellEnd"/>
-      <w:r>
-        <w:t xml:space="preserve"> functional and non-functional requirements </w:t>
-      </w:r>
-      <w:proofErr w:type="spellStart"/>
-      <w:r>
-        <w:t>summarised</w:t>
-      </w:r>
-      <w:proofErr w:type="spellEnd"/>
-      <w:r>
-        <w:t xml:space="preserve"> in Section 2, and each attribute is traced back to the requirement that justifies it in Section 4.1.</w:t>
+        <w:t>Weights were assigned on consequence of failure: 5 where the absence of the attribute would put a stated non-functional requirement at risk, 4 where a stated functional requirement depends on it, and 3 where it affects cost of ownership rather than compliance with a requirement.</w:t>
       </w:r>
     </w:p>
     <w:p>
@@ -11573,7 +11378,15 @@
         </w:numPr>
       </w:pPr>
       <w:r>
-        <w:t>Weights were assigned on consequence of failure: 5 where the absence of the attribute would put a stated non-functional requirement at risk, 4 where a stated functional requirement depends on it, and 3 where it affects cost of ownership rather than compliance with a requirement.</w:t>
+        <w:t xml:space="preserve">Each option was then scored 1 to 5 against every attribute on native capability relative to the </w:t>
+      </w:r>
+      <w:proofErr w:type="spellStart"/>
+      <w:r>
+        <w:t>eClaims</w:t>
+      </w:r>
+      <w:proofErr w:type="spellEnd"/>
+      <w:r>
+        <w:t xml:space="preserve"> requirement — not absolute product quality — with 5 denoting the simplest option where the attribute is complexity.</w:t>
       </w:r>
     </w:p>
     <w:p>
@@ -11585,27 +11398,23 @@
         </w:numPr>
       </w:pPr>
       <w:r>
-        <w:t xml:space="preserve">Each option was then scored 1 to 5 against every attribute on native capability relative to the </w:t>
-      </w:r>
-      <w:proofErr w:type="spellStart"/>
-      <w:r>
-        <w:t>eClaims</w:t>
-      </w:r>
-      <w:proofErr w:type="spellEnd"/>
-      <w:r>
-        <w:t xml:space="preserve"> requirement — not absolute product quality — with 5 denoting the simplest option where the attribute is complexity.</w:t>
+        <w:t>The weighted total is the sum of weight multiplied by score, divided by the sum of the weights, giving a comparable result on the same 1 to 5 scale.</w:t>
       </w:r>
     </w:p>
     <w:p>
       <w:pPr>
-        <w:pStyle w:val="ListParagraph"/>
-        <w:numPr>
-          <w:ilvl w:val="0"/>
-          <w:numId w:val="8"/>
-        </w:numPr>
-      </w:pPr>
-      <w:r>
-        <w:t>The weighted total is the sum of weight multiplied by score, divided by the sum of the weights, giving a comparable result on the same 1 to 5 scale.</w:t>
+        <w:pStyle w:val="Body"/>
+      </w:pPr>
+      <w:r>
+        <w:t xml:space="preserve">Worked example, </w:t>
+      </w:r>
+      <w:proofErr w:type="spellStart"/>
+      <w:r>
+        <w:t>FastAPI</w:t>
+      </w:r>
+      <w:proofErr w:type="spellEnd"/>
+      <w:r>
+        <w:t>: (5×5 + 5×5 + 4×5 + 4×5 + 5×5 + 3×4 + 4×5 + 3×4 + 4×5 + 3×4) ÷ 40 = 191 ÷ 40 = 4.78.</w:t>
       </w:r>
     </w:p>
     <w:p>
@@ -11613,15 +11422,7 @@
         <w:pStyle w:val="Body"/>
       </w:pPr>
       <w:r>
-        <w:t xml:space="preserve">Worked example, </w:t>
-      </w:r>
-      <w:proofErr w:type="spellStart"/>
-      <w:r>
-        <w:t>FastAPI</w:t>
-      </w:r>
-      <w:proofErr w:type="spellEnd"/>
-      <w:r>
-        <w:t>: (5×5 + 5×5 + 4×5 + 4×5 + 5×5 + 3×4 + 4×5 + 3×4 + 4×5 + 3×4) ÷ 40 = 191 ÷ 40 = 4.78.</w:t>
+        <w:t xml:space="preserve">Two exclusions are deliberate. Licence cost is not scored, because all three options are free of licence cost and an attribute on which every candidate is identical cannot inform a decision. Architecture style is recorded descriptively in Section 4.3 rather than scored, because it describes the options rather than ranking them against a requirement.</w:t>
       </w:r>
     </w:p>
     <w:p>
@@ -11629,27 +11430,7 @@
         <w:pStyle w:val="Body"/>
       </w:pPr>
       <w:r>
-        <w:rPr>
-          <w:b/>
-        </w:rPr>
-        <w:t xml:space="preserve">Why </w:t>
-      </w:r>
-      <w:proofErr w:type="gramStart"/>
-      <w:r>
-        <w:rPr>
-          <w:b/>
-        </w:rPr>
-        <w:t>this</w:t>
-      </w:r>
-      <w:proofErr w:type="gramEnd"/>
-      <w:r>
-        <w:rPr>
-          <w:b/>
-        </w:rPr>
-        <w:t xml:space="preserve"> matrix differs from the prior-cycle one, stated plainly.</w:t>
-      </w:r>
-      <w:r>
-        <w:t xml:space="preserve"> A previous DAR compared these same three frameworks for a different case study — a consumer retail website — and recommended Flask. This document reaches a different conclusion, and the weighting is the reason, so the changes are set out here rather than left for a reader to reconstruct.</w:t>
+        <w:t xml:space="preserve">Sensitivity. Automatic API documentation and request validation with type safety carry weight 4 each, and both favour FastAPI. They are included because well-defined data and interface standards and claim payload integrity are stated eClaims requirements for a backend that serves three portals and external partner integration. Were both excluded, FastAPI would still lead on the remaining eight attributes, at 4.72 against 4.28 for Flask, so they widen the margin rather than create the outcome.</w:t>
       </w:r>
     </w:p>
     <w:p>
@@ -11657,75 +11438,7 @@
         <w:pStyle w:val="Body"/>
       </w:pPr>
       <w:r>
-        <w:lastRenderedPageBreak/>
-        <w:t xml:space="preserve">The earlier matrix scored seven attributes: architecture type, flexibility, extensibility, complexity, async support, deployment and scaling. </w:t>
-      </w:r>
-      <w:proofErr w:type="gramStart"/>
-      <w:r>
-        <w:t>This one scores</w:t>
-      </w:r>
-      <w:proofErr w:type="gramEnd"/>
-      <w:r>
-        <w:t xml:space="preserve"> ten. The differences are these. </w:t>
-      </w:r>
-      <w:r>
-        <w:rPr>
-          <w:b/>
-        </w:rPr>
-        <w:t>Four attributes are new</w:t>
-      </w:r>
-      <w:r>
-        <w:t xml:space="preserve"> — performance under load, automatic API documentation, request validation with type </w:t>
-      </w:r>
-      <w:proofErr w:type="gramStart"/>
-      <w:r>
-        <w:t>safety, and</w:t>
-      </w:r>
-      <w:proofErr w:type="gramEnd"/>
-      <w:r>
-        <w:t xml:space="preserve"> ecosystem and community maturity. </w:t>
-      </w:r>
-      <w:r>
-        <w:rPr>
-          <w:b/>
-        </w:rPr>
-        <w:t>One was dropped</w:t>
-      </w:r>
-      <w:r>
-        <w:t xml:space="preserve"> — architecture type, which describes the options rather than ranking them against any requirement, and which is recorded descriptively in Section 4.3 instead. </w:t>
-      </w:r>
-      <w:r>
-        <w:rPr>
-          <w:b/>
-        </w:rPr>
-        <w:t>One was renamed and narrowed</w:t>
-      </w:r>
-      <w:r>
-        <w:t xml:space="preserve"> — flexibility became microservices fit, which is the form in which </w:t>
-      </w:r>
-      <w:proofErr w:type="spellStart"/>
-      <w:r>
-        <w:t>eClaims</w:t>
-      </w:r>
-      <w:proofErr w:type="spellEnd"/>
-      <w:r>
-        <w:t xml:space="preserve"> </w:t>
-      </w:r>
-      <w:proofErr w:type="gramStart"/>
-      <w:r>
-        <w:t>actually needs</w:t>
-      </w:r>
-      <w:proofErr w:type="gramEnd"/>
-      <w:r>
-        <w:t xml:space="preserve"> it. Pricing is scored in neither matrix, because all three options are free of </w:t>
-      </w:r>
-      <w:proofErr w:type="spellStart"/>
-      <w:r>
-        <w:t>licence</w:t>
-      </w:r>
-      <w:proofErr w:type="spellEnd"/>
-      <w:r>
-        <w:t xml:space="preserve"> cost and an attribute on which every candidate is identical cannot inform a decision.</w:t>
+        <w:t xml:space="preserve">Two further attributes cut in opposite directions. Performance under load (weight 5) favours FastAPI and is scored separately from asynchronous support deliberately: one measures the mechanism and the other the outcome, and a 200-million-customer platform under a latency ceiling depends on the outcome. Ecosystem and community maturity (weight 3) counts against FastAPI, which scores 4 there while Flask and Django both score 5; it is included for exactly that reason, because an attribute set that favoured the preferred option uniformly would be evidence of a matrix built backwards from its conclusion.</w:t>
       </w:r>
     </w:p>
     <w:p>
@@ -11733,47 +11446,47 @@
         <w:pStyle w:val="Body"/>
       </w:pPr>
       <w:r>
-        <w:t xml:space="preserve">The two additions that matter are automatic API documentation and request validation with type safety, carrying weight 4 each, and both </w:t>
+        <w:t xml:space="preserve">The matrix is not constructed to produce this answer, and its shape shows that. </w:t>
       </w:r>
       <w:proofErr w:type="spellStart"/>
       <w:r>
-        <w:t>favour</w:t>
+        <w:t>FastAPI</w:t>
       </w:r>
       <w:proofErr w:type="spellEnd"/>
       <w:r>
-        <w:t xml:space="preserve"> </w:t>
+        <w:t xml:space="preserve"> loses outright on extensibility and on ecosystem maturity, and merely ties on microservices fit, </w:t>
       </w:r>
       <w:proofErr w:type="spellStart"/>
       <w:r>
+        <w:t>containerised</w:t>
+      </w:r>
+      <w:proofErr w:type="spellEnd"/>
+      <w:r>
+        <w:t xml:space="preserve"> deployment, scaling and complexity — four of the ten attributes, carrying 16 of the 40 </w:t>
+      </w:r>
+      <w:proofErr w:type="gramStart"/>
+      <w:r>
+        <w:t>weight</w:t>
+      </w:r>
+      <w:proofErr w:type="gramEnd"/>
+      <w:r>
+        <w:t xml:space="preserve">, where it wins nothing. Its lead comes from four attributes where a stated </w:t>
+      </w:r>
+      <w:proofErr w:type="spellStart"/>
+      <w:r>
+        <w:t>eClaims</w:t>
+      </w:r>
+      <w:proofErr w:type="spellEnd"/>
+      <w:r>
+        <w:t xml:space="preserve"> requirement points at a capability </w:t>
+      </w:r>
+      <w:proofErr w:type="spellStart"/>
+      <w:r>
         <w:t>FastAPI</w:t>
       </w:r>
       <w:proofErr w:type="spellEnd"/>
       <w:r>
-        <w:t xml:space="preserve">. They are new because the requirement is new. The earlier case study was a retail website whose backend rendered its own pages and had no published interface contract; neither generated documentation nor boundary validation mattered much there, and their absence from that matrix was reasonable. </w:t>
-      </w:r>
-      <w:proofErr w:type="spellStart"/>
-      <w:r>
-        <w:t>eClaims</w:t>
-      </w:r>
-      <w:proofErr w:type="spellEnd"/>
-      <w:r>
-        <w:t xml:space="preserve"> is an API-first platform whose backend serves three separate React portals plus external partner integration, where well-defined data and interface standards are a stated functional requirement and claim payload integrity underpins non-repudiation. An attribute that measures a stated requirement belongs in the matrix. Had both been excluded, </w:t>
-      </w:r>
-      <w:proofErr w:type="spellStart"/>
-      <w:r>
-        <w:t>FastAPI</w:t>
-      </w:r>
-      <w:proofErr w:type="spellEnd"/>
-      <w:r>
-        <w:t xml:space="preserve"> would still have led on the remaining eight, at 4.72 against 4.28 for Flask, so they </w:t>
-      </w:r>
-      <w:proofErr w:type="gramStart"/>
-      <w:r>
-        <w:t>widen</w:t>
-      </w:r>
-      <w:proofErr w:type="gramEnd"/>
-      <w:r>
-        <w:t xml:space="preserve"> the margin rather than create the outcome.</w:t>
+        <w:t xml:space="preserve"> has natively and the others do not.</w:t>
       </w:r>
     </w:p>
     <w:p>
@@ -11781,71 +11494,16 @@
         <w:pStyle w:val="Body"/>
       </w:pPr>
       <w:r>
-        <w:t xml:space="preserve">One score changed on a matter of fact rather than </w:t>
-      </w:r>
-      <w:proofErr w:type="gramStart"/>
-      <w:r>
-        <w:t>of weighting</w:t>
-      </w:r>
-      <w:proofErr w:type="gramEnd"/>
-      <w:r>
-        <w:t xml:space="preserve">. The earlier matrix scored </w:t>
+        <w:lastRenderedPageBreak/>
+        <w:t xml:space="preserve">Two limitations should be read alongside the result. A weighted average compresses capability differences, which is why Section 4.3 records native support separately — a 3 for a capability that is absent but buildable is not the same thing as a 3 for one that is present but awkward. And the scores are informed engineering judgement against documented product capability and the working proof of concept, not measurements from a controlled benchmark of all three options under </w:t>
       </w:r>
       <w:proofErr w:type="spellStart"/>
       <w:r>
-        <w:t>FastAPI</w:t>
+        <w:t>eClaims</w:t>
       </w:r>
       <w:proofErr w:type="spellEnd"/>
       <w:r>
-        <w:t xml:space="preserve"> 3 against Flask 5 on deployment, on the stated grounds that </w:t>
-      </w:r>
-      <w:proofErr w:type="spellStart"/>
-      <w:r>
-        <w:t>FastAPI</w:t>
-      </w:r>
-      <w:proofErr w:type="spellEnd"/>
-      <w:r>
-        <w:t xml:space="preserve"> requires an ASGI-compatible server. With weight 5, that single row supplied most of the 10-point gap by which Flask led. It does not apply to </w:t>
-      </w:r>
-      <w:proofErr w:type="spellStart"/>
-      <w:r>
-        <w:t>eClaims</w:t>
-      </w:r>
-      <w:proofErr w:type="spellEnd"/>
-      <w:r>
-        <w:t xml:space="preserve">: every service is a container image that starts </w:t>
-      </w:r>
-      <w:proofErr w:type="spellStart"/>
-      <w:r>
-        <w:t>Uvicorn</w:t>
-      </w:r>
-      <w:proofErr w:type="spellEnd"/>
-      <w:r>
-        <w:t xml:space="preserve"> internally, so all three frameworks deploy </w:t>
-      </w:r>
-      <w:proofErr w:type="gramStart"/>
-      <w:r>
-        <w:t>identically</w:t>
-      </w:r>
-      <w:proofErr w:type="gramEnd"/>
-      <w:r>
-        <w:t xml:space="preserve"> and the row is scored 5 across the board. Correcting a factual premise that </w:t>
-      </w:r>
-      <w:proofErr w:type="gramStart"/>
-      <w:r>
-        <w:t>no</w:t>
-      </w:r>
-      <w:proofErr w:type="gramEnd"/>
-      <w:r>
-        <w:t xml:space="preserve"> longer </w:t>
-      </w:r>
-      <w:proofErr w:type="gramStart"/>
-      <w:r>
-        <w:t>holds</w:t>
-      </w:r>
-      <w:proofErr w:type="gramEnd"/>
-      <w:r>
-        <w:t xml:space="preserve"> is a legitimate change; it would not be legitimate to leave it in place.</w:t>
+        <w:t xml:space="preserve"> load.</w:t>
       </w:r>
     </w:p>
     <w:p>
@@ -11853,121 +11511,7 @@
         <w:pStyle w:val="Body"/>
       </w:pPr>
       <w:r>
-        <w:t xml:space="preserve">The other two additions are worth naming because they cut both ways. Performance under load, at weight 5, </w:t>
-      </w:r>
-      <w:proofErr w:type="spellStart"/>
-      <w:r>
-        <w:t>favours</w:t>
-      </w:r>
-      <w:proofErr w:type="spellEnd"/>
-      <w:r>
-        <w:t xml:space="preserve"> </w:t>
-      </w:r>
-      <w:proofErr w:type="spellStart"/>
-      <w:r>
-        <w:t>FastAPI</w:t>
-      </w:r>
-      <w:proofErr w:type="spellEnd"/>
-      <w:r>
-        <w:t xml:space="preserve"> and is separated from asynchronous support deliberately: the earlier matrix scored the mechanism but not the outcome, and a 200-million-customer platform under a latency ceiling cares about the outcome. Ecosystem and community maturity, at weight 3, counts </w:t>
-      </w:r>
-      <w:r>
-        <w:rPr>
-          <w:b/>
-        </w:rPr>
-        <w:t>against</w:t>
-      </w:r>
-      <w:r>
-        <w:t xml:space="preserve"> </w:t>
-      </w:r>
-      <w:proofErr w:type="spellStart"/>
-      <w:r>
-        <w:t>FastAPI</w:t>
-      </w:r>
-      <w:proofErr w:type="spellEnd"/>
-      <w:r>
-        <w:t xml:space="preserve">, which scores 4 there while Flask and Django both score 5. It is included for exactly that reason: an added attribute set that </w:t>
-      </w:r>
-      <w:proofErr w:type="spellStart"/>
-      <w:r>
-        <w:t>favoured</w:t>
-      </w:r>
-      <w:proofErr w:type="spellEnd"/>
-      <w:r>
-        <w:t xml:space="preserve"> the preferred option uniformly would be evidence of a matrix built backwards from its conclusion.</w:t>
-      </w:r>
-    </w:p>
-    <w:p>
-      <w:pPr>
-        <w:pStyle w:val="Body"/>
-      </w:pPr>
-      <w:r>
-        <w:t xml:space="preserve">The matrix is not constructed to produce this answer, and its shape shows that. </w:t>
-      </w:r>
-      <w:proofErr w:type="spellStart"/>
-      <w:r>
-        <w:t>FastAPI</w:t>
-      </w:r>
-      <w:proofErr w:type="spellEnd"/>
-      <w:r>
-        <w:t xml:space="preserve"> loses outright on extensibility and on ecosystem maturity, and merely ties on microservices fit, </w:t>
-      </w:r>
-      <w:proofErr w:type="spellStart"/>
-      <w:r>
-        <w:t>containerised</w:t>
-      </w:r>
-      <w:proofErr w:type="spellEnd"/>
-      <w:r>
-        <w:t xml:space="preserve"> deployment, scaling and complexity — four of the ten attributes, carrying 16 of the 40 </w:t>
-      </w:r>
-      <w:proofErr w:type="gramStart"/>
-      <w:r>
-        <w:t>weight</w:t>
-      </w:r>
-      <w:proofErr w:type="gramEnd"/>
-      <w:r>
-        <w:t xml:space="preserve">, where it wins nothing. Its lead comes from four attributes where a stated </w:t>
-      </w:r>
-      <w:proofErr w:type="spellStart"/>
-      <w:r>
-        <w:t>eClaims</w:t>
-      </w:r>
-      <w:proofErr w:type="spellEnd"/>
-      <w:r>
-        <w:t xml:space="preserve"> requirement points at a capability </w:t>
-      </w:r>
-      <w:proofErr w:type="spellStart"/>
-      <w:r>
-        <w:t>FastAPI</w:t>
-      </w:r>
-      <w:proofErr w:type="spellEnd"/>
-      <w:r>
-        <w:t xml:space="preserve"> has natively and the others do not.</w:t>
-      </w:r>
-    </w:p>
-    <w:p>
-      <w:pPr>
-        <w:pStyle w:val="Body"/>
-      </w:pPr>
-      <w:r>
-        <w:lastRenderedPageBreak/>
-        <w:t xml:space="preserve">Two limitations should be read alongside the result. A weighted average compresses capability differences, which is why Section 4.3 records native support separately — a 3 for a capability that is absent but buildable is not the same thing as a 3 for one that is present but awkward. And the scores are informed engineering judgement against documented product capability and the working proof of concept, not measurements from a controlled benchmark of all three options under </w:t>
-      </w:r>
-      <w:proofErr w:type="spellStart"/>
-      <w:r>
-        <w:t>eClaims</w:t>
-      </w:r>
-      <w:proofErr w:type="spellEnd"/>
-      <w:r>
-        <w:t xml:space="preserve"> load.</w:t>
-      </w:r>
-    </w:p>
-    <w:p>
-      <w:pPr>
-        <w:pStyle w:val="Body"/>
-      </w:pPr>
-      <w:r>
-        <w:t>One further note on currency, because the candidate versions in this document were re-checked after the scoring was complete. The releases current at the date of this document — Flask 3.1.3, FastAPI 0.141 and Django 6.1 — were read against every attribute in Section 4.1, and no score cell moved. Django 6.0 and 6.1 added content-security-policy support, a background-tasks framework, template partials and asynchronous pagination, but neither release brought an asynchronous ORM or native OpenAPI generation, so the two rows where Django trails furthest are unchanged after two years of releases. FastAPI’s additions over the same period — parameter models for query, header and cookie parameters, and native server-sent-event and JSONL streaming — reinforce attributes where it already scored 5 rather than adding new ones. One change a reviewer could reasonably argue for is raising FastAPI’s ecosystem and community maturity from 4, two years further into the life of the framework. It is deliberately not made: a version refresh is not a legitimate occasion to re-tune a matrix in favour of the winner, and the score stands as it was set.</w:t>
+        <w:t xml:space="preserve">Version currency. The candidates are assessed at the latest stable releases at the date of this document — Flask 3.1.3, FastAPI 0.142 and Django 6.1 — against every attribute in Section 4.1. Django 6.0 and 6.1 added content-security-policy support, a background-tasks framework, template partials and asynchronous pagination, but neither brought an asynchronous ORM or native OpenAPI generation, so Django’s scores on asynchronous support and API documentation are unaffected. FastAPI’s recent additions — parameter models for query, header and cookie parameters, and native server-sent-event and JSONL streaming — reinforce attributes where it already scores 5 rather than adding new ones. FastAPI’s ecosystem and community maturity score is deliberately held at 4, so that no score moves in favour of the recommended option without new evidence.</w:t>
       </w:r>
     </w:p>
     <w:sectPr>
@@ -12467,7 +12011,7 @@
 </file>
 
 <file path=word/header2.xml><?xml version="1.0" encoding="utf-8"?>
-<w:hdr xmlns:wpc="http://schemas.microsoft.com/office/word/2010/wordprocessingCanvas" xmlns:cx="http://schemas.microsoft.com/office/drawing/2014/chartex" xmlns:cx1="http://schemas.microsoft.com/office/drawing/2015/9/8/chartex" xmlns:cx2="http://schemas.microsoft.com/office/drawing/2015/10/21/chartex" xmlns:cx3="http://schemas.microsoft.com/office/drawing/2016/5/9/chartex" xmlns:cx4="http://schemas.microsoft.com/office/drawing/2016/5/10/chartex" xmlns:cx5="http://schemas.microsoft.com/office/drawing/2016/5/11/chartex" xmlns:cx6="http://schemas.microsoft.com/office/drawing/2016/5/12/chartex" xmlns:cx7="http://schemas.microsoft.com/office/drawing/2016/5/13/chartex" xmlns:cx8="http://schemas.microsoft.com/office/drawing/2016/5/14/chartex" xmlns:mc="http://schemas.openxmlformats.org/markup-compatibility/2006" xmlns:aink="http://schemas.microsoft.com/office/drawing/2016/ink" xmlns:am3d="http://schemas.microsoft.com/office/drawing/2017/model3d" xmlns:o="urn:schemas-microsoft-com:office:office" xmlns:oel="http://schemas.microsoft.com/office/2019/extlst" xmlns:r="http://schemas.openxmlformats.org/officeDocument/2006/relationships" xmlns:m="http://schemas.openxmlformats.org/officeDocument/2006/math" xmlns:v="urn:schemas-microsoft-com:vml" xmlns:wp14="http://schemas.microsoft.com/office/word/2010/wordprocessingDrawing" xmlns:wp="http://schemas.openxmlformats.org/drawingml/2006/wordprocessingDrawing" xmlns:w10="urn:schemas-microsoft-com:office:word" xmlns:w="http://schemas.openxmlformats.org/wordprocessingml/2006/main" xmlns:w14="http://schemas.microsoft.com/office/word/2010/wordml" xmlns:w15="http://schemas.microsoft.com/office/word/2012/wordml" xmlns:w16cei="http://schemas.microsoft.com/office/word/2026/wordml/cei" xmlns:w16cex="http://schemas.microsoft.com/office/word/2018/wordml/cex" xmlns:w16cid="http://schemas.microsoft.com/office/word/2016/wordml/cid" xmlns:w16="http://schemas.microsoft.com/office/word/2018/wordml" xmlns:w16du="http://schemas.microsoft.com/office/word/2023/wordml/word16du" xmlns:w16sdtdh="http://schemas.microsoft.com/office/word/2020/wordml/sdtdatahash" xmlns:w16sdtfl="http://schemas.microsoft.com/office/word/2024/wordml/sdtformatlock" xmlns:w16se="http://schemas.microsoft.com/office/word/2015/wordml/symex" xmlns:wpg="http://schemas.microsoft.com/office/word/2010/wordprocessingGroup" xmlns:wpi="http://schemas.microsoft.com/office/word/2010/wordprocessingInk" xmlns:wne="http://schemas.microsoft.com/office/word/2006/wordml" xmlns:wps="http://schemas.microsoft.com/office/word/2010/wordprocessingShape" mc:Ignorable="w14 w15 w16se w16cid w16 w16cex w16sdtdh w16sdtfl w16du wp14">
+<w:hdr xmlns:wpc="http://schemas.microsoft.com/office/word/2010/wordprocessingCanvas" xmlns:cx="http://schemas.microsoft.com/office/drawing/2014/chartex" xmlns:cx1="http://schemas.microsoft.com/office/drawing/2015/9/8/chartex" xmlns:cx2="http://schemas.microsoft.com/office/drawing/2015/10/21/chartex" xmlns:cx3="http://schemas.microsoft.com/office/drawing/2016/5/9/chartex" xmlns:cx4="http://schemas.microsoft.com/office/drawing/2016/5/10/chartex" xmlns:cx5="http://schemas.microsoft.com/office/drawing/2016/5/11/chartex" xmlns:cx6="http://schemas.microsoft.com/office/drawing/2016/5/12/chartex" xmlns:cx7="http://schemas.microsoft.com/office/drawing/2016/5/13/chartex" xmlns:cx8="http://schemas.microsoft.com/office/drawing/2016/5/14/chartex" xmlns:mc="http://schemas.openxmlformats.org/markup-compatibility/2006" xmlns:aink="http://schemas.microsoft.com/office/drawing/2016/ink" xmlns:am3d="http://schemas.microsoft.com/office/drawing/2017/model3d" xmlns:o="urn:schemas-microsoft-com:office:office" xmlns:oel="http://schemas.microsoft.com/office/2019/extlst" xmlns:r="http://schemas.openxmlformats.org/officeDocument/2006/relationships" xmlns:m="http://schemas.openxmlformats.org/officeDocument/2006/math" xmlns:v="urn:schemas-microsoft-com:vml" xmlns:wp14="http://schemas.microsoft.com/office/word/2010/wordprocessingDrawing" xmlns:wp="http://schemas.openxmlformats.org/drawingml/2006/wordprocessingDrawing" xmlns:w10="urn:schemas-microsoft-com:office:word" xmlns:w="http://schemas.openxmlformats.org/wordprocessingml/2006/main" xmlns:w14="http://schemas.microsoft.com/office/word/2010/wordml" xmlns:w15="http://schemas.microsoft.com/office/word/2012/wordml" xmlns:w16cei="http://schemas.microsoft.com/office/word/2026/wordml/cei" xmlns:w16cex="http://schemas.microsoft.com/office/word/2018/wordml/cex" xmlns:w16cid="http://schemas.microsoft.com/office/word/2016/wordml/cid" xmlns:w16="http://schemas.microsoft.com/office/word/2018/wordml" xmlns:w16du="http://schemas.microsoft.com/office/word/2023/wordml/word16du" xmlns:w16sdtdh="http://schemas.microsoft.com/office/word/2020/wordml/sdtdatahash" xmlns:w16sdtfl="http://schemas.microsoft.com/office/word/2024/wordml/sdtformatlock" xmlns:w16se="http://schemas.microsoft.com/office/word/2015/wordml/symex" xmlns:wpg="http://schemas.microsoft.com/office/word/2010/wordprocessingGroup" xmlns:wpi="http://schemas.microsoft.com/office/word/2010/wordprocessingInk" xmlns:wne="http://schemas.microsoft.com/office/word/2006/wordml" xmlns:wps="http://schemas.microsoft.com/office/word/2010/wordprocessingShape" xmlns:a="http://schemas.openxmlformats.org/drawingml/2006/main" xmlns:a14="http://schemas.microsoft.com/office/drawing/2010/main" mc:Ignorable="w14 w15 w16se w16cid w16 w16cex w16sdtdh w16sdtfl w16du wp14">
   <w:p>
     <w:pPr>
       <w:pStyle w:val="Header"/>
@@ -12500,14 +12044,14 @@
           <w:rPr>
             <w:rFonts w:asciiTheme="majorHAnsi" w:hAnsiTheme="majorHAnsi"/>
           </w:rPr>
-          <w:t xml:space="preserve">Nagarro – </w:t>
+          <w:t xml:space="preserve">YCompany – eClaims</w:t>
         </w:r>
         <w:proofErr w:type="spellStart"/>
         <w:r>
           <w:rPr>
             <w:rFonts w:asciiTheme="majorHAnsi" w:hAnsiTheme="majorHAnsi"/>
           </w:rPr>
-          <w:t>eClaims</w:t>
+          <w:t/>
         </w:r>
         <w:proofErr w:type="spellEnd"/>
       </w:sdtContent>
@@ -12564,9 +12108,9 @@
               <wp:wrapNone/>
               <wp:docPr id="11" name="Group 3"/>
               <wp:cNvGraphicFramePr>
-                <a:graphicFrameLocks xmlns:a="http://schemas.openxmlformats.org/drawingml/2006/main"/>
+                <a:graphicFrameLocks/>
               </wp:cNvGraphicFramePr>
-              <a:graphic xmlns:a="http://schemas.openxmlformats.org/drawingml/2006/main">
+              <a:graphic>
                 <a:graphicData uri="http://schemas.microsoft.com/office/word/2010/wordprocessingGroup">
                   <wpg:wgp>
                     <wpg:cNvGrpSpPr>
@@ -12607,7 +12151,7 @@
                         </a:ln>
                         <a:extLst>
                           <a:ext uri="{909E8E84-426E-40DD-AFC4-6F175D3DCCD1}">
-                            <a14:hiddenFill xmlns:a14="http://schemas.microsoft.com/office/drawing/2010/main">
+                            <a14:hiddenFill>
                               <a:noFill/>
                             </a14:hiddenFill>
                           </a:ext>
@@ -12634,14 +12178,14 @@
                         </a:ln>
                         <a:extLst>
                           <a:ext uri="{909E8E84-426E-40DD-AFC4-6F175D3DCCD1}">
-                            <a14:hiddenFill xmlns:a14="http://schemas.microsoft.com/office/drawing/2010/main">
+                            <a14:hiddenFill>
                               <a:solidFill>
                                 <a:srgbClr val="FFFFFF"/>
                               </a:solidFill>
                             </a14:hiddenFill>
                           </a:ext>
                           <a:ext uri="{91240B29-F687-4F45-9708-019B960494DF}">
-                            <a14:hiddenLine xmlns:a14="http://schemas.microsoft.com/office/drawing/2010/main" w="9525">
+                            <a14:hiddenLine w="9525">
                               <a:solidFill>
                                 <a:srgbClr val="000000"/>
                               </a:solidFill>
@@ -12704,9 +12248,9 @@
               <wp:wrapNone/>
               <wp:docPr id="10" name="Rectangle 2"/>
               <wp:cNvGraphicFramePr>
-                <a:graphicFrameLocks xmlns:a="http://schemas.openxmlformats.org/drawingml/2006/main"/>
+                <a:graphicFrameLocks/>
               </wp:cNvGraphicFramePr>
-              <a:graphic xmlns:a="http://schemas.openxmlformats.org/drawingml/2006/main">
+              <a:graphic>
                 <a:graphicData uri="http://schemas.microsoft.com/office/word/2010/wordprocessingShape">
                   <wps:wsp>
                     <wps:cNvSpPr>
@@ -12783,9 +12327,9 @@
               <wp:wrapNone/>
               <wp:docPr id="9" name="Rectangle 1"/>
               <wp:cNvGraphicFramePr>
-                <a:graphicFrameLocks xmlns:a="http://schemas.openxmlformats.org/drawingml/2006/main"/>
+                <a:graphicFrameLocks/>
               </wp:cNvGraphicFramePr>
-              <a:graphic xmlns:a="http://schemas.openxmlformats.org/drawingml/2006/main">
+              <a:graphic>
                 <a:graphicData uri="http://schemas.microsoft.com/office/word/2010/wordprocessingShape">
                   <wps:wsp>
                     <wps:cNvSpPr>

</xml_diff>

<commit_message>
DAR amd Estimations Reviewed
</commit_message>
<xml_diff>
--- a/docs/dar/Utsav_eClaims_DAR_Backend.docx
+++ b/docs/dar/Utsav_eClaims_DAR_Backend.docx
@@ -1,6 +1,6 @@
 
 <file path=word/document.xml><?xml version="1.0" encoding="utf-8"?>
-<w:document xmlns:wpc="http://schemas.microsoft.com/office/word/2010/wordprocessingCanvas" xmlns:cx="http://schemas.microsoft.com/office/drawing/2014/chartex" xmlns:cx1="http://schemas.microsoft.com/office/drawing/2015/9/8/chartex" xmlns:cx2="http://schemas.microsoft.com/office/drawing/2015/10/21/chartex" xmlns:cx3="http://schemas.microsoft.com/office/drawing/2016/5/9/chartex" xmlns:cx4="http://schemas.microsoft.com/office/drawing/2016/5/10/chartex" xmlns:cx5="http://schemas.microsoft.com/office/drawing/2016/5/11/chartex" xmlns:cx6="http://schemas.microsoft.com/office/drawing/2016/5/12/chartex" xmlns:cx7="http://schemas.microsoft.com/office/drawing/2016/5/13/chartex" xmlns:cx8="http://schemas.microsoft.com/office/drawing/2016/5/14/chartex" xmlns:mc="http://schemas.openxmlformats.org/markup-compatibility/2006" xmlns:aink="http://schemas.microsoft.com/office/drawing/2016/ink" xmlns:am3d="http://schemas.microsoft.com/office/drawing/2017/model3d" xmlns:o="urn:schemas-microsoft-com:office:office" xmlns:oel="http://schemas.microsoft.com/office/2019/extlst" xmlns:r="http://schemas.openxmlformats.org/officeDocument/2006/relationships" xmlns:m="http://schemas.openxmlformats.org/officeDocument/2006/math" xmlns:v="urn:schemas-microsoft-com:vml" xmlns:wp14="http://schemas.microsoft.com/office/word/2010/wordprocessingDrawing" xmlns:wp="http://schemas.openxmlformats.org/drawingml/2006/wordprocessingDrawing" xmlns:w10="urn:schemas-microsoft-com:office:word" xmlns:w="http://schemas.openxmlformats.org/wordprocessingml/2006/main" xmlns:w14="http://schemas.microsoft.com/office/word/2010/wordml" xmlns:w15="http://schemas.microsoft.com/office/word/2012/wordml" xmlns:w16cei="http://schemas.microsoft.com/office/word/2026/wordml/cei" xmlns:w16cex="http://schemas.microsoft.com/office/word/2018/wordml/cex" xmlns:w16cid="http://schemas.microsoft.com/office/word/2016/wordml/cid" xmlns:w16="http://schemas.microsoft.com/office/word/2018/wordml" xmlns:w16du="http://schemas.microsoft.com/office/word/2023/wordml/word16du" xmlns:w16sdtdh="http://schemas.microsoft.com/office/word/2020/wordml/sdtdatahash" xmlns:w16sdtfl="http://schemas.microsoft.com/office/word/2024/wordml/sdtformatlock" xmlns:w16se="http://schemas.microsoft.com/office/word/2015/wordml/symex" xmlns:wpg="http://schemas.microsoft.com/office/word/2010/wordprocessingGroup" xmlns:wpi="http://schemas.microsoft.com/office/word/2010/wordprocessingInk" xmlns:wne="http://schemas.microsoft.com/office/word/2006/wordml" xmlns:wps="http://schemas.microsoft.com/office/word/2010/wordprocessingShape" xmlns:a="http://schemas.openxmlformats.org/drawingml/2006/main" xmlns:a14="http://schemas.microsoft.com/office/drawing/2010/main" xmlns:pic="http://schemas.openxmlformats.org/drawingml/2006/picture" mc:Ignorable="w14 w15 w16se w16cid w16 w16cex w16sdtdh w16sdtfl w16du wp14">
+<w:document xmlns:wpc="http://schemas.microsoft.com/office/word/2010/wordprocessingCanvas" xmlns:cx="http://schemas.microsoft.com/office/drawing/2014/chartex" xmlns:cx1="http://schemas.microsoft.com/office/drawing/2015/9/8/chartex" xmlns:cx2="http://schemas.microsoft.com/office/drawing/2015/10/21/chartex" xmlns:cx3="http://schemas.microsoft.com/office/drawing/2016/5/9/chartex" xmlns:cx4="http://schemas.microsoft.com/office/drawing/2016/5/10/chartex" xmlns:cx5="http://schemas.microsoft.com/office/drawing/2016/5/11/chartex" xmlns:cx6="http://schemas.microsoft.com/office/drawing/2016/5/12/chartex" xmlns:cx7="http://schemas.microsoft.com/office/drawing/2016/5/13/chartex" xmlns:cx8="http://schemas.microsoft.com/office/drawing/2016/5/14/chartex" xmlns:mc="http://schemas.openxmlformats.org/markup-compatibility/2006" xmlns:aink="http://schemas.microsoft.com/office/drawing/2016/ink" xmlns:am3d="http://schemas.microsoft.com/office/drawing/2017/model3d" xmlns:o="urn:schemas-microsoft-com:office:office" xmlns:oel="http://schemas.microsoft.com/office/2019/extlst" xmlns:r="http://schemas.openxmlformats.org/officeDocument/2006/relationships" xmlns:m="http://schemas.openxmlformats.org/officeDocument/2006/math" xmlns:v="urn:schemas-microsoft-com:vml" xmlns:wp14="http://schemas.microsoft.com/office/word/2010/wordprocessingDrawing" xmlns:wp="http://schemas.openxmlformats.org/drawingml/2006/wordprocessingDrawing" xmlns:w10="urn:schemas-microsoft-com:office:word" xmlns:w="http://schemas.openxmlformats.org/wordprocessingml/2006/main" xmlns:w14="http://schemas.microsoft.com/office/word/2010/wordml" xmlns:w15="http://schemas.microsoft.com/office/word/2012/wordml" xmlns:w16cex="http://schemas.microsoft.com/office/word/2018/wordml/cex" xmlns:w16cid="http://schemas.microsoft.com/office/word/2016/wordml/cid" xmlns:w16="http://schemas.microsoft.com/office/word/2018/wordml" xmlns:w16du="http://schemas.microsoft.com/office/word/2023/wordml/word16du" xmlns:w16sdtdh="http://schemas.microsoft.com/office/word/2020/wordml/sdtdatahash" xmlns:w16sdtfl="http://schemas.microsoft.com/office/word/2024/wordml/sdtformatlock" xmlns:w16se="http://schemas.microsoft.com/office/word/2015/wordml/symex" xmlns:wpg="http://schemas.microsoft.com/office/word/2010/wordprocessingGroup" xmlns:wpi="http://schemas.microsoft.com/office/word/2010/wordprocessingInk" xmlns:wne="http://schemas.microsoft.com/office/word/2006/wordml" xmlns:wps="http://schemas.microsoft.com/office/word/2010/wordprocessingShape" mc:Ignorable="w14 w15 w16se w16cid w16 w16cex w16sdtdh w16sdtfl w16du wp14">
   <w:body>
     <w:sdt>
       <w:sdtPr>
@@ -35,6 +35,7 @@
               <w:dataBinding w:prefixMappings="xmlns:ns0='http://schemas.openxmlformats.org/package/2006/metadata/core-properties' xmlns:ns1='http://purl.org/dc/elements/1.1/'" w:xpath="/ns0:coreProperties[1]/ns1:title[1]" w:storeItemID="{6C3C8BC8-F283-45AE-878A-BAB7291924A1}"/>
               <w:text/>
             </w:sdtPr>
+            <w:sdtEndPr/>
             <w:sdtContent>
               <w:r>
                 <w:rPr>
@@ -42,20 +43,6 @@
                 </w:rPr>
                 <w:t>YCompany – eClaims</w:t>
               </w:r>
-              <w:r>
-                <w:rPr>
-                  <w:lang w:val="en-IN"/>
-                </w:rPr>
-                <w:t xml:space="preserve"/>
-              </w:r>
-              <w:proofErr w:type="spellStart"/>
-              <w:r>
-                <w:rPr>
-                  <w:lang w:val="en-IN"/>
-                </w:rPr>
-                <w:t/>
-              </w:r>
-              <w:proofErr w:type="spellEnd"/>
             </w:sdtContent>
           </w:sdt>
         </w:p>
@@ -91,9 +78,9 @@
                     <wp:wrapNone/>
                     <wp:docPr id="18" name="Rectangle 2"/>
                     <wp:cNvGraphicFramePr>
-                      <a:graphicFrameLocks/>
+                      <a:graphicFrameLocks xmlns:a="http://schemas.openxmlformats.org/drawingml/2006/main"/>
                     </wp:cNvGraphicFramePr>
-                    <a:graphic>
+                    <a:graphic xmlns:a="http://schemas.openxmlformats.org/drawingml/2006/main">
                       <a:graphicData uri="http://schemas.microsoft.com/office/word/2010/wordprocessingShape">
                         <wps:wsp>
                           <wps:cNvSpPr>
@@ -137,7 +124,7 @@
                   </wp:anchor>
                 </w:drawing>
               </mc:Choice>
-              <mc:Fallback>
+              <mc:Fallback xmlns:w16cei="http://schemas.microsoft.com/office/word/2026/wordml/cei" xmlns:a="http://schemas.openxmlformats.org/drawingml/2006/main" xmlns:a14="http://schemas.microsoft.com/office/drawing/2010/main" xmlns:pic="http://schemas.openxmlformats.org/drawingml/2006/picture">
                 <w:pict>
                   <v:rect w14:anchorId="612C2001" id="Rectangle 2" o:spid="_x0000_s1026" style="position:absolute;margin-left:0;margin-top:0;width:640.85pt;height:63.55pt;z-index:251660288;visibility:visible;mso-wrap-style:square;mso-width-percent:1050;mso-height-percent:900;mso-wrap-distance-left:9pt;mso-wrap-distance-top:0;mso-wrap-distance-right:9pt;mso-wrap-distance-bottom:0;mso-position-horizontal:center;mso-position-horizontal-relative:page;mso-position-vertical:bottom;mso-position-vertical-relative:page;mso-width-percent:1050;mso-height-percent:900;mso-width-relative:page;mso-height-relative:top-margin-area;v-text-anchor:top" o:gfxdata="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" o:allowincell="f" fillcolor="#5b9bd5 [3204]" strokecolor="#2f5496 [2408]">
                     <w10:wrap anchorx="page" anchory="page"/>
@@ -170,9 +157,9 @@
                     <wp:wrapNone/>
                     <wp:docPr id="17" name="Rectangle 5"/>
                     <wp:cNvGraphicFramePr>
-                      <a:graphicFrameLocks/>
+                      <a:graphicFrameLocks xmlns:a="http://schemas.openxmlformats.org/drawingml/2006/main"/>
                     </wp:cNvGraphicFramePr>
-                    <a:graphic>
+                    <a:graphic xmlns:a="http://schemas.openxmlformats.org/drawingml/2006/main">
                       <a:graphicData uri="http://schemas.microsoft.com/office/word/2010/wordprocessingShape">
                         <wps:wsp>
                           <wps:cNvSpPr>
@@ -219,7 +206,7 @@
                   </wp:anchor>
                 </w:drawing>
               </mc:Choice>
-              <mc:Fallback>
+              <mc:Fallback xmlns:w16cei="http://schemas.microsoft.com/office/word/2026/wordml/cei" xmlns:a="http://schemas.openxmlformats.org/drawingml/2006/main" xmlns:a14="http://schemas.microsoft.com/office/drawing/2010/main" xmlns:pic="http://schemas.openxmlformats.org/drawingml/2006/picture">
                 <w:pict>
                   <v:rect w14:anchorId="3D2228B1" id="Rectangle 5" o:spid="_x0000_s1026" style="position:absolute;margin-left:0;margin-top:0;width:7.15pt;height:829.85pt;z-index:251663360;visibility:visible;mso-wrap-style:square;mso-width-percent:0;mso-height-percent:1050;mso-wrap-distance-left:9pt;mso-wrap-distance-top:0;mso-wrap-distance-right:9pt;mso-wrap-distance-bottom:0;mso-position-horizontal:center;mso-position-horizontal-relative:left-margin-area;mso-position-vertical:center;mso-position-vertical-relative:page;mso-width-percent:0;mso-height-percent:1050;mso-width-relative:page;mso-height-relative:page;v-text-anchor:top" o:gfxdata="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" o:allowincell="f" fillcolor="white [3212]" strokecolor="#2f5496 [2408]">
                     <w10:wrap anchorx="margin" anchory="page"/>
@@ -252,9 +239,9 @@
                     <wp:wrapNone/>
                     <wp:docPr id="16" name="Rectangle 4"/>
                     <wp:cNvGraphicFramePr>
-                      <a:graphicFrameLocks/>
+                      <a:graphicFrameLocks xmlns:a="http://schemas.openxmlformats.org/drawingml/2006/main"/>
                     </wp:cNvGraphicFramePr>
-                    <a:graphic>
+                    <a:graphic xmlns:a="http://schemas.openxmlformats.org/drawingml/2006/main">
                       <a:graphicData uri="http://schemas.microsoft.com/office/word/2010/wordprocessingShape">
                         <wps:wsp>
                           <wps:cNvSpPr>
@@ -301,7 +288,7 @@
                   </wp:anchor>
                 </w:drawing>
               </mc:Choice>
-              <mc:Fallback>
+              <mc:Fallback xmlns:w16cei="http://schemas.microsoft.com/office/word/2026/wordml/cei" xmlns:a="http://schemas.openxmlformats.org/drawingml/2006/main" xmlns:a14="http://schemas.microsoft.com/office/drawing/2010/main" xmlns:pic="http://schemas.openxmlformats.org/drawingml/2006/picture">
                 <w:pict>
                   <v:rect w14:anchorId="698A9FCE" id="Rectangle 4" o:spid="_x0000_s1026" style="position:absolute;margin-left:0;margin-top:0;width:7.15pt;height:829.85pt;z-index:251662336;visibility:visible;mso-wrap-style:square;mso-width-percent:0;mso-height-percent:1050;mso-wrap-distance-left:9pt;mso-wrap-distance-top:0;mso-wrap-distance-right:9pt;mso-wrap-distance-bottom:0;mso-position-horizontal:center;mso-position-horizontal-relative:right-margin-area;mso-position-vertical:center;mso-position-vertical-relative:page;mso-width-percent:0;mso-height-percent:1050;mso-width-relative:page;mso-height-relative:page;v-text-anchor:top" o:gfxdata="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" o:allowincell="f" fillcolor="white [3212]" strokecolor="#2f5496 [2408]">
                     <w10:wrap anchorx="margin" anchory="page"/>
@@ -334,9 +321,9 @@
                     <wp:wrapNone/>
                     <wp:docPr id="14" name="Rectangle 3"/>
                     <wp:cNvGraphicFramePr>
-                      <a:graphicFrameLocks/>
+                      <a:graphicFrameLocks xmlns:a="http://schemas.openxmlformats.org/drawingml/2006/main"/>
                     </wp:cNvGraphicFramePr>
-                    <a:graphic>
+                    <a:graphic xmlns:a="http://schemas.openxmlformats.org/drawingml/2006/main">
                       <a:graphicData uri="http://schemas.microsoft.com/office/word/2010/wordprocessingShape">
                         <wps:wsp>
                           <wps:cNvSpPr>
@@ -380,7 +367,7 @@
                   </wp:anchor>
                 </w:drawing>
               </mc:Choice>
-              <mc:Fallback>
+              <mc:Fallback xmlns:w16cei="http://schemas.microsoft.com/office/word/2026/wordml/cei" xmlns:a="http://schemas.openxmlformats.org/drawingml/2006/main" xmlns:a14="http://schemas.microsoft.com/office/drawing/2010/main" xmlns:pic="http://schemas.openxmlformats.org/drawingml/2006/picture">
                 <w:pict>
                   <v:rect w14:anchorId="62BDE170" id="Rectangle 3" o:spid="_x0000_s1026" style="position:absolute;margin-left:0;margin-top:0;width:640.85pt;height:63.55pt;z-index:251661312;visibility:visible;mso-wrap-style:square;mso-width-percent:1050;mso-height-percent:900;mso-wrap-distance-left:9pt;mso-wrap-distance-top:0;mso-wrap-distance-right:9pt;mso-wrap-distance-bottom:0;mso-position-horizontal:center;mso-position-horizontal-relative:page;mso-position-vertical:top;mso-position-vertical-relative:top-margin-area;mso-width-percent:1050;mso-height-percent:900;mso-width-relative:page;mso-height-relative:top-margin-area;v-text-anchor:top" o:gfxdata="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" o:allowincell="f" fillcolor="#5b9bd5 [3204]" strokecolor="#2f5496 [2408]">
                     <w10:wrap anchorx="page" anchory="margin"/>
@@ -400,6 +387,7 @@
               <w:dataBinding w:prefixMappings="xmlns:ns0='http://schemas.openxmlformats.org/package/2006/metadata/core-properties' xmlns:ns1='http://purl.org/dc/elements/1.1/'" w:xpath="/ns0:coreProperties[1]/ns1:subject[1]" w:storeItemID="{6C3C8BC8-F283-45AE-878A-BAB7291924A1}"/>
               <w:text/>
             </w:sdtPr>
+            <w:sdtEndPr/>
             <w:sdtContent>
               <w:r>
                 <w:rPr>
@@ -589,9 +577,9 @@
                 <wp:effectExtent l="0" t="0" r="0" b="0"/>
                 <wp:docPr id="1" name="Picture 1"/>
                 <wp:cNvGraphicFramePr/>
-                <a:graphic>
+                <a:graphic xmlns:a="http://schemas.openxmlformats.org/drawingml/2006/main">
                   <a:graphicData uri="http://schemas.openxmlformats.org/drawingml/2006/picture">
-                    <pic:pic>
+                    <pic:pic xmlns:pic="http://schemas.openxmlformats.org/drawingml/2006/picture">
                       <pic:nvPicPr>
                         <pic:cNvPr id="3" name="Picture 3"/>
                         <pic:cNvPicPr/>
@@ -600,7 +588,7 @@
                         <a:blip r:embed="rId8" cstate="print">
                           <a:extLst>
                             <a:ext uri="{28A0092B-C50C-407E-A947-70E740481C1C}">
-                              <a14:useLocalDpi val="0"/>
+                              <a14:useLocalDpi xmlns:a14="http://schemas.microsoft.com/office/drawing/2010/main" val="0"/>
                             </a:ext>
                           </a:extLst>
                         </a:blip>
@@ -639,6 +627,7 @@
             <w:dataBinding w:prefixMappings="xmlns:ns0='http://schemas.openxmlformats.org/officeDocument/2006/extended-properties'" w:xpath="/ns0:Properties[1]/ns0:Company[1]" w:storeItemID="{6668398D-A668-4E3E-A5EB-62B293D839F1}"/>
             <w:text/>
           </w:sdtPr>
+          <w:sdtEndPr/>
           <w:sdtContent>
             <w:p>
               <w:pPr>
@@ -666,6 +655,7 @@
             <w:dataBinding w:prefixMappings="xmlns:ns0='http://schemas.openxmlformats.org/package/2006/metadata/core-properties' xmlns:ns1='http://purl.org/dc/elements/1.1/'" w:xpath="/ns0:coreProperties[1]/ns1:creator[1]" w:storeItemID="{6C3C8BC8-F283-45AE-878A-BAB7291924A1}"/>
             <w:text/>
           </w:sdtPr>
+          <w:sdtEndPr/>
           <w:sdtContent>
             <w:p>
               <w:pPr>
@@ -896,7 +886,7 @@
               <w:rPr>
                 <w:rFonts w:asciiTheme="majorHAnsi" w:hAnsiTheme="majorHAnsi"/>
               </w:rPr>
-              <w:t xml:space="preserve">1.0</w:t>
+              <w:t>1.0</w:t>
             </w:r>
           </w:p>
         </w:tc>
@@ -1826,7 +1816,7 @@
                 <w:noProof/>
                 <w:webHidden/>
               </w:rPr>
-              <w:t>6</w:t>
+              <w:t>7</w:t>
             </w:r>
             <w:r>
               <w:rPr>
@@ -1920,7 +1910,7 @@
                 <w:noProof/>
                 <w:webHidden/>
               </w:rPr>
-              <w:t>6</w:t>
+              <w:t>7</w:t>
             </w:r>
             <w:r>
               <w:rPr>
@@ -2014,7 +2004,7 @@
                 <w:noProof/>
                 <w:webHidden/>
               </w:rPr>
-              <w:t>7</w:t>
+              <w:t>8</w:t>
             </w:r>
             <w:r>
               <w:rPr>
@@ -2108,7 +2098,7 @@
                 <w:noProof/>
                 <w:webHidden/>
               </w:rPr>
-              <w:t>7</w:t>
+              <w:t>8</w:t>
             </w:r>
             <w:r>
               <w:rPr>
@@ -2296,7 +2286,7 @@
                 <w:noProof/>
                 <w:webHidden/>
               </w:rPr>
-              <w:t>8</w:t>
+              <w:t>9</w:t>
             </w:r>
             <w:r>
               <w:rPr>
@@ -2390,7 +2380,7 @@
                 <w:noProof/>
                 <w:webHidden/>
               </w:rPr>
-              <w:t>9</w:t>
+              <w:t>10</w:t>
             </w:r>
             <w:r>
               <w:rPr>
@@ -2484,7 +2474,7 @@
                 <w:noProof/>
                 <w:webHidden/>
               </w:rPr>
-              <w:t>9</w:t>
+              <w:t>10</w:t>
             </w:r>
             <w:r>
               <w:rPr>
@@ -2578,7 +2568,7 @@
                 <w:noProof/>
                 <w:webHidden/>
               </w:rPr>
-              <w:t>9</w:t>
+              <w:t>10</w:t>
             </w:r>
             <w:r>
               <w:rPr>
@@ -2672,7 +2662,7 @@
                 <w:noProof/>
                 <w:webHidden/>
               </w:rPr>
-              <w:t>10</w:t>
+              <w:t>11</w:t>
             </w:r>
             <w:r>
               <w:rPr>
@@ -2762,7 +2752,7 @@
                 <w:noProof/>
                 <w:webHidden/>
               </w:rPr>
-              <w:t>10</w:t>
+              <w:t>12</w:t>
             </w:r>
             <w:r>
               <w:rPr>
@@ -2856,7 +2846,7 @@
                 <w:noProof/>
                 <w:webHidden/>
               </w:rPr>
-              <w:t>10</w:t>
+              <w:t>12</w:t>
             </w:r>
             <w:r>
               <w:rPr>
@@ -2950,7 +2940,7 @@
                 <w:noProof/>
                 <w:webHidden/>
               </w:rPr>
-              <w:t>11</w:t>
+              <w:t>13</w:t>
             </w:r>
             <w:r>
               <w:rPr>
@@ -3044,7 +3034,7 @@
                 <w:noProof/>
                 <w:webHidden/>
               </w:rPr>
-              <w:t>12</w:t>
+              <w:t>13</w:t>
             </w:r>
             <w:r>
               <w:rPr>
@@ -3134,7 +3124,7 @@
                 <w:noProof/>
                 <w:webHidden/>
               </w:rPr>
-              <w:t>13</w:t>
+              <w:t>15</w:t>
             </w:r>
             <w:r>
               <w:rPr>
@@ -3224,7 +3214,7 @@
                 <w:noProof/>
                 <w:webHidden/>
               </w:rPr>
-              <w:t>15</w:t>
+              <w:t>17</w:t>
             </w:r>
             <w:r>
               <w:rPr>
@@ -3314,7 +3304,7 @@
                 <w:noProof/>
                 <w:webHidden/>
               </w:rPr>
-              <w:t>16</w:t>
+              <w:t>18</w:t>
             </w:r>
             <w:r>
               <w:rPr>
@@ -3404,7 +3394,7 @@
                 <w:noProof/>
                 <w:webHidden/>
               </w:rPr>
-              <w:t>17</w:t>
+              <w:t>20</w:t>
             </w:r>
             <w:r>
               <w:rPr>
@@ -3498,7 +3488,7 @@
                 <w:noProof/>
                 <w:webHidden/>
               </w:rPr>
-              <w:t>17</w:t>
+              <w:t>20</w:t>
             </w:r>
             <w:r>
               <w:rPr>
@@ -3592,7 +3582,7 @@
                 <w:noProof/>
                 <w:webHidden/>
               </w:rPr>
-              <w:t>18</w:t>
+              <w:t>20</w:t>
             </w:r>
             <w:r>
               <w:rPr>
@@ -3652,15 +3642,7 @@
         <w:pStyle w:val="Body"/>
       </w:pPr>
       <w:r>
-        <w:t xml:space="preserve">This Decision Analysis and Recommendation (DAR) document records the evaluation behind the choice of backend web framework for the YCompany eClaims platform — the framework in which every eClaims backend microservice is implemented: the Layer 3 services in SAD Section 4 and the Auth Service.</w:t>
-      </w:r>
-      <w:proofErr w:type="spellStart"/>
-      <w:r>
-        <w:t xml:space="preserve"/>
-      </w:r>
-      <w:proofErr w:type="spellEnd"/>
-      <w:r>
-        <w:t xml:space="preserve"/>
+        <w:t>This Decision Analysis and Recommendation (DAR) document records the evaluation behind the choice of backend web framework for the YCompany eClaims platform — the framework in which every eClaims backend microservice is implemented: the Layer 3 services in SAD Section 4 and the Auth Service.</w:t>
       </w:r>
     </w:p>
     <w:p>
@@ -3668,23 +3650,7 @@
         <w:pStyle w:val="Body"/>
       </w:pPr>
       <w:r>
-        <w:t xml:space="preserve">The </w:t>
-      </w:r>
-      <w:proofErr w:type="spellStart"/>
-      <w:r>
-        <w:t>eClaims</w:t>
-      </w:r>
-      <w:proofErr w:type="spellEnd"/>
-      <w:r>
-        <w:t xml:space="preserve"> Solution Approach Document (SAD) names Python </w:t>
-      </w:r>
-      <w:proofErr w:type="spellStart"/>
-      <w:r>
-        <w:t>FastAPI</w:t>
-      </w:r>
-      <w:proofErr w:type="spellEnd"/>
-      <w:r>
-        <w:t xml:space="preserve"> as the backend API technology. That document states the conclusion; this DAR supplies the evidence for it — the candidates considered, the evaluation attributes and their weights, the scoring, and the assumptions and risks that the recommendation carries with it.</w:t>
+        <w:t>The eClaims Solution Approach Document (SAD) names Python FastAPI as the backend API technology. That document states the conclusion; this DAR supplies the evidence for it — the candidates considered, the evaluation attributes and their weights, the scoring, and the assumptions and risks that the recommendation carries with it.</w:t>
       </w:r>
     </w:p>
     <w:p>
@@ -3702,15 +3668,7 @@
         <w:pStyle w:val="Body"/>
       </w:pPr>
       <w:r>
-        <w:t xml:space="preserve">The objective of this document is to identify the viable Python backend framework options for </w:t>
-      </w:r>
-      <w:proofErr w:type="spellStart"/>
-      <w:r>
-        <w:t>eClaims</w:t>
-      </w:r>
-      <w:proofErr w:type="spellEnd"/>
-      <w:r>
-        <w:t>, compare them objectively against requirement-derived criteria, and recommend one for the target production architecture and for the proof of concept alike.</w:t>
+        <w:t>The objective of this document is to identify the viable Python backend framework options for eClaims, compare them objectively against requirement-derived criteria, and recommend one for the target production architecture and for the proof of concept alike.</w:t>
       </w:r>
     </w:p>
     <w:p>
@@ -3816,24 +3774,13 @@
         <w:pStyle w:val="Body"/>
       </w:pPr>
       <w:r>
-        <w:t xml:space="preserve">The following are out of scope. The choice of Python as the backend language is not reopened here: it is an accepted constraint recorded in Section 6, and the comparison is between Python frameworks only. This document does not restate the </w:t>
-      </w:r>
-      <w:proofErr w:type="spellStart"/>
-      <w:r>
-        <w:t>eClaims</w:t>
-      </w:r>
-      <w:proofErr w:type="spellEnd"/>
-      <w:r>
-        <w:t xml:space="preserve"> solution architecture, does not specify service boundaries or API contracts, and does not cover the frontend framework, the data stores, the messaging layer or the deployment platform — the last of which is the subject of a separate DAR on compute and deployment platform selection. All three candidates are open-source and free of </w:t>
-      </w:r>
-      <w:proofErr w:type="spellStart"/>
-      <w:r>
-        <w:t>licence</w:t>
-      </w:r>
-      <w:proofErr w:type="spellEnd"/>
-      <w:r>
-        <w:t xml:space="preserve"> cost, so pricing does not discriminate between them and is recorded in Section 3 for completeness rather than scored in Section 4.</w:t>
-      </w:r>
+        <w:t>The following are out of scope. The choice of Python as the backend language is not reopened here: it is an accepted constraint recorded in Section 6, and the comparison is between Python frameworks only. This document does not restate the eClaims solution architecture, does not specify service boundaries or API contracts, and does not cover the frontend framework, the data stores, the messaging layer or the deployment platform — the last of which is the subject of a separate DAR on compute and deployment platform selection. All three candidates are open-source and free of licence cost, so pricing does not discriminate between them and is recorded in Section 3 for completeness rather than scored in Section 4.</w:t>
+      </w:r>
+    </w:p>
+    <w:p>
+      <w:pPr>
+        <w:pStyle w:val="Body"/>
+      </w:pPr>
     </w:p>
     <w:p>
       <w:pPr>
@@ -3842,37 +3789,16 @@
       <w:bookmarkStart w:id="2" w:name="_Toc238143520"/>
       <w:r>
         <w:lastRenderedPageBreak/>
-        <w:t xml:space="preserve">Requirements </w:t>
-      </w:r>
-      <w:proofErr w:type="gramStart"/>
-      <w:r>
-        <w:t>at a Glance</w:t>
+        <w:t>Requirements at a Glance</w:t>
       </w:r>
       <w:bookmarkEnd w:id="2"/>
-      <w:proofErr w:type="gramEnd"/>
     </w:p>
     <w:p>
       <w:pPr>
         <w:pStyle w:val="Body"/>
       </w:pPr>
       <w:r>
-        <w:t xml:space="preserve">This section </w:t>
-      </w:r>
-      <w:proofErr w:type="spellStart"/>
-      <w:r>
-        <w:t>summarises</w:t>
-      </w:r>
-      <w:proofErr w:type="spellEnd"/>
-      <w:r>
-        <w:t xml:space="preserve"> only those requirements that discriminate between the framework options. It is deliberately not a restatement of the full </w:t>
-      </w:r>
-      <w:proofErr w:type="spellStart"/>
-      <w:r>
-        <w:t>eClaims</w:t>
-      </w:r>
-      <w:proofErr w:type="spellEnd"/>
-      <w:r>
-        <w:t xml:space="preserve"> requirement set; requirements that every candidate satisfies equally cannot influence the decision and are omitted.</w:t>
+        <w:t>This section summarises only those requirements that discriminate between the framework options. It is deliberately not a restatement of the full eClaims requirement set; requirements that every candidate satisfies equally cannot influence the decision and are omitted.</w:t>
       </w:r>
     </w:p>
     <w:p>
@@ -3880,15 +3806,7 @@
         <w:pStyle w:val="Body"/>
       </w:pPr>
       <w:r>
-        <w:t xml:space="preserve">The decisive characteristic of </w:t>
-      </w:r>
-      <w:proofErr w:type="spellStart"/>
-      <w:r>
-        <w:t>eClaims</w:t>
-      </w:r>
-      <w:proofErr w:type="spellEnd"/>
-      <w:r>
-        <w:t xml:space="preserve"> is that it is an API-first platform, not a server-rendered web application. Three separate React front ends — the Customer Portal, the Internal Portal and the Partner Portal — plus external partner integration all consume the same backend over HTTP. Nothing in the backend renders HTML. That single fact is what moves interface documentation and payload validation from convenience to requirement.</w:t>
+        <w:t>The decisive characteristic of eClaims is that it is an API-first platform, not a server-rendered web application. Three separate React front ends — the Customer Portal, the Internal Portal and the Partner Portal — plus external partner integration all consume the same backend over HTTP. Nothing in the backend renders HTML. That single fact is what moves interface documentation and payload validation from convenience to requirement.</w:t>
       </w:r>
     </w:p>
     <w:p>
@@ -4034,15 +3952,7 @@
         <w:t>Performance</w:t>
       </w:r>
       <w:r>
-        <w:t xml:space="preserve"> — 99% of service calls must complete in under 5,000 </w:t>
-      </w:r>
-      <w:proofErr w:type="spellStart"/>
-      <w:r>
-        <w:t>ms</w:t>
-      </w:r>
-      <w:proofErr w:type="spellEnd"/>
-      <w:r>
-        <w:t xml:space="preserve"> at peak and non-peak load; framework overhead must not consume a material share of that budget.</w:t>
+        <w:t xml:space="preserve"> — 99% of service calls must complete in under 5,000 ms at peak and non-peak load; framework overhead must not consume a material share of that budget.</w:t>
       </w:r>
     </w:p>
     <w:p>
@@ -4089,7 +3999,6 @@
           <w:numId w:val="8"/>
         </w:numPr>
       </w:pPr>
-      <w:proofErr w:type="spellStart"/>
       <w:r>
         <w:rPr>
           <w:b/>
@@ -4097,17 +4006,8 @@
         <w:lastRenderedPageBreak/>
         <w:t>Deployability</w:t>
       </w:r>
-      <w:proofErr w:type="spellEnd"/>
-      <w:r>
-        <w:t xml:space="preserve"> — services are packaged as containers and run on serverless containers in the cloud, with an </w:t>
-      </w:r>
-      <w:proofErr w:type="gramStart"/>
-      <w:r>
-        <w:t>on-premise</w:t>
-      </w:r>
-      <w:proofErr w:type="gramEnd"/>
-      <w:r>
-        <w:t xml:space="preserve"> path preserved through infrastructure-as-code. The framework must be neutral to both.</w:t>
+      <w:r>
+        <w:t xml:space="preserve"> — services are packaged as containers and run on serverless containers in the cloud, with an on-premise path preserved through infrastructure-as-code. The framework must be neutral to both.</w:t>
       </w:r>
     </w:p>
     <w:p>
@@ -4164,12 +4064,31 @@
         <w:t xml:space="preserve"> — independently testable services, configuration over code change for role administration, and a codebase a mixed-seniority team can extend safely over the platform’s life.</w:t>
       </w:r>
     </w:p>
+    <w:p/>
+    <w:p/>
+    <w:p/>
+    <w:p/>
+    <w:p/>
+    <w:p/>
+    <w:p/>
+    <w:p/>
+    <w:p/>
+    <w:p/>
+    <w:p/>
+    <w:p/>
+    <w:p/>
+    <w:p/>
+    <w:p/>
+    <w:p/>
+    <w:p/>
+    <w:p/>
     <w:p>
       <w:pPr>
         <w:pStyle w:val="Heading1"/>
       </w:pPr>
       <w:bookmarkStart w:id="5" w:name="_Toc238143523"/>
       <w:r>
+        <w:lastRenderedPageBreak/>
         <w:t>Available tools</w:t>
       </w:r>
       <w:bookmarkEnd w:id="5"/>
@@ -4179,15 +4098,7 @@
         <w:pStyle w:val="Body"/>
       </w:pPr>
       <w:r>
-        <w:t xml:space="preserve">Three Python web frameworks were carried into detailed comparison. They are the </w:t>
-      </w:r>
-      <w:proofErr w:type="gramStart"/>
-      <w:r>
-        <w:t>three in</w:t>
-      </w:r>
-      <w:proofErr w:type="gramEnd"/>
-      <w:r>
-        <w:t xml:space="preserve"> mainstream enterprise use for this class of work and they span the design space: a minimal WSGI microframework, a typed ASGI API framework, and a full-stack batteries-included framework.</w:t>
+        <w:t>Three Python web frameworks were carried into detailed comparison. They are the three in mainstream enterprise use for this class of work and they span the design space: a minimal WSGI microframework, a typed ASGI API framework, and a full-stack batteries-included framework.</w:t>
       </w:r>
     </w:p>
     <w:tbl>
@@ -4364,11 +4275,9 @@
             <w:pPr>
               <w:pStyle w:val="NoSpacing"/>
             </w:pPr>
-            <w:proofErr w:type="spellStart"/>
             <w:r>
               <w:t>FastAPI</w:t>
             </w:r>
-            <w:proofErr w:type="spellEnd"/>
           </w:p>
         </w:tc>
         <w:tc>
@@ -4405,7 +4314,7 @@
               <w:pStyle w:val="NoSpacing"/>
             </w:pPr>
             <w:r>
-              <w:t xml:space="preserve">0.142</w:t>
+              <w:t>0.142</w:t>
             </w:r>
           </w:p>
         </w:tc>
@@ -4491,47 +4400,7 @@
         <w:pStyle w:val="Body"/>
       </w:pPr>
       <w:r>
-        <w:t xml:space="preserve">Options considered and not carried forward are recorded for completeness. Tornado and </w:t>
-      </w:r>
-      <w:proofErr w:type="spellStart"/>
-      <w:r>
-        <w:t>aiohttp</w:t>
-      </w:r>
-      <w:proofErr w:type="spellEnd"/>
-      <w:r>
-        <w:t xml:space="preserve"> are capable asynchronous servers but offer no request-validation or interface-documentation model, which is where the </w:t>
-      </w:r>
-      <w:proofErr w:type="spellStart"/>
-      <w:r>
-        <w:t>eClaims</w:t>
-      </w:r>
-      <w:proofErr w:type="spellEnd"/>
-      <w:r>
-        <w:t xml:space="preserve"> requirement pressure sits. Starlette is the ASGI toolkit </w:t>
-      </w:r>
-      <w:proofErr w:type="spellStart"/>
-      <w:r>
-        <w:t>FastAPI</w:t>
-      </w:r>
-      <w:proofErr w:type="spellEnd"/>
-      <w:r>
-        <w:t xml:space="preserve"> is built on, so evaluating it separately would compare a subset against its own superset. </w:t>
-      </w:r>
-      <w:proofErr w:type="spellStart"/>
-      <w:r>
-        <w:t>Litestar</w:t>
-      </w:r>
-      <w:proofErr w:type="spellEnd"/>
-      <w:r>
-        <w:t xml:space="preserve"> and Sanic are credible, but neither adds a capability the three options below do not already represent, and neither has a comparable hiring pool or support record </w:t>
-      </w:r>
-      <w:proofErr w:type="gramStart"/>
-      <w:r>
-        <w:t>at enterprise</w:t>
-      </w:r>
-      <w:proofErr w:type="gramEnd"/>
-      <w:r>
-        <w:t xml:space="preserve"> scale.</w:t>
+        <w:t>Options considered and not carried forward are recorded for completeness. Tornado and aiohttp are capable asynchronous servers but offer no request-validation or interface-documentation model, which is where the eClaims requirement pressure sits. Starlette is the ASGI toolkit FastAPI is built on, so evaluating it separately would compare a subset against its own superset. Litestar and Sanic are credible, but neither adds a capability the three options below do not already represent, and neither has a comparable hiring pool or support record at enterprise scale.</w:t>
       </w:r>
     </w:p>
     <w:p>
@@ -4549,15 +4418,7 @@
         <w:pStyle w:val="Body"/>
       </w:pPr>
       <w:r>
-        <w:t xml:space="preserve">Python Flask is a web framework that </w:t>
-      </w:r>
-      <w:proofErr w:type="spellStart"/>
-      <w:r>
-        <w:t>emphasises</w:t>
-      </w:r>
-      <w:proofErr w:type="spellEnd"/>
-      <w:r>
-        <w:t xml:space="preserve"> simplicity and minimalism. It is often described as a micro framework because of its lightweight and unopinionated nature: it provides the essential tools to build web applications in Python without imposing a rigid structure or a fixed set of dependencies. That minimalism leaves the team free to architect an application to its own preferences, which makes Flask a versatile choice across a wide range of projects.</w:t>
+        <w:t>Python Flask is a web framework that emphasises simplicity and minimalism. It is often described as a micro framework because of its lightweight and unopinionated nature: it provides the essential tools to build web applications in Python without imposing a rigid structure or a fixed set of dependencies. That minimalism leaves the team free to architect an application to its own preferences, which makes Flask a versatile choice across a wide range of projects.</w:t>
       </w:r>
     </w:p>
     <w:p>
@@ -4565,67 +4426,24 @@
         <w:pStyle w:val="Body"/>
       </w:pPr>
       <w:r>
-        <w:t xml:space="preserve">Flask is known for its ease of use and directness, which makes it accessible to developers of varying experience and supports rapid prototyping. A large catalogue of extensions supplies </w:t>
-      </w:r>
+        <w:t>Flask is known for its ease of use and directness, which makes it accessible to developers of varying experience and supports rapid prototyping. A large catalogue of extensions supplies capabilities the core deliberately omits — authentication, database integration, migrations, schema validation — each adopted by the team as the project needs it.</w:t>
+      </w:r>
+    </w:p>
+    <w:p>
+      <w:pPr>
+        <w:pStyle w:val="Body"/>
+      </w:pPr>
+      <w:r>
+        <w:t>The framework builds on the Werkzeug WSGI toolkit for request handling and routing and on the Jinja2 templating engine for server-rendered HTML. As of version 3.1 Flask can serve ASGI deployments through an adapter and supports asynchronous view functions, but its request model and its extension ecosystem remain synchronous by design; asynchronous work is an accommodation rather than the framework’s native mode.</w:t>
+      </w:r>
+    </w:p>
+    <w:p>
+      <w:pPr>
+        <w:pStyle w:val="Body"/>
+      </w:pPr>
       <w:r>
         <w:lastRenderedPageBreak/>
-        <w:t>capabilities the core deliberately omits — authentication, database integration, migrations, schema validation — each adopted by the team as the project needs it.</w:t>
-      </w:r>
-    </w:p>
-    <w:p>
-      <w:pPr>
-        <w:pStyle w:val="Body"/>
-      </w:pPr>
-      <w:r>
-        <w:t xml:space="preserve">The framework </w:t>
-      </w:r>
-      <w:proofErr w:type="gramStart"/>
-      <w:r>
-        <w:t>builds</w:t>
-      </w:r>
-      <w:proofErr w:type="gramEnd"/>
-      <w:r>
-        <w:t xml:space="preserve"> on the </w:t>
-      </w:r>
-      <w:proofErr w:type="spellStart"/>
-      <w:r>
-        <w:t>Werkzeug</w:t>
-      </w:r>
-      <w:proofErr w:type="spellEnd"/>
-      <w:r>
-        <w:t xml:space="preserve"> WSGI toolkit for request handling and routing and on the Jinja2 templating engine for server-rendered HTML. </w:t>
-      </w:r>
-      <w:proofErr w:type="gramStart"/>
-      <w:r>
-        <w:t>As of</w:t>
-      </w:r>
-      <w:proofErr w:type="gramEnd"/>
-      <w:r>
-        <w:t xml:space="preserve"> version 3.1 Flask can serve ASGI deployments through an adapter and supports asynchronous view functions, but its request model and its extension ecosystem remain synchronous by design; asynchronous work is an accommodation rather than the framework’s native mode.</w:t>
-      </w:r>
-    </w:p>
-    <w:p>
-      <w:pPr>
-        <w:pStyle w:val="Body"/>
-      </w:pPr>
-      <w:r>
-        <w:t xml:space="preserve">Flask’s flexibility and light footprint make it particularly well suited to small and medium services where a minimal, </w:t>
-      </w:r>
-      <w:proofErr w:type="spellStart"/>
-      <w:r>
-        <w:t>customisable</w:t>
-      </w:r>
-      <w:proofErr w:type="spellEnd"/>
-      <w:r>
-        <w:t xml:space="preserve"> approach is wanted, and where the team is content to assemble validation, </w:t>
-      </w:r>
-      <w:proofErr w:type="spellStart"/>
-      <w:r>
-        <w:t>serialisation</w:t>
-      </w:r>
-      <w:proofErr w:type="spellEnd"/>
-      <w:r>
-        <w:t xml:space="preserve"> and documentation from separate components.</w:t>
+        <w:t>Flask’s flexibility and light footprint make it particularly well suited to small and medium services where a minimal, customisable approach is wanted, and where the team is content to assemble validation, serialisation and documentation from separate components.</w:t>
       </w:r>
     </w:p>
     <w:p>
@@ -4682,19 +4500,11 @@
           <w:numId w:val="8"/>
         </w:numPr>
       </w:pPr>
-      <w:proofErr w:type="spellStart"/>
       <w:r>
         <w:rPr>
           <w:b/>
         </w:rPr>
-        <w:t>Werkzeug</w:t>
-      </w:r>
-      <w:proofErr w:type="spellEnd"/>
-      <w:r>
-        <w:rPr>
-          <w:b/>
-        </w:rPr>
-        <w:t xml:space="preserve"> integration</w:t>
+        <w:t>Werkzeug integration</w:t>
       </w:r>
       <w:r>
         <w:t xml:space="preserve"> — a mature, well-understood WSGI layer for routing, request parsing and error handling.</w:t>
@@ -4715,15 +4525,7 @@
         <w:t>Jinja2 templating</w:t>
       </w:r>
       <w:r>
-        <w:t xml:space="preserve"> — server-side HTML rendering, which </w:t>
-      </w:r>
-      <w:proofErr w:type="spellStart"/>
-      <w:r>
-        <w:t>eClaims</w:t>
-      </w:r>
-      <w:proofErr w:type="spellEnd"/>
-      <w:r>
-        <w:t xml:space="preserve"> does not require but which is available.</w:t>
+        <w:t xml:space="preserve"> — server-side HTML rendering, which eClaims does not require but which is available.</w:t>
       </w:r>
     </w:p>
     <w:p>
@@ -4849,15 +4651,7 @@
         <w:t>Scalability</w:t>
       </w:r>
       <w:r>
-        <w:t xml:space="preserve"> — scales horizontally behind a WSGI server such as </w:t>
-      </w:r>
-      <w:proofErr w:type="spellStart"/>
-      <w:r>
-        <w:t>Gunicorn</w:t>
-      </w:r>
-      <w:proofErr w:type="spellEnd"/>
-      <w:r>
-        <w:t>, with concurrency supplied by worker processes and threads rather than by an event loop.</w:t>
+        <w:t xml:space="preserve"> — scales horizontally behind a WSGI server such as Gunicorn, with concurrency supplied by worker processes and threads rather than by an event loop.</w:t>
       </w:r>
     </w:p>
     <w:p>
@@ -4875,31 +4669,7 @@
         <w:pStyle w:val="Body"/>
       </w:pPr>
       <w:r>
-        <w:t xml:space="preserve">Flask is open-source software distributed under the permissive BSD </w:t>
-      </w:r>
-      <w:proofErr w:type="spellStart"/>
-      <w:r>
-        <w:t>licence</w:t>
-      </w:r>
-      <w:proofErr w:type="spellEnd"/>
-      <w:r>
-        <w:t xml:space="preserve">. There </w:t>
-      </w:r>
-      <w:proofErr w:type="gramStart"/>
-      <w:r>
-        <w:t>is</w:t>
-      </w:r>
-      <w:proofErr w:type="gramEnd"/>
-      <w:r>
-        <w:t xml:space="preserve"> no </w:t>
-      </w:r>
-      <w:proofErr w:type="spellStart"/>
-      <w:r>
-        <w:t>licence</w:t>
-      </w:r>
-      <w:proofErr w:type="spellEnd"/>
-      <w:r>
-        <w:t xml:space="preserve"> cost and no usage fee, for commercial or non-commercial use alike.</w:t>
+        <w:t>Flask is open-source software distributed under the permissive BSD licence. There is no licence cost and no usage fee, for commercial or non-commercial use alike.</w:t>
       </w:r>
     </w:p>
     <w:p>
@@ -4907,60 +4677,37 @@
         <w:pStyle w:val="Body"/>
       </w:pPr>
       <w:r>
-        <w:t xml:space="preserve">The cost of building on Flask is therefore not licensing but the surrounding expenditure common to any framework — hosting and infrastructure, third-party libraries and services, and engineering </w:t>
+        <w:t>The cost of building on Flask is therefore not licensing but the surrounding expenditure common to any framework — hosting and infrastructure, third-party libraries and services, and engineering effort. One cost is specific to this option and worth naming: the capabilities that FastAPI provides in its core — schema validation, serialisation and interface documentation — must be assembled on Flask from separate extensions and then maintained as those extensions evolve independently of the framework.</w:t>
+      </w:r>
+    </w:p>
+    <w:p>
+      <w:pPr>
+        <w:pStyle w:val="Heading2"/>
+      </w:pPr>
+      <w:bookmarkStart w:id="9" w:name="_Toc238143527"/>
+      <w:r>
+        <w:t>FastAPI</w:t>
+      </w:r>
+      <w:bookmarkEnd w:id="9"/>
+    </w:p>
+    <w:p>
+      <w:pPr>
+        <w:pStyle w:val="Body"/>
+      </w:pPr>
+      <w:r>
+        <w:t xml:space="preserve">FastAPI is a modern Python web framework for building APIs, built on the Starlette ASGI toolkit and the Pydantic data-validation library. It is asynchronous by design: a request that waits on a database, a cache or an external HTTP call yields the event loop rather than occupying a worker, </w:t>
       </w:r>
       <w:r>
         <w:lastRenderedPageBreak/>
-        <w:t xml:space="preserve">effort. One cost is specific to this option and worth naming: the capabilities that </w:t>
-      </w:r>
-      <w:proofErr w:type="spellStart"/>
-      <w:r>
-        <w:t>FastAPI</w:t>
-      </w:r>
-      <w:proofErr w:type="spellEnd"/>
-      <w:r>
-        <w:t xml:space="preserve"> provides in its core — schema validation, </w:t>
-      </w:r>
-      <w:proofErr w:type="spellStart"/>
-      <w:r>
-        <w:t>serialisation</w:t>
-      </w:r>
-      <w:proofErr w:type="spellEnd"/>
-      <w:r>
-        <w:t xml:space="preserve"> and interface documentation — must be assembled on Flask from separate extensions and then maintained as those extensions evolve independently of the framework.</w:t>
-      </w:r>
-    </w:p>
-    <w:p>
-      <w:pPr>
-        <w:pStyle w:val="Heading2"/>
-      </w:pPr>
-      <w:bookmarkStart w:id="9" w:name="_Toc238143527"/>
-      <w:proofErr w:type="spellStart"/>
-      <w:r>
-        <w:t>FastAPI</w:t>
-      </w:r>
-      <w:bookmarkEnd w:id="9"/>
-      <w:proofErr w:type="spellEnd"/>
+        <w:t>so a single container sustains a high number of concurrent in-flight requests on an I/O-bound workload.</w:t>
+      </w:r>
     </w:p>
     <w:p>
       <w:pPr>
         <w:pStyle w:val="Body"/>
       </w:pPr>
-      <w:proofErr w:type="spellStart"/>
-      <w:r>
-        <w:t>FastAPI</w:t>
-      </w:r>
-      <w:proofErr w:type="spellEnd"/>
-      <w:r>
-        <w:t xml:space="preserve"> is a modern Python web framework for building APIs, built on the Starlette ASGI toolkit and the </w:t>
-      </w:r>
-      <w:proofErr w:type="spellStart"/>
-      <w:r>
-        <w:t>Pydantic</w:t>
-      </w:r>
-      <w:proofErr w:type="spellEnd"/>
-      <w:r>
-        <w:t xml:space="preserve"> data-validation library. It is asynchronous by design: a request that waits on a database, a cache or an external HTTP call yields the event loop rather than occupying a worker, so a single container sustains a high number of concurrent in-flight requests on an I/O-bound workload.</w:t>
+      <w:r>
+        <w:t>Its distinguishing characteristic is that the function signature is the contract. Request and response models are declared as Python type annotations; from those annotations FastAPI derives request parsing, validation, serialisation and error responses, and generates an OpenAPI 3 schema with interactive Swagger UI and ReDoc documentation. One declaration therefore produces the validation and the published interface specification together, and they cannot drift apart, because both are generated from the same source.</w:t>
       </w:r>
     </w:p>
     <w:p>
@@ -4968,52 +4715,7 @@
         <w:pStyle w:val="Body"/>
       </w:pPr>
       <w:r>
-        <w:t xml:space="preserve">Its distinguishing characteristic is that the function signature is the contract. Request and response models are declared as Python type annotations; from those annotations </w:t>
-      </w:r>
-      <w:proofErr w:type="spellStart"/>
-      <w:r>
-        <w:t>FastAPI</w:t>
-      </w:r>
-      <w:proofErr w:type="spellEnd"/>
-      <w:r>
-        <w:t xml:space="preserve"> derives request parsing, validation, </w:t>
-      </w:r>
-      <w:proofErr w:type="spellStart"/>
-      <w:r>
-        <w:t>serialisation</w:t>
-      </w:r>
-      <w:proofErr w:type="spellEnd"/>
-      <w:r>
-        <w:t xml:space="preserve"> and error responses, and generates an </w:t>
-      </w:r>
-      <w:proofErr w:type="spellStart"/>
-      <w:r>
-        <w:t>OpenAPI</w:t>
-      </w:r>
-      <w:proofErr w:type="spellEnd"/>
-      <w:r>
-        <w:t xml:space="preserve"> 3 schema with interactive Swagger UI and </w:t>
-      </w:r>
-      <w:proofErr w:type="spellStart"/>
-      <w:r>
-        <w:t>ReDoc</w:t>
-      </w:r>
-      <w:proofErr w:type="spellEnd"/>
-      <w:r>
-        <w:t xml:space="preserve"> documentation. One declaration therefore produces the validation and the published interface specification together, and they cannot drift apart, because both are generated from the same source.</w:t>
-      </w:r>
-    </w:p>
-    <w:p>
-      <w:pPr>
-        <w:pStyle w:val="Body"/>
-      </w:pPr>
-      <w:proofErr w:type="spellStart"/>
-      <w:r>
-        <w:t>FastAPI’s</w:t>
-      </w:r>
-      <w:proofErr w:type="spellEnd"/>
-      <w:r>
-        <w:t xml:space="preserve"> dependency-injection system is the mechanism through which cross-cutting concerns — authentication, role checks, database sessions, request correlation — are declared per endpoint and overridden in tests. The pairing of FastAPI with Uvicorn is mature and widely deployed, and the framework is well established in production use.</w:t>
+        <w:t>FastAPI’s dependency-injection system is the mechanism through which cross-cutting concerns — authentication, role checks, database sessions, request correlation — are declared per endpoint and overridden in tests. The pairing of FastAPI with Uvicorn is mature and widely deployed, and the framework is well established in production use.</w:t>
       </w:r>
     </w:p>
     <w:p>
@@ -5077,23 +4779,7 @@
         <w:t>Automatic API documentation</w:t>
       </w:r>
       <w:r>
-        <w:t xml:space="preserve"> — an </w:t>
-      </w:r>
-      <w:proofErr w:type="spellStart"/>
-      <w:r>
-        <w:t>OpenAPI</w:t>
-      </w:r>
-      <w:proofErr w:type="spellEnd"/>
-      <w:r>
-        <w:t xml:space="preserve"> 3 schema plus Swagger UI and </w:t>
-      </w:r>
-      <w:proofErr w:type="spellStart"/>
-      <w:r>
-        <w:t>ReDoc</w:t>
-      </w:r>
-      <w:proofErr w:type="spellEnd"/>
-      <w:r>
-        <w:t>, generated from the code and therefore always current.</w:t>
+        <w:t xml:space="preserve"> — an OpenAPI 3 schema plus Swagger UI and ReDoc, generated from the code and therefore always current.</w:t>
       </w:r>
     </w:p>
     <w:p>
@@ -5111,15 +4797,7 @@
         <w:t>Type safety and request validation</w:t>
       </w:r>
       <w:r>
-        <w:t xml:space="preserve"> — </w:t>
-      </w:r>
-      <w:proofErr w:type="spellStart"/>
-      <w:r>
-        <w:t>Pydantic</w:t>
-      </w:r>
-      <w:proofErr w:type="spellEnd"/>
-      <w:r>
-        <w:t xml:space="preserve"> models validate and coerce every request body, query parameter, path parameter and header, returning structured 422 responses without hand-written checks.</w:t>
+        <w:t xml:space="preserve"> — Pydantic models validate and coerce every request body, query parameter, path parameter and header, returning structured 422 responses without hand-written checks.</w:t>
       </w:r>
     </w:p>
     <w:p>
@@ -5166,20 +4844,11 @@
           <w:numId w:val="8"/>
         </w:numPr>
       </w:pPr>
-      <w:proofErr w:type="spellStart"/>
       <w:r>
         <w:rPr>
           <w:b/>
         </w:rPr>
-        <w:lastRenderedPageBreak/>
-        <w:t>OpenAPI</w:t>
-      </w:r>
-      <w:proofErr w:type="spellEnd"/>
-      <w:r>
-        <w:rPr>
-          <w:b/>
-        </w:rPr>
-        <w:t xml:space="preserve"> and standards compatibility</w:t>
+        <w:t>OpenAPI and standards compatibility</w:t>
       </w:r>
       <w:r>
         <w:t xml:space="preserve"> — the generated schema drives client generation for the three portals and for partner integration.</w:t>
@@ -5245,6 +4914,7 @@
       </w:pPr>
       <w:bookmarkStart w:id="11" w:name="_Toc238143529"/>
       <w:r>
+        <w:lastRenderedPageBreak/>
         <w:t>Pricing Model</w:t>
       </w:r>
       <w:bookmarkEnd w:id="11"/>
@@ -5253,53 +4923,8 @@
       <w:pPr>
         <w:pStyle w:val="Body"/>
       </w:pPr>
-      <w:proofErr w:type="spellStart"/>
-      <w:r>
-        <w:t>FastAPI</w:t>
-      </w:r>
-      <w:proofErr w:type="spellEnd"/>
-      <w:r>
-        <w:t xml:space="preserve"> is open-source software distributed under the MIT </w:t>
-      </w:r>
-      <w:proofErr w:type="spellStart"/>
-      <w:r>
-        <w:t>licence</w:t>
-      </w:r>
-      <w:proofErr w:type="spellEnd"/>
-      <w:r>
-        <w:t xml:space="preserve">, as are Starlette, </w:t>
-      </w:r>
-      <w:proofErr w:type="spellStart"/>
-      <w:r>
-        <w:t>Pydantic</w:t>
-      </w:r>
-      <w:proofErr w:type="spellEnd"/>
-      <w:r>
-        <w:t xml:space="preserve"> and </w:t>
-      </w:r>
-      <w:proofErr w:type="spellStart"/>
-      <w:r>
-        <w:t>Uvicorn</w:t>
-      </w:r>
-      <w:proofErr w:type="spellEnd"/>
-      <w:r>
-        <w:t xml:space="preserve">. There </w:t>
-      </w:r>
-      <w:proofErr w:type="gramStart"/>
-      <w:r>
-        <w:t>is</w:t>
-      </w:r>
-      <w:proofErr w:type="gramEnd"/>
-      <w:r>
-        <w:t xml:space="preserve"> no </w:t>
-      </w:r>
-      <w:proofErr w:type="spellStart"/>
-      <w:r>
-        <w:t>licence</w:t>
-      </w:r>
-      <w:proofErr w:type="spellEnd"/>
-      <w:r>
-        <w:t xml:space="preserve"> cost and no usage fee.</w:t>
+      <w:r>
+        <w:t>FastAPI is open-source software distributed under the MIT licence, as are Starlette, Pydantic and Uvicorn. There is no licence cost and no usage fee.</w:t>
       </w:r>
     </w:p>
     <w:p>
@@ -5307,15 +4932,7 @@
         <w:pStyle w:val="Body"/>
       </w:pPr>
       <w:r>
-        <w:t xml:space="preserve">As with the other candidates, the real expenditure is hosting, infrastructure and engineering effort rather than the framework itself. Two cost characteristics are specific to this option. Because validation, </w:t>
-      </w:r>
-      <w:proofErr w:type="spellStart"/>
-      <w:r>
-        <w:t>serialisation</w:t>
-      </w:r>
-      <w:proofErr w:type="spellEnd"/>
-      <w:r>
-        <w:t xml:space="preserve"> and interface documentation are core capabilities, they carry no integration or maintenance cost of their own. Against that, asynchronous code requires discipline: a blocking call placed on the event loop degrades the whole worker, so the team must use async-capable drivers throughout and hold that line in review.</w:t>
+        <w:t>As with the other candidates, the real expenditure is hosting, infrastructure and engineering effort rather than the framework itself. Two cost characteristics are specific to this option. Because validation, serialisation and interface documentation are core capabilities, they carry no integration or maintenance cost of their own. Against that, asynchronous code requires discipline: a blocking call placed on the event loop degrades the whole worker, so the team must use async-capable drivers throughout and hold that line in review.</w:t>
       </w:r>
     </w:p>
     <w:p>
@@ -5333,15 +4950,7 @@
         <w:pStyle w:val="Body"/>
       </w:pPr>
       <w:r>
-        <w:t xml:space="preserve">Django is a high-level, full-stack Python web framework built on the principle that common web application concerns should be solved once in the framework. It ships an object-relational mapper, a migration system, an authentication and permission model, an automatic administrative interface, a templating engine, forms, caching, </w:t>
-      </w:r>
-      <w:proofErr w:type="spellStart"/>
-      <w:r>
-        <w:t>internationalisation</w:t>
-      </w:r>
-      <w:proofErr w:type="spellEnd"/>
-      <w:r>
-        <w:t xml:space="preserve"> and a large security-hardening layer as a single integrated whole.</w:t>
+        <w:t>Django is a high-level, full-stack Python web framework built on the principle that common web application concerns should be solved once in the framework. It ships an object-relational mapper, a migration system, an authentication and permission model, an automatic administrative interface, a templating engine, forms, caching, internationalisation and a large security-hardening layer as a single integrated whole.</w:t>
       </w:r>
     </w:p>
     <w:p>
@@ -5349,15 +4958,7 @@
         <w:pStyle w:val="Body"/>
       </w:pPr>
       <w:r>
-        <w:t>That batteries-included design is a genuine strength where an application is database-</w:t>
-      </w:r>
-      <w:proofErr w:type="spellStart"/>
-      <w:r>
-        <w:t>centred</w:t>
-      </w:r>
-      <w:proofErr w:type="spellEnd"/>
-      <w:r>
-        <w:t xml:space="preserve"> and server-rendered, and where the admin interface and the ORM carry real weight. Django REST Framework extends it to API work, and Django 6.1 supports asynchronous views, middleware and ORM operations, so neither API delivery nor asynchronous execution is out of reach.</w:t>
+        <w:t>That batteries-included design is a genuine strength where an application is database-centred and server-rendered, and where the admin interface and the ORM carry real weight. Django REST Framework extends it to API work, and Django 6.1 supports asynchronous views, middleware and ORM operations, so neither API delivery nor asynchronous execution is out of reach.</w:t>
       </w:r>
     </w:p>
     <w:p>
@@ -5365,23 +4966,7 @@
         <w:pStyle w:val="Body"/>
       </w:pPr>
       <w:r>
-        <w:t xml:space="preserve">The reservations for </w:t>
-      </w:r>
-      <w:proofErr w:type="spellStart"/>
-      <w:r>
-        <w:t>eClaims</w:t>
-      </w:r>
-      <w:proofErr w:type="spellEnd"/>
-      <w:r>
-        <w:t xml:space="preserve"> are structural rather than qualitative. Django is designed around a single project with pluggable applications sharing one settings module, one ORM and one migration history; a fleet of small, independently deployable services runs against that grain, carrying the full framework and its assumptions into every container. Its asynchronous support, while real, is a layer over a synchronous core rather than the native model, and its API documentation and validation come from Django REST Framework and its </w:t>
-      </w:r>
-      <w:proofErr w:type="spellStart"/>
-      <w:r>
-        <w:t>serialisers</w:t>
-      </w:r>
-      <w:proofErr w:type="spellEnd"/>
-      <w:r>
-        <w:t xml:space="preserve"> rather than from the framework itself.</w:t>
+        <w:t>The reservations for eClaims are structural rather than qualitative. Django is designed around a single project with pluggable applications sharing one settings module, one ORM and one migration history; a fleet of small, independently deployable services runs against that grain, carrying the full framework and its assumptions into every container. Its asynchronous support, while real, is a layer over a synchronous core rather than the native model, and its API documentation and validation come from Django REST Framework and its serialisers rather than from the framework itself.</w:t>
       </w:r>
     </w:p>
     <w:p>
@@ -5409,15 +4994,7 @@
         <w:t>Full-featured framework</w:t>
       </w:r>
       <w:r>
-        <w:t xml:space="preserve"> — ORM, migrations, auth, admin, forms, templating, </w:t>
-      </w:r>
-      <w:proofErr w:type="gramStart"/>
-      <w:r>
-        <w:t>caching</w:t>
-      </w:r>
-      <w:proofErr w:type="gramEnd"/>
-      <w:r>
-        <w:t xml:space="preserve"> and security in one integrated package.</w:t>
+        <w:t xml:space="preserve"> — ORM, migrations, auth, admin, forms, templating, caching and security in one integrated package.</w:t>
       </w:r>
     </w:p>
     <w:p>
@@ -5432,7 +5009,6 @@
         <w:rPr>
           <w:b/>
         </w:rPr>
-        <w:lastRenderedPageBreak/>
         <w:t>ORM and database abstraction</w:t>
       </w:r>
       <w:r>
@@ -5472,15 +5048,7 @@
         <w:t>Security hardening by default</w:t>
       </w:r>
       <w:r>
-        <w:t xml:space="preserve"> — CSRF, XSS and SQL injection protections, secure password hashing and clickjacking </w:t>
-      </w:r>
-      <w:proofErr w:type="spellStart"/>
-      <w:r>
-        <w:t>defence</w:t>
-      </w:r>
-      <w:proofErr w:type="spellEnd"/>
-      <w:r>
-        <w:t xml:space="preserve"> enabled out of the box.</w:t>
+        <w:t xml:space="preserve"> — CSRF, XSS and SQL injection protections, secure password hashing and clickjacking defence enabled out of the box.</w:t>
       </w:r>
     </w:p>
     <w:p>
@@ -5513,6 +5081,7 @@
         <w:rPr>
           <w:b/>
         </w:rPr>
+        <w:lastRenderedPageBreak/>
         <w:t>URL routing, views and templating</w:t>
       </w:r>
       <w:r>
@@ -5588,31 +5157,7 @@
         <w:pStyle w:val="Body"/>
       </w:pPr>
       <w:r>
-        <w:t xml:space="preserve">Django is open-source software distributed under the BSD </w:t>
-      </w:r>
-      <w:proofErr w:type="spellStart"/>
-      <w:r>
-        <w:t>licence</w:t>
-      </w:r>
-      <w:proofErr w:type="spellEnd"/>
-      <w:r>
-        <w:t xml:space="preserve">, as is Django REST Framework. There </w:t>
-      </w:r>
-      <w:proofErr w:type="gramStart"/>
-      <w:r>
-        <w:t>is</w:t>
-      </w:r>
-      <w:proofErr w:type="gramEnd"/>
-      <w:r>
-        <w:t xml:space="preserve"> no </w:t>
-      </w:r>
-      <w:proofErr w:type="spellStart"/>
-      <w:r>
-        <w:t>licence</w:t>
-      </w:r>
-      <w:proofErr w:type="spellEnd"/>
-      <w:r>
-        <w:t xml:space="preserve"> cost and no usage fee.</w:t>
+        <w:t>Django is open-source software distributed under the BSD licence, as is Django REST Framework. There is no licence cost and no usage fee.</w:t>
       </w:r>
     </w:p>
     <w:p>
@@ -5625,10 +5170,71 @@
     </w:p>
     <w:p>
       <w:pPr>
+        <w:pStyle w:val="Body"/>
+      </w:pPr>
+    </w:p>
+    <w:p>
+      <w:pPr>
+        <w:pStyle w:val="Body"/>
+      </w:pPr>
+    </w:p>
+    <w:p>
+      <w:pPr>
+        <w:pStyle w:val="Body"/>
+      </w:pPr>
+    </w:p>
+    <w:p>
+      <w:pPr>
+        <w:pStyle w:val="Body"/>
+      </w:pPr>
+    </w:p>
+    <w:p>
+      <w:pPr>
+        <w:pStyle w:val="Body"/>
+      </w:pPr>
+    </w:p>
+    <w:p>
+      <w:pPr>
+        <w:pStyle w:val="Body"/>
+      </w:pPr>
+    </w:p>
+    <w:p>
+      <w:pPr>
+        <w:pStyle w:val="Body"/>
+      </w:pPr>
+    </w:p>
+    <w:p>
+      <w:pPr>
+        <w:pStyle w:val="Body"/>
+      </w:pPr>
+    </w:p>
+    <w:p>
+      <w:pPr>
+        <w:pStyle w:val="Body"/>
+      </w:pPr>
+    </w:p>
+    <w:p>
+      <w:pPr>
+        <w:pStyle w:val="Body"/>
+      </w:pPr>
+    </w:p>
+    <w:p>
+      <w:pPr>
+        <w:pStyle w:val="Body"/>
+      </w:pPr>
+    </w:p>
+    <w:p>
+      <w:pPr>
+        <w:pStyle w:val="Body"/>
+      </w:pPr>
+    </w:p>
+    <w:p>
+      <w:pPr>
         <w:pStyle w:val="Heading1"/>
       </w:pPr>
       <w:bookmarkStart w:id="15" w:name="_Toc238143533"/>
       <w:r>
+        <w:lastRenderedPageBreak/>
         <w:t>Comparison Analysis</w:t>
       </w:r>
       <w:bookmarkEnd w:id="15"/>
@@ -5638,23 +5244,7 @@
         <w:pStyle w:val="Body"/>
       </w:pPr>
       <w:r>
-        <w:t xml:space="preserve">All three candidates can implement the </w:t>
-      </w:r>
-      <w:proofErr w:type="spellStart"/>
-      <w:r>
-        <w:t>eClaims</w:t>
-      </w:r>
-      <w:proofErr w:type="spellEnd"/>
-      <w:r>
-        <w:t xml:space="preserve"> services. The comparison is therefore not about capability in the abstract but about fit: how much of what </w:t>
-      </w:r>
-      <w:proofErr w:type="spellStart"/>
-      <w:r>
-        <w:t>eClaims</w:t>
-      </w:r>
-      <w:proofErr w:type="spellEnd"/>
-      <w:r>
-        <w:t xml:space="preserve"> requires each framework supplies natively, and how much the team would have to assemble and then maintain.</w:t>
+        <w:t>All three candidates can implement the eClaims services. The comparison is therefore not about capability in the abstract but about fit: how much of what eClaims requires each framework supplies natively, and how much the team would have to assemble and then maintain.</w:t>
       </w:r>
     </w:p>
     <w:p>
@@ -5662,15 +5252,7 @@
         <w:pStyle w:val="Body"/>
       </w:pPr>
       <w:r>
-        <w:t xml:space="preserve">The analysis proceeds in three steps. Section 4.1 fixes the evaluation attributes and their </w:t>
-      </w:r>
-      <w:proofErr w:type="gramStart"/>
-      <w:r>
-        <w:t>weights,</w:t>
-      </w:r>
-      <w:proofErr w:type="gramEnd"/>
-      <w:r>
-        <w:t xml:space="preserve"> each traced to a requirement from Section 2. Section 4.2 scores the three options against those attributes. Section 4.3 records native capability separately, because a weighted average cannot distinguish a capability that is absent but buildable from one that is present but awkward.</w:t>
+        <w:t>The analysis proceeds in three steps. Section 4.1 fixes the evaluation attributes and their weights, each traced to a requirement from Section 2. Section 4.2 scores the three options against those attributes. Section 4.3 records native capability separately, because a weighted average cannot distinguish a capability that is absent but buildable from one that is present but awkward.</w:t>
       </w:r>
     </w:p>
     <w:p>
@@ -5688,11 +5270,7 @@
         <w:pStyle w:val="Body"/>
       </w:pPr>
       <w:r>
-        <w:t xml:space="preserve">Ten attributes discriminate between the candidates. Each is traced below to the requirement that justifies it, and the weights were fixed before scoring. Weight 5 marks an attribute whose absence would put a stated non-functional requirement at risk; weight 4 an attribute that a stated </w:t>
-      </w:r>
-      <w:r>
-        <w:lastRenderedPageBreak/>
-        <w:t>functional requirement depends on; weight 3 an attribute that affects cost of ownership rather than compliance with a requirement.</w:t>
+        <w:t>Ten attributes discriminate between the candidates. Each is traced below to the requirement that justifies it, and the weights were fixed before scoring. Weight 5 marks an attribute whose absence would put a stated non-functional requirement at risk; weight 4 an attribute that a stated functional requirement depends on; weight 3 an attribute that affects cost of ownership rather than compliance with a requirement.</w:t>
       </w:r>
     </w:p>
     <w:tbl>
@@ -5846,15 +5424,7 @@
               <w:pStyle w:val="NoSpacing"/>
             </w:pPr>
             <w:r>
-              <w:t xml:space="preserve">99% of requests under 5,000 </w:t>
-            </w:r>
-            <w:proofErr w:type="spellStart"/>
-            <w:r>
-              <w:t>ms</w:t>
-            </w:r>
-            <w:proofErr w:type="spellEnd"/>
-            <w:r>
-              <w:t>; event-driven claim flows</w:t>
+              <w:t>99% of requests under 5,000 ms; event-driven claim flows</w:t>
             </w:r>
           </w:p>
         </w:tc>
@@ -5940,15 +5510,7 @@
               <w:pStyle w:val="NoSpacing"/>
             </w:pPr>
             <w:r>
-              <w:t>Automatic API documentation (</w:t>
-            </w:r>
-            <w:proofErr w:type="spellStart"/>
-            <w:r>
-              <w:t>OpenAPI</w:t>
-            </w:r>
-            <w:proofErr w:type="spellEnd"/>
-            <w:r>
-              <w:t>)</w:t>
+              <w:t>Automatic API documentation (OpenAPI)</w:t>
             </w:r>
           </w:p>
         </w:tc>
@@ -6196,15 +5758,7 @@
               <w:pStyle w:val="NoSpacing"/>
             </w:pPr>
             <w:r>
-              <w:t>Deployment (</w:t>
-            </w:r>
-            <w:proofErr w:type="spellStart"/>
-            <w:r>
-              <w:t>containerised</w:t>
-            </w:r>
-            <w:proofErr w:type="spellEnd"/>
-            <w:r>
-              <w:t>)</w:t>
+              <w:t>Deployment (containerised)</w:t>
             </w:r>
           </w:p>
         </w:tc>
@@ -6242,7 +5796,7 @@
               <w:pStyle w:val="NoSpacing"/>
             </w:pPr>
             <w:r>
-              <w:t xml:space="preserve">Services ship as containers on ECS Fargate; the ASGI or WSGI server runs inside each image</w:t>
+              <w:t>Services ship as containers on ECS Fargate; the ASGI or WSGI server runs inside each image</w:t>
             </w:r>
           </w:p>
         </w:tc>
@@ -6509,7 +6063,7 @@
         <w:pStyle w:val="Body"/>
       </w:pPr>
       <w:r>
-        <w:t xml:space="preserve">The attribute set is deliberately not one-sided: ecosystem and community maturity is included although it counts against FastAPI. Section 8.2 sets out the weighting rationale and a sensitivity check.</w:t>
+        <w:t>The attribute set is deliberately not one-sided: ecosystem and community maturity is included although it counts against FastAPI. Section 8.2 sets out the weighting rationale and a sensitivity check.</w:t>
       </w:r>
     </w:p>
     <w:p>
@@ -6518,6 +6072,7 @@
       </w:pPr>
       <w:bookmarkStart w:id="17" w:name="_Toc238143535"/>
       <w:r>
+        <w:lastRenderedPageBreak/>
         <w:t>Comparison 1 — Weighted Scoring</w:t>
       </w:r>
       <w:bookmarkEnd w:id="17"/>
@@ -6527,23 +6082,7 @@
         <w:pStyle w:val="Body"/>
       </w:pPr>
       <w:r>
-        <w:t xml:space="preserve">Scoring legend: 5 = excellent, 4 = strong, 3 = adequate, 2 = limited, 1 = minimal. Scores reflect native capability relative to the </w:t>
-      </w:r>
-      <w:proofErr w:type="spellStart"/>
-      <w:r>
-        <w:t>eClaims</w:t>
-      </w:r>
-      <w:proofErr w:type="spellEnd"/>
-      <w:r>
-        <w:t xml:space="preserve"> requirement, not absolute product quality. For the complexity attribute a score of 5 denotes </w:t>
-      </w:r>
-      <w:proofErr w:type="gramStart"/>
-      <w:r>
-        <w:t>the</w:t>
-      </w:r>
-      <w:proofErr w:type="gramEnd"/>
-      <w:r>
-        <w:t xml:space="preserve"> simplest option.</w:t>
+        <w:t>Scoring legend: 5 = excellent, 4 = strong, 3 = adequate, 2 = limited, 1 = minimal. Scores reflect native capability relative to the eClaims requirement, not absolute product quality. For the complexity attribute a score of 5 denotes the simplest option.</w:t>
       </w:r>
     </w:p>
     <w:tbl>
@@ -6656,19 +6195,11 @@
             <w:pPr>
               <w:pStyle w:val="NoSpacing"/>
             </w:pPr>
-            <w:proofErr w:type="spellStart"/>
             <w:r>
               <w:rPr>
                 <w:b/>
               </w:rPr>
-              <w:t>FastAPI</w:t>
-            </w:r>
-            <w:proofErr w:type="spellEnd"/>
-            <w:r>
-              <w:rPr>
-                <w:b/>
-              </w:rPr>
-              <w:t xml:space="preserve"> (0.142) </w:t>
+              <w:t xml:space="preserve">FastAPI (0.142) </w:t>
             </w:r>
             <w:r>
               <w:rPr>
@@ -6925,15 +6456,7 @@
               <w:pStyle w:val="NoSpacing"/>
             </w:pPr>
             <w:r>
-              <w:t>Automatic API documentation (</w:t>
-            </w:r>
-            <w:proofErr w:type="spellStart"/>
-            <w:r>
-              <w:t>OpenAPI</w:t>
-            </w:r>
-            <w:proofErr w:type="spellEnd"/>
-            <w:r>
-              <w:t>)</w:t>
+              <w:t>Automatic API documentation (OpenAPI)</w:t>
             </w:r>
           </w:p>
         </w:tc>
@@ -7333,15 +6856,7 @@
               <w:pStyle w:val="NoSpacing"/>
             </w:pPr>
             <w:r>
-              <w:t>Deployment (</w:t>
-            </w:r>
-            <w:proofErr w:type="spellStart"/>
-            <w:r>
-              <w:t>containerised</w:t>
-            </w:r>
-            <w:proofErr w:type="spellEnd"/>
-            <w:r>
-              <w:t>)</w:t>
+              <w:t>Deployment (containerised)</w:t>
             </w:r>
           </w:p>
         </w:tc>
@@ -7441,7 +6956,6 @@
               <w:pStyle w:val="NoSpacing"/>
             </w:pPr>
             <w:r>
-              <w:lastRenderedPageBreak/>
               <w:t>Complexity / learning curve (5 = simplest)</w:t>
             </w:r>
           </w:p>
@@ -7848,29 +7362,8 @@
       <w:pPr>
         <w:pStyle w:val="Body"/>
       </w:pPr>
-      <w:proofErr w:type="spellStart"/>
-      <w:r>
-        <w:t>FastAPI</w:t>
-      </w:r>
-      <w:proofErr w:type="spellEnd"/>
-      <w:r>
-        <w:t xml:space="preserve"> leads at 4.78, ahead of Flask at 3.83 and Django at 3.38. The margin comes from four attributes and is concentrated rather than diffuse: asynchronous support, performance under load, automatic interface documentation and request validation. Those are precisely the four that an API-first platform serving three portals under a 5,000 </w:t>
-      </w:r>
-      <w:proofErr w:type="spellStart"/>
-      <w:r>
-        <w:t>ms</w:t>
-      </w:r>
-      <w:proofErr w:type="spellEnd"/>
-      <w:r>
-        <w:t xml:space="preserve"> latency ceiling depends on, and they carry 18 of the 40 available </w:t>
-      </w:r>
-      <w:proofErr w:type="gramStart"/>
-      <w:r>
-        <w:t>weight</w:t>
-      </w:r>
-      <w:proofErr w:type="gramEnd"/>
-      <w:r>
-        <w:t xml:space="preserve"> between them.</w:t>
+      <w:r>
+        <w:t>FastAPI leads at 4.78, ahead of Flask at 3.83 and Django at 3.38. The margin comes from four attributes and is concentrated rather than diffuse: asynchronous support, performance under load, automatic interface documentation and request validation. Those are precisely the four that an API-first platform serving three portals under a 5,000 ms latency ceiling depends on, and they carry 18 of the 40 available weight between them.</w:t>
       </w:r>
     </w:p>
     <w:p>
@@ -7878,79 +7371,7 @@
         <w:pStyle w:val="Body"/>
       </w:pPr>
       <w:r>
-        <w:t xml:space="preserve">The result is not one-sided, and the losses matter. Flask beats </w:t>
-      </w:r>
-      <w:proofErr w:type="spellStart"/>
-      <w:r>
-        <w:t>FastAPI</w:t>
-      </w:r>
-      <w:proofErr w:type="spellEnd"/>
-      <w:r>
-        <w:t xml:space="preserve"> outright on extensibility, where its extension catalogue is deeper and longer established, and Flask and Django both beat it on ecosystem and community maturity. </w:t>
-      </w:r>
-      <w:proofErr w:type="spellStart"/>
-      <w:r>
-        <w:t>FastAPI</w:t>
-      </w:r>
-      <w:proofErr w:type="spellEnd"/>
-      <w:r>
-        <w:t xml:space="preserve"> only </w:t>
-      </w:r>
-      <w:proofErr w:type="gramStart"/>
-      <w:r>
-        <w:t>ties on</w:t>
-      </w:r>
-      <w:proofErr w:type="gramEnd"/>
-      <w:r>
-        <w:t xml:space="preserve"> microservices fit</w:t>
-      </w:r>
-      <w:proofErr w:type="gramStart"/>
-      <w:r>
-        <w:t>, on</w:t>
-      </w:r>
-      <w:proofErr w:type="gramEnd"/>
-      <w:r>
-        <w:t xml:space="preserve"> </w:t>
-      </w:r>
-      <w:proofErr w:type="spellStart"/>
-      <w:r>
-        <w:t>containerised</w:t>
-      </w:r>
-      <w:proofErr w:type="spellEnd"/>
-      <w:r>
-        <w:t xml:space="preserve"> deployment</w:t>
-      </w:r>
-      <w:proofErr w:type="gramStart"/>
-      <w:r>
-        <w:t>, on</w:t>
-      </w:r>
-      <w:proofErr w:type="gramEnd"/>
-      <w:r>
-        <w:t xml:space="preserve"> scaling </w:t>
-      </w:r>
-      <w:proofErr w:type="gramStart"/>
-      <w:r>
-        <w:t>and on complexity —</w:t>
-      </w:r>
-      <w:proofErr w:type="gramEnd"/>
-      <w:r>
-        <w:t xml:space="preserve"> </w:t>
-      </w:r>
-      <w:proofErr w:type="gramStart"/>
-      <w:r>
-        <w:t>it</w:t>
-      </w:r>
-      <w:proofErr w:type="gramEnd"/>
-      <w:r>
-        <w:t xml:space="preserve"> wins none of those. Django’s 3.38 reflects structural mismatch with a microservices fleet rather than any functional shortfall: it scores highest of the three on nothing that </w:t>
-      </w:r>
-      <w:proofErr w:type="spellStart"/>
-      <w:r>
-        <w:t>eClaims</w:t>
-      </w:r>
-      <w:proofErr w:type="spellEnd"/>
-      <w:r>
-        <w:t xml:space="preserve"> weights at 5, while carrying the largest footprint into every container.</w:t>
+        <w:t>The result is not one-sided, and the losses matter. Flask beats FastAPI outright on extensibility, where its extension catalogue is deeper and longer established, and Flask and Django both beat it on ecosystem and community maturity. FastAPI only ties on microservices fit, on containerised deployment, on scaling and on complexity — it wins none of those. Django’s 3.38 reflects structural mismatch with a microservices fleet rather than any functional shortfall: it scores highest of the three on nothing that eClaims weights at 5, while carrying the largest footprint into every container.</w:t>
       </w:r>
     </w:p>
     <w:p>
@@ -7958,7 +7379,7 @@
         <w:pStyle w:val="Body"/>
       </w:pPr>
       <w:r>
-        <w:t xml:space="preserve">One row deserves explicit comment. Deployment is scored 5 for all three options, although FastAPI requires an ASGI-compatible server while Flask and Django can also be deployed to any WSGI host. That distinction does not affect how eClaims ships: every service is built as a container image and started by its own server inside it — Uvicorn in the case of FastAPI — so the container is the deployment unit, and the WSGI-versus-ASGI distinction costs nothing on a serverless-container platform.</w:t>
+        <w:t>One row deserves explicit comment. Deployment is scored 5 for all three options, although FastAPI requires an ASGI-compatible server while Flask and Django can also be deployed to any WSGI host. That distinction does not affect how eClaims ships: every service is built as a container image and started by its own server inside it — Uvicorn in the case of FastAPI — so the container is the deployment unit, and the WSGI-versus-ASGI distinction costs nothing on a serverless-container platform.</w:t>
       </w:r>
     </w:p>
     <w:p>
@@ -8023,6 +7444,7 @@
               <w:rPr>
                 <w:b/>
               </w:rPr>
+              <w:lastRenderedPageBreak/>
               <w:t>Key Capability</w:t>
             </w:r>
           </w:p>
@@ -8065,14 +7487,12 @@
             <w:pPr>
               <w:pStyle w:val="NoSpacing"/>
             </w:pPr>
-            <w:proofErr w:type="spellStart"/>
             <w:r>
               <w:rPr>
                 <w:b/>
               </w:rPr>
               <w:t>FastAPI</w:t>
             </w:r>
-            <w:proofErr w:type="spellEnd"/>
             <w:r>
               <w:rPr>
                 <w:b/>
@@ -8377,7 +7797,6 @@
               <w:pStyle w:val="NoSpacing"/>
             </w:pPr>
             <w:r>
-              <w:lastRenderedPageBreak/>
               <w:t>Request validation</w:t>
             </w:r>
           </w:p>
@@ -8397,13 +7816,8 @@
               <w:pStyle w:val="NoSpacing"/>
             </w:pPr>
             <w:r>
-              <w:t xml:space="preserve">No — via Marshmallow or </w:t>
-            </w:r>
-            <w:proofErr w:type="spellStart"/>
-            <w:r>
-              <w:t>Pydantic</w:t>
-            </w:r>
-            <w:proofErr w:type="spellEnd"/>
+              <w:t>No — via Marshmallow or Pydantic</w:t>
+            </w:r>
           </w:p>
         </w:tc>
         <w:tc>
@@ -8421,15 +7835,7 @@
               <w:pStyle w:val="NoSpacing"/>
             </w:pPr>
             <w:r>
-              <w:t xml:space="preserve">Native — </w:t>
-            </w:r>
-            <w:proofErr w:type="spellStart"/>
-            <w:r>
-              <w:t>Pydantic</w:t>
-            </w:r>
-            <w:proofErr w:type="spellEnd"/>
-            <w:r>
-              <w:t xml:space="preserve"> models</w:t>
+              <w:t>Native — Pydantic models</w:t>
             </w:r>
           </w:p>
         </w:tc>
@@ -8448,13 +7854,8 @@
               <w:pStyle w:val="NoSpacing"/>
             </w:pPr>
             <w:r>
-              <w:t xml:space="preserve">Partial — DRF </w:t>
-            </w:r>
-            <w:proofErr w:type="spellStart"/>
-            <w:r>
-              <w:t>serialisers</w:t>
-            </w:r>
-            <w:proofErr w:type="spellEnd"/>
+              <w:t>Partial — DRF serialisers</w:t>
+            </w:r>
           </w:p>
         </w:tc>
       </w:tr>
@@ -8476,13 +7877,8 @@
             <w:pPr>
               <w:pStyle w:val="NoSpacing"/>
             </w:pPr>
-            <w:proofErr w:type="spellStart"/>
-            <w:r>
-              <w:t>OpenAPI</w:t>
-            </w:r>
-            <w:proofErr w:type="spellEnd"/>
-            <w:r>
-              <w:t xml:space="preserve"> schema generation</w:t>
+            <w:r>
+              <w:t>OpenAPI schema generation</w:t>
             </w:r>
           </w:p>
         </w:tc>
@@ -8501,21 +7897,8 @@
               <w:pStyle w:val="NoSpacing"/>
             </w:pPr>
             <w:r>
-              <w:t>No — via Flask-</w:t>
-            </w:r>
-            <w:proofErr w:type="spellStart"/>
-            <w:r>
-              <w:t>Smorest</w:t>
-            </w:r>
-            <w:proofErr w:type="spellEnd"/>
-            <w:r>
-              <w:t xml:space="preserve"> or </w:t>
-            </w:r>
-            <w:proofErr w:type="spellStart"/>
-            <w:r>
-              <w:t>APISpec</w:t>
-            </w:r>
-            <w:proofErr w:type="spellEnd"/>
+              <w:t>No — via Flask-Smorest or APISpec</w:t>
+            </w:r>
           </w:p>
         </w:tc>
         <w:tc>
@@ -8533,15 +7916,7 @@
               <w:pStyle w:val="NoSpacing"/>
             </w:pPr>
             <w:r>
-              <w:t xml:space="preserve">Native — </w:t>
-            </w:r>
-            <w:proofErr w:type="spellStart"/>
-            <w:r>
-              <w:t>OpenAPI</w:t>
-            </w:r>
-            <w:proofErr w:type="spellEnd"/>
-            <w:r>
-              <w:t xml:space="preserve"> 3 from type hints</w:t>
+              <w:t>Native — OpenAPI 3 from type hints</w:t>
             </w:r>
           </w:p>
         </w:tc>
@@ -8560,15 +7935,7 @@
               <w:pStyle w:val="NoSpacing"/>
             </w:pPr>
             <w:r>
-              <w:t xml:space="preserve">Partial — via DRF and </w:t>
-            </w:r>
-            <w:proofErr w:type="spellStart"/>
-            <w:r>
-              <w:t>drf</w:t>
-            </w:r>
-            <w:proofErr w:type="spellEnd"/>
-            <w:r>
-              <w:t>-spectacular</w:t>
+              <w:t>Partial — via DRF and drf-spectacular</w:t>
             </w:r>
           </w:p>
         </w:tc>
@@ -8630,13 +7997,8 @@
               <w:pStyle w:val="NoSpacing"/>
             </w:pPr>
             <w:r>
-              <w:t xml:space="preserve">Native — Swagger UI and </w:t>
-            </w:r>
-            <w:proofErr w:type="spellStart"/>
-            <w:r>
-              <w:t>ReDoc</w:t>
-            </w:r>
-            <w:proofErr w:type="spellEnd"/>
+              <w:t>Native — Swagger UI and ReDoc</w:t>
+            </w:r>
           </w:p>
         </w:tc>
         <w:tc>
@@ -8735,13 +8097,8 @@
               <w:pStyle w:val="NoSpacing"/>
             </w:pPr>
             <w:r>
-              <w:t xml:space="preserve">No — middleware and </w:t>
-            </w:r>
-            <w:proofErr w:type="spellStart"/>
-            <w:r>
-              <w:t>mixins</w:t>
-            </w:r>
-            <w:proofErr w:type="spellEnd"/>
+              <w:t>No — middleware and mixins</w:t>
+            </w:r>
           </w:p>
         </w:tc>
       </w:tr>
@@ -8783,15 +8140,7 @@
               <w:pStyle w:val="NoSpacing"/>
             </w:pPr>
             <w:r>
-              <w:t xml:space="preserve">No — </w:t>
-            </w:r>
-            <w:proofErr w:type="spellStart"/>
-            <w:r>
-              <w:t>SQLAlchemy</w:t>
-            </w:r>
-            <w:proofErr w:type="spellEnd"/>
-            <w:r>
-              <w:t xml:space="preserve"> and Alembic</w:t>
+              <w:t>No — SQLAlchemy and Alembic</w:t>
             </w:r>
           </w:p>
         </w:tc>
@@ -8810,15 +8159,7 @@
               <w:pStyle w:val="NoSpacing"/>
             </w:pPr>
             <w:r>
-              <w:t xml:space="preserve">No — </w:t>
-            </w:r>
-            <w:proofErr w:type="spellStart"/>
-            <w:r>
-              <w:t>SQLAlchemy</w:t>
-            </w:r>
-            <w:proofErr w:type="spellEnd"/>
-            <w:r>
-              <w:t xml:space="preserve"> and Alembic</w:t>
+              <w:t>No — SQLAlchemy and Alembic</w:t>
             </w:r>
           </w:p>
         </w:tc>
@@ -9427,13 +8768,8 @@
             <w:pPr>
               <w:pStyle w:val="NoSpacing"/>
             </w:pPr>
-            <w:proofErr w:type="spellStart"/>
-            <w:r>
-              <w:t>Licence</w:t>
-            </w:r>
-            <w:proofErr w:type="spellEnd"/>
-            <w:r>
-              <w:t xml:space="preserve"> cost</w:t>
+            <w:r>
+              <w:t>Licence cost</w:t>
             </w:r>
           </w:p>
         </w:tc>
@@ -9506,55 +8842,7 @@
         <w:pStyle w:val="Body"/>
       </w:pPr>
       <w:r>
-        <w:t xml:space="preserve">Read down the </w:t>
-      </w:r>
-      <w:proofErr w:type="spellStart"/>
-      <w:r>
-        <w:t>FastAPI</w:t>
-      </w:r>
-      <w:proofErr w:type="spellEnd"/>
-      <w:r>
-        <w:t xml:space="preserve"> column, four rows are the decision: native asynchronous I/O, native request validation, native </w:t>
-      </w:r>
-      <w:proofErr w:type="spellStart"/>
-      <w:r>
-        <w:t>OpenAPI</w:t>
-      </w:r>
-      <w:proofErr w:type="spellEnd"/>
-      <w:r>
-        <w:t xml:space="preserve"> schema generation and native interactive documentation. On Flask all four are extensions the team selects, integrates and maintains; on Django three of the four come through Django REST Framework. Read across, the rows where </w:t>
-      </w:r>
-      <w:proofErr w:type="spellStart"/>
-      <w:r>
-        <w:t>FastAPI</w:t>
-      </w:r>
-      <w:proofErr w:type="spellEnd"/>
-      <w:r>
-        <w:t xml:space="preserve"> is weakest — no ORM, no admin, no server-side rendering, a shallower extension catalogue — are either irrelevant to </w:t>
-      </w:r>
-      <w:proofErr w:type="spellStart"/>
-      <w:r>
-        <w:t>eClaims</w:t>
-      </w:r>
-      <w:proofErr w:type="spellEnd"/>
-      <w:r>
-        <w:t xml:space="preserve"> or already answered by the SAD, which selects </w:t>
-      </w:r>
-      <w:proofErr w:type="spellStart"/>
-      <w:r>
-        <w:t>SQLAlchemy</w:t>
-      </w:r>
-      <w:proofErr w:type="spellEnd"/>
-      <w:r>
-        <w:t xml:space="preserve"> with Alembic for data access and React for every user interface. Django’s two unique strengths, the ORM and the admin interface, are therefore capabilities </w:t>
-      </w:r>
-      <w:proofErr w:type="spellStart"/>
-      <w:r>
-        <w:t>eClaims</w:t>
-      </w:r>
-      <w:proofErr w:type="spellEnd"/>
-      <w:r>
-        <w:t xml:space="preserve"> has already decided not to use.</w:t>
+        <w:t>Read down the FastAPI column, four rows are the decision: native asynchronous I/O, native request validation, native OpenAPI schema generation and native interactive documentation. On Flask all four are extensions the team selects, integrates and maintains; on Django three of the four come through Django REST Framework. Read across, the rows where FastAPI is weakest — no ORM, no admin, no server-side rendering, a shallower extension catalogue — are either irrelevant to eClaims or already answered by the SAD, which selects SQLAlchemy with Alembic for data access and React for every user interface. Django’s two unique strengths, the ORM and the admin interface, are therefore capabilities eClaims has already decided not to use.</w:t>
       </w:r>
     </w:p>
     <w:p>
@@ -9563,6 +8851,7 @@
       </w:pPr>
       <w:bookmarkStart w:id="19" w:name="_Toc238143537"/>
       <w:r>
+        <w:lastRenderedPageBreak/>
         <w:t>Recommendation</w:t>
       </w:r>
       <w:bookmarkEnd w:id="19"/>
@@ -9572,47 +8861,7 @@
         <w:pStyle w:val="Recommend"/>
       </w:pPr>
       <w:r>
-        <w:t xml:space="preserve">Python </w:t>
-      </w:r>
-      <w:proofErr w:type="spellStart"/>
-      <w:r>
-        <w:t>FastAPI</w:t>
-      </w:r>
-      <w:proofErr w:type="spellEnd"/>
-      <w:r>
-        <w:t xml:space="preserve"> (0.142) on </w:t>
-      </w:r>
-      <w:proofErr w:type="spellStart"/>
-      <w:r>
-        <w:t>Uvicorn</w:t>
-      </w:r>
-      <w:proofErr w:type="spellEnd"/>
-      <w:r>
-        <w:t xml:space="preserve"> is recommended as the backend web framework for all </w:t>
-      </w:r>
-      <w:proofErr w:type="spellStart"/>
-      <w:r>
-        <w:t>eClaims</w:t>
-      </w:r>
-      <w:proofErr w:type="spellEnd"/>
-      <w:r>
-        <w:t xml:space="preserve"> microservices, with </w:t>
-      </w:r>
-      <w:proofErr w:type="spellStart"/>
-      <w:r>
-        <w:t>Pydantic</w:t>
-      </w:r>
-      <w:proofErr w:type="spellEnd"/>
-      <w:r>
-        <w:t xml:space="preserve"> models as the request and response contract and the generated </w:t>
-      </w:r>
-      <w:proofErr w:type="spellStart"/>
-      <w:r>
-        <w:t>OpenAPI</w:t>
-      </w:r>
-      <w:proofErr w:type="spellEnd"/>
-      <w:r>
-        <w:t xml:space="preserve"> schema as the published interface specification for the three portals and for partner integration.</w:t>
+        <w:t>Python FastAPI (0.142) on Uvicorn is recommended as the backend web framework for all eClaims microservices, with Pydantic models as the request and response contract and the generated OpenAPI schema as the published interface specification for the three portals and for partner integration.</w:t>
       </w:r>
     </w:p>
     <w:p>
@@ -9620,40 +8869,40 @@
         <w:pStyle w:val="Body"/>
       </w:pPr>
       <w:r>
+        <w:t>The recommendation follows the analysis in Section 4. FastAPI scores highest at 4.78 out of 5, and it is strongest on precisely the attributes that carry the most weight. Its asynchronous request model suits a workload that is dominated by waiting on PostgreSQL, Redis, S3 and external providers, which is what protects the 99% under 5,000 ms performance target and what allows a container to sustain high concurrency without a worker per in-flight request. Its Pydantic-based validation answers the claim-payload integrity requirement at the API boundary rather than in hand-written checks inside each handler. And its generated OpenAPI schema answers the well-defined interface standards requirement as a property of the code, so the contract the three portals build against cannot drift from the implementation that serves it.</w:t>
+      </w:r>
+    </w:p>
+    <w:p>
+      <w:pPr>
+        <w:pStyle w:val="Body"/>
+      </w:pPr>
+      <w:r>
+        <w:t>Two further considerations support the choice without being scored. FastAPI’s dependency-injection system is the natural place for the eClaims RBAC model: a role requirement is declared per endpoint as a dependency, enforced uniformly, and overridden in tests, which is materially cleaner than decorator chains applied by hand. And the framework is already proven in this codebase — the proof of concept runs FastAPI with Uvicorn in both services, currently pinned at 0.111 pending the upgrade tracked under risk R3 — so the recommendation carries implementation evidence and not only analysis.</w:t>
+      </w:r>
+    </w:p>
+    <w:p>
+      <w:pPr>
+        <w:pStyle w:val="Body"/>
+      </w:pPr>
+      <w:r>
+        <w:t>The recommendation is made with its weaknesses on the record. Asynchronous code is less forgiving: a single blocking call on the event loop degrades an entire worker, so async-capable drivers must be used throughout and enforced in review, and the team needs a working understanding of the async model before it needs one of FastAPI. The extension ecosystem is shallower than Flask’s and much shallower than Django’s, so some capability that would be a package elsewhere will be written here. FastAPI is still below a 1.0 version number and continues to make breaking changes within the 0.x series — at 0.112, 0.127, 0.129 and 0.132 among others — which places a real obligation on dependency pinning and upgrade testing, recorded as risk R2. And nothing in FastAPI supplies an ORM, migrations or an administrative interface; eClaims obtains those from SQLAlchemy, Alembic and the Internal Portal respectively.</w:t>
+      </w:r>
+    </w:p>
+    <w:p>
+      <w:pPr>
+        <w:pStyle w:val="Body"/>
+      </w:pPr>
+      <w:r>
+        <w:t>Flask at 3.83 is the closest alternative and would be the recommendation if the platform were synchronous and its interface contract informal. It is not recommended here because every capability that closes the gap to FastAPI on this requirement set — validation, serialisation, schema generation, asynchronous drivers — has to be selected, integrated and then maintained as an assembly of independently versioned extensions. That is ongoing cost incurred to reach a position FastAPI starts from.</w:t>
+      </w:r>
+    </w:p>
+    <w:p>
+      <w:pPr>
+        <w:pStyle w:val="Body"/>
+      </w:pPr>
+      <w:r>
         <w:lastRenderedPageBreak/>
-        <w:t xml:space="preserve">The recommendation follows the analysis in Section 4. </w:t>
-      </w:r>
-      <w:proofErr w:type="spellStart"/>
-      <w:r>
-        <w:t>FastAPI</w:t>
-      </w:r>
-      <w:proofErr w:type="spellEnd"/>
-      <w:r>
-        <w:t xml:space="preserve"> scores highest at 4.78 out of 5, and it is strongest on precisely the attributes that carry the most weight. Its asynchronous request model suits a workload that is dominated by waiting on PostgreSQL, Redis, S3 and external providers, which is what protects the 99% under 5,000 </w:t>
-      </w:r>
-      <w:proofErr w:type="spellStart"/>
-      <w:r>
-        <w:t>ms</w:t>
-      </w:r>
-      <w:proofErr w:type="spellEnd"/>
-      <w:r>
-        <w:t xml:space="preserve"> performance target and what allows a container to sustain high concurrency without a worker per in-flight request. Its </w:t>
-      </w:r>
-      <w:proofErr w:type="spellStart"/>
-      <w:r>
-        <w:t>Pydantic</w:t>
-      </w:r>
-      <w:proofErr w:type="spellEnd"/>
-      <w:r>
-        <w:t xml:space="preserve">-based validation answers the claim-payload integrity requirement at the API boundary rather than in hand-written checks inside each handler. And its generated </w:t>
-      </w:r>
-      <w:proofErr w:type="spellStart"/>
-      <w:r>
-        <w:t>OpenAPI</w:t>
-      </w:r>
-      <w:proofErr w:type="spellEnd"/>
-      <w:r>
-        <w:t xml:space="preserve"> schema answers the well-defined interface standards requirement as a property of the code, so the contract the three portals build against cannot drift from the implementation that serves it.</w:t>
+        <w:t>Django at 3.38 is not recommended. Its distinctive strengths are the ORM and the automatic admin interface, and eClaims uses neither: the SAD selects SQLAlchemy for data access and delivers all administration through the React Internal Portal. What remains is a large framework carried into every one of a fleet of small containers, with asynchronous support layered over a synchronous core. Django would be the right answer for a single database-centred, server-rendered application; eClaims is neither.</w:t>
       </w:r>
     </w:p>
     <w:p>
@@ -9661,219 +8910,96 @@
         <w:pStyle w:val="Body"/>
       </w:pPr>
       <w:r>
-        <w:t xml:space="preserve">Two further considerations support the choice without being scored. </w:t>
-      </w:r>
-      <w:proofErr w:type="spellStart"/>
-      <w:r>
-        <w:t>FastAPI’s</w:t>
-      </w:r>
-      <w:proofErr w:type="spellEnd"/>
-      <w:r>
-        <w:t xml:space="preserve"> dependency-injection system is the natural place for the </w:t>
-      </w:r>
-      <w:proofErr w:type="spellStart"/>
-      <w:r>
-        <w:t>eClaims</w:t>
-      </w:r>
-      <w:proofErr w:type="spellEnd"/>
-      <w:r>
-        <w:t xml:space="preserve"> RBAC model: a role requirement is declared per endpoint as a dependency, enforced uniformly, and overridden in tests, which is materially cleaner than decorator chains applied by hand. And the framework is already proven in this codebase — the proof of concept runs </w:t>
-      </w:r>
-      <w:proofErr w:type="spellStart"/>
-      <w:r>
-        <w:t>FastAPI</w:t>
-      </w:r>
-      <w:proofErr w:type="spellEnd"/>
-      <w:r>
-        <w:t xml:space="preserve"> with </w:t>
-      </w:r>
-      <w:proofErr w:type="spellStart"/>
-      <w:r>
-        <w:t>Uvicorn</w:t>
-      </w:r>
-      <w:proofErr w:type="spellEnd"/>
-      <w:r>
-        <w:t xml:space="preserve"> in both services, currently pinned at 0.111 pending the upgrade tracked under risk R3 — so the recommendation carries implementation evidence and not only analysis.</w:t>
+        <w:t>The condition under which this recommendation would change is narrow and worth stating. If the mandate changed from an API-first platform to a server-rendered application with a substantial back office — removing the three-portal API contract and introducing a need for an admin interface — Django would become the stronger option. Under the requirements in Section 2, it is not.</w:t>
       </w:r>
     </w:p>
     <w:p>
       <w:pPr>
         <w:pStyle w:val="Body"/>
       </w:pPr>
-      <w:r>
-        <w:t xml:space="preserve">The recommendation is made with its weaknesses on </w:t>
-      </w:r>
-      <w:proofErr w:type="gramStart"/>
-      <w:r>
-        <w:t>the record</w:t>
-      </w:r>
-      <w:proofErr w:type="gramEnd"/>
-      <w:r>
-        <w:t xml:space="preserve">. Asynchronous code is less forgiving: a single blocking call on the event loop degrades an entire worker, so async-capable drivers must be used throughout and enforced in review, and the team needs a working understanding of the async model before it needs one of </w:t>
-      </w:r>
-      <w:proofErr w:type="spellStart"/>
-      <w:r>
-        <w:t>FastAPI</w:t>
-      </w:r>
-      <w:proofErr w:type="spellEnd"/>
-      <w:r>
-        <w:t xml:space="preserve">. The extension ecosystem is shallower than Flask’s and much shallower than Django’s, so some capability that would be a package elsewhere will be written here. </w:t>
-      </w:r>
-      <w:proofErr w:type="spellStart"/>
-      <w:r>
-        <w:t>FastAPI</w:t>
-      </w:r>
-      <w:proofErr w:type="spellEnd"/>
-      <w:r>
-        <w:t xml:space="preserve"> is still below a 1.0 version number and continues to make breaking changes within the 0.x series — at 0.112, 0.127, 0.129 and 0.132 among others — which places a real obligation on dependency pinning and upgrade testing, recorded as risk R2. And nothing in </w:t>
-      </w:r>
-      <w:proofErr w:type="spellStart"/>
-      <w:r>
-        <w:t>FastAPI</w:t>
-      </w:r>
-      <w:proofErr w:type="spellEnd"/>
-      <w:r>
-        <w:t xml:space="preserve"> supplies an ORM, migrations or an administrative interface; </w:t>
-      </w:r>
-      <w:proofErr w:type="spellStart"/>
-      <w:r>
-        <w:t>eClaims</w:t>
-      </w:r>
-      <w:proofErr w:type="spellEnd"/>
-      <w:r>
-        <w:t xml:space="preserve"> obtains those from </w:t>
-      </w:r>
-      <w:proofErr w:type="spellStart"/>
-      <w:r>
-        <w:t>SQLAlchemy</w:t>
-      </w:r>
-      <w:proofErr w:type="spellEnd"/>
-      <w:r>
-        <w:t>, Alembic and the Internal Portal respectively.</w:t>
-      </w:r>
     </w:p>
     <w:p>
       <w:pPr>
         <w:pStyle w:val="Body"/>
       </w:pPr>
-      <w:r>
-        <w:t xml:space="preserve">Flask at 3.83 is the closest alternative and would be the recommendation if the platform were synchronous and its interface contract informal. It is not recommended here because every capability that closes the gap to </w:t>
-      </w:r>
-      <w:proofErr w:type="spellStart"/>
-      <w:r>
-        <w:t>FastAPI</w:t>
-      </w:r>
-      <w:proofErr w:type="spellEnd"/>
-      <w:r>
-        <w:t xml:space="preserve"> on this requirement set — validation, </w:t>
-      </w:r>
-      <w:proofErr w:type="spellStart"/>
-      <w:r>
-        <w:t>serialisation</w:t>
-      </w:r>
-      <w:proofErr w:type="spellEnd"/>
-      <w:r>
-        <w:t xml:space="preserve">, schema generation, asynchronous drivers — </w:t>
-      </w:r>
-      <w:proofErr w:type="gramStart"/>
-      <w:r>
-        <w:t>has to</w:t>
-      </w:r>
-      <w:proofErr w:type="gramEnd"/>
-      <w:r>
-        <w:t xml:space="preserve"> be selected, integrated and then maintained as an assembly of independently versioned extensions. That is ongoing cost incurred to reach a position </w:t>
-      </w:r>
-      <w:proofErr w:type="spellStart"/>
-      <w:r>
-        <w:t>FastAPI</w:t>
-      </w:r>
-      <w:proofErr w:type="spellEnd"/>
-      <w:r>
-        <w:t xml:space="preserve"> starts from.</w:t>
-      </w:r>
     </w:p>
     <w:p>
       <w:pPr>
         <w:pStyle w:val="Body"/>
       </w:pPr>
-      <w:r>
-        <w:t xml:space="preserve">Django at 3.38 is not recommended. Its distinctive strengths are the ORM and the automatic admin interface, and </w:t>
-      </w:r>
-      <w:proofErr w:type="spellStart"/>
-      <w:r>
-        <w:t>eClaims</w:t>
-      </w:r>
-      <w:proofErr w:type="spellEnd"/>
-      <w:r>
-        <w:t xml:space="preserve"> uses neither: the SAD selects </w:t>
-      </w:r>
-      <w:proofErr w:type="spellStart"/>
-      <w:r>
-        <w:t>SQLAlchemy</w:t>
-      </w:r>
-      <w:proofErr w:type="spellEnd"/>
-      <w:r>
-        <w:t xml:space="preserve"> for data access and delivers all administration through </w:t>
-      </w:r>
-      <w:proofErr w:type="gramStart"/>
-      <w:r>
-        <w:t>the React</w:t>
-      </w:r>
-      <w:proofErr w:type="gramEnd"/>
-      <w:r>
-        <w:t xml:space="preserve"> Internal Portal. What remains is a large framework carried into every one of a fleet of small containers, with asynchronous support layered over a </w:t>
-      </w:r>
+    </w:p>
+    <w:p>
+      <w:pPr>
+        <w:pStyle w:val="Body"/>
+      </w:pPr>
+    </w:p>
+    <w:p>
+      <w:pPr>
+        <w:pStyle w:val="Body"/>
+      </w:pPr>
+    </w:p>
+    <w:p>
+      <w:pPr>
+        <w:pStyle w:val="Body"/>
+      </w:pPr>
+    </w:p>
+    <w:p>
+      <w:pPr>
+        <w:pStyle w:val="Body"/>
+      </w:pPr>
+    </w:p>
+    <w:p>
+      <w:pPr>
+        <w:pStyle w:val="Body"/>
+      </w:pPr>
+    </w:p>
+    <w:p>
+      <w:pPr>
+        <w:pStyle w:val="Body"/>
+      </w:pPr>
+    </w:p>
+    <w:p>
+      <w:pPr>
+        <w:pStyle w:val="Body"/>
+      </w:pPr>
+    </w:p>
+    <w:p>
+      <w:pPr>
+        <w:pStyle w:val="Body"/>
+      </w:pPr>
+    </w:p>
+    <w:p>
+      <w:pPr>
+        <w:pStyle w:val="Body"/>
+      </w:pPr>
+    </w:p>
+    <w:p>
+      <w:pPr>
+        <w:pStyle w:val="Body"/>
+      </w:pPr>
+    </w:p>
+    <w:p>
+      <w:pPr>
+        <w:pStyle w:val="Body"/>
+      </w:pPr>
+    </w:p>
+    <w:p>
+      <w:pPr>
+        <w:pStyle w:val="Body"/>
+      </w:pPr>
+    </w:p>
+    <w:p>
+      <w:pPr>
+        <w:pStyle w:val="Body"/>
+      </w:pPr>
+    </w:p>
+    <w:p>
+      <w:pPr>
+        <w:pStyle w:val="Heading1"/>
+      </w:pPr>
+      <w:bookmarkStart w:id="20" w:name="_Toc238143538"/>
       <w:r>
         <w:lastRenderedPageBreak/>
-        <w:t>synchronous core. Django would be the right answer for a single database-</w:t>
-      </w:r>
-      <w:proofErr w:type="spellStart"/>
-      <w:r>
-        <w:t>centred</w:t>
-      </w:r>
-      <w:proofErr w:type="spellEnd"/>
-      <w:r>
-        <w:t xml:space="preserve">, server-rendered application; </w:t>
-      </w:r>
-      <w:proofErr w:type="spellStart"/>
-      <w:r>
-        <w:t>eClaims</w:t>
-      </w:r>
-      <w:proofErr w:type="spellEnd"/>
-      <w:r>
-        <w:t xml:space="preserve"> is neither.</w:t>
-      </w:r>
-    </w:p>
-    <w:p>
-      <w:pPr>
-        <w:pStyle w:val="Body"/>
-      </w:pPr>
-      <w:r>
-        <w:t xml:space="preserve">The </w:t>
-      </w:r>
-      <w:proofErr w:type="gramStart"/>
-      <w:r>
-        <w:t>condition</w:t>
-      </w:r>
-      <w:proofErr w:type="gramEnd"/>
-      <w:r>
-        <w:t xml:space="preserve"> under which this recommendation would change </w:t>
-      </w:r>
-      <w:proofErr w:type="gramStart"/>
-      <w:r>
-        <w:t>is</w:t>
-      </w:r>
-      <w:proofErr w:type="gramEnd"/>
-      <w:r>
-        <w:t xml:space="preserve"> narrow and worth stating. If the mandate changed from an API-first platform to a server-rendered application with a substantial back office — removing the three-portal API contract and introducing a need for an admin interface — Django would become the stronger option. Under the requirements in Section 2, it is not.</w:t>
-      </w:r>
-    </w:p>
-    <w:p>
-      <w:pPr>
-        <w:pStyle w:val="Heading1"/>
-      </w:pPr>
-      <w:bookmarkStart w:id="20" w:name="_Toc238143538"/>
-      <w:r>
         <w:t>Assumptions</w:t>
       </w:r>
       <w:bookmarkEnd w:id="20"/>
@@ -9930,41 +9056,14 @@
           <w:numId w:val="8"/>
         </w:numPr>
       </w:pPr>
-      <w:proofErr w:type="spellStart"/>
       <w:r>
         <w:rPr>
           <w:b/>
         </w:rPr>
-        <w:t>Containerised</w:t>
-      </w:r>
-      <w:proofErr w:type="spellEnd"/>
-      <w:r>
-        <w:rPr>
-          <w:b/>
-        </w:rPr>
-        <w:t xml:space="preserve"> deployment on ECS </w:t>
-      </w:r>
-      <w:proofErr w:type="gramStart"/>
-      <w:r>
-        <w:rPr>
-          <w:b/>
-        </w:rPr>
-        <w:t>Fargate</w:t>
-      </w:r>
-      <w:r>
-        <w:t xml:space="preserve"> — every service</w:t>
-      </w:r>
-      <w:proofErr w:type="gramEnd"/>
-      <w:r>
-        <w:t xml:space="preserve"> is packaged as a container image and started by an ASGI or WSGI server inside it. This is what </w:t>
-      </w:r>
-      <w:proofErr w:type="spellStart"/>
-      <w:r>
-        <w:t>neutralises</w:t>
-      </w:r>
-      <w:proofErr w:type="spellEnd"/>
-      <w:r>
-        <w:t xml:space="preserve"> the deployment attribute across all three candidates, and it is the subject of a separate DAR.</w:t>
+        <w:t>Containerised deployment on ECS Fargate</w:t>
+      </w:r>
+      <w:r>
+        <w:t xml:space="preserve"> — every service is packaged as a container image and started by an ASGI or WSGI server inside it. This is what neutralises the deployment attribute across all three candidates, and it is the subject of a separate DAR.</w:t>
       </w:r>
     </w:p>
     <w:p>
@@ -9997,40 +9096,10 @@
         <w:rPr>
           <w:b/>
         </w:rPr>
-        <w:t xml:space="preserve">Data access is </w:t>
-      </w:r>
-      <w:proofErr w:type="spellStart"/>
-      <w:r>
-        <w:rPr>
-          <w:b/>
-        </w:rPr>
-        <w:t>SQLAlchemy</w:t>
-      </w:r>
-      <w:proofErr w:type="spellEnd"/>
-      <w:r>
-        <w:rPr>
-          <w:b/>
-        </w:rPr>
-        <w:t xml:space="preserve"> with Alembic</w:t>
-      </w:r>
-      <w:r>
-        <w:t xml:space="preserve"> — per </w:t>
-      </w:r>
-      <w:proofErr w:type="gramStart"/>
-      <w:r>
-        <w:t>the SAD</w:t>
-      </w:r>
-      <w:proofErr w:type="gramEnd"/>
-      <w:r>
-        <w:t xml:space="preserve">, so </w:t>
-      </w:r>
-      <w:proofErr w:type="gramStart"/>
-      <w:r>
-        <w:t>a framework</w:t>
-      </w:r>
-      <w:proofErr w:type="gramEnd"/>
-      <w:r>
-        <w:t>-supplied ORM is not a requirement and Django’s ORM advantage does not apply.</w:t>
+        <w:t>Data access is SQLAlchemy with Alembic</w:t>
+      </w:r>
+      <w:r>
+        <w:t xml:space="preserve"> — per the SAD, so a framework-supplied ORM is not a requirement and Django’s ORM advantage does not apply.</w:t>
       </w:r>
     </w:p>
     <w:p>
@@ -10132,15 +9201,27 @@
         </w:numPr>
       </w:pPr>
       <w:r>
-        <w:t xml:space="preserve">Development effort is a cost — for a platform of this size, assembling and maintaining capabilities that a framework could supply natively is a real and recurring expense, and it is one of the grounds on which this evaluation separates the candidates.</w:t>
+        <w:t>Development effort is a cost — for a platform of this size, assembling and maintaining capabilities that a framework could supply natively is a real and recurring expense, and it is one of the grounds on which this evaluation separates the candidates.</w:t>
       </w:r>
     </w:p>
     <w:p>
       <w:pPr>
         <w:pStyle w:val="Heading1"/>
+        <w:numPr>
+          <w:ilvl w:val="0"/>
+          <w:numId w:val="0"/>
+        </w:numPr>
+        <w:ind w:left="432"/>
       </w:pPr>
       <w:bookmarkStart w:id="21" w:name="_Toc238143539"/>
-      <w:r>
+    </w:p>
+    <w:p/>
+    <w:p>
+      <w:pPr>
+        <w:pStyle w:val="Heading1"/>
+      </w:pPr>
+      <w:r>
+        <w:lastRenderedPageBreak/>
         <w:t>Risks</w:t>
       </w:r>
       <w:bookmarkEnd w:id="21"/>
@@ -10150,15 +9231,7 @@
         <w:pStyle w:val="Body"/>
       </w:pPr>
       <w:r>
-        <w:t xml:space="preserve">The following risks arise from the recommended option, with the mitigation </w:t>
-      </w:r>
-      <w:proofErr w:type="gramStart"/>
-      <w:r>
-        <w:t>carried</w:t>
-      </w:r>
-      <w:proofErr w:type="gramEnd"/>
-      <w:r>
-        <w:t xml:space="preserve"> in the architecture or the engineering process rather than deferred to implementation.</w:t>
+        <w:t>The following risks arise from the recommended option, with the mitigation carried in the architecture or the engineering process rather than deferred to implementation.</w:t>
       </w:r>
     </w:p>
     <w:tbl>
@@ -10355,55 +9428,7 @@
               <w:pStyle w:val="NoSpacing"/>
             </w:pPr>
             <w:r>
-              <w:t xml:space="preserve">Async-capable drivers throughout — </w:t>
-            </w:r>
-            <w:proofErr w:type="spellStart"/>
-            <w:r>
-              <w:t>asyncpg</w:t>
-            </w:r>
-            <w:proofErr w:type="spellEnd"/>
-            <w:r>
-              <w:t xml:space="preserve"> for PostgreSQL, async </w:t>
-            </w:r>
-            <w:proofErr w:type="spellStart"/>
-            <w:r>
-              <w:t>SQLAlchemy</w:t>
-            </w:r>
-            <w:proofErr w:type="spellEnd"/>
-            <w:r>
-              <w:t xml:space="preserve">, </w:t>
-            </w:r>
-            <w:proofErr w:type="spellStart"/>
-            <w:r>
-              <w:t>httpx</w:t>
-            </w:r>
-            <w:proofErr w:type="spellEnd"/>
-            <w:r>
-              <w:t xml:space="preserve"> for outbound HTTP, </w:t>
-            </w:r>
-            <w:proofErr w:type="spellStart"/>
-            <w:r>
-              <w:t>aiofiles</w:t>
-            </w:r>
-            <w:proofErr w:type="spellEnd"/>
-            <w:r>
-              <w:t xml:space="preserve"> for file work, as already pinned in the proof of concept. Genuinely blocking work is dispatched to a thread pool explicitly. Absence of blocking calls in async paths is a standing code-review check, and P95 and P99 latency are load tested per service against the 5,000 </w:t>
-            </w:r>
-            <w:proofErr w:type="spellStart"/>
-            <w:r>
-              <w:t>ms</w:t>
-            </w:r>
-            <w:proofErr w:type="spellEnd"/>
-            <w:r>
-              <w:t xml:space="preserve"> </w:t>
-            </w:r>
-            <w:proofErr w:type="gramStart"/>
-            <w:r>
-              <w:t>target</w:t>
-            </w:r>
-            <w:proofErr w:type="gramEnd"/>
-            <w:r>
-              <w:t>.</w:t>
+              <w:t>Async-capable drivers throughout — asyncpg for PostgreSQL, async SQLAlchemy, httpx for outbound HTTP, aiofiles for file work, as already pinned in the proof of concept. Genuinely blocking work is dispatched to a thread pool explicitly. Absence of blocking calls in async paths is a standing code-review check, and P95 and P99 latency are load tested per service against the 5,000 ms target.</w:t>
             </w:r>
           </w:p>
         </w:tc>
@@ -10464,21 +9489,8 @@
             <w:pPr>
               <w:pStyle w:val="NoSpacing"/>
             </w:pPr>
-            <w:proofErr w:type="spellStart"/>
-            <w:r>
-              <w:t xml:space="preserve">FastAPI remains on a 0.x version line (0.142 at the date of this document) and continues to introduce breaking changes between minor releases, at 0.112, 0.127, 0.129 and 0.132 among others;</w:t>
-            </w:r>
-            <w:proofErr w:type="spellEnd"/>
-            <w:r>
-              <w:t xml:space="preserve"> </w:t>
-            </w:r>
-            <w:proofErr w:type="spellStart"/>
-            <w:r>
-              <w:t>Pydantic’s</w:t>
-            </w:r>
-            <w:proofErr w:type="spellEnd"/>
-            <w:r>
-              <w:t xml:space="preserve"> v1-to-v2 transition is the precedent. An unmanaged upgrade could break services at once.</w:t>
+            <w:r>
+              <w:t>FastAPI remains on a 0.x version line (0.142 at the date of this document) and continues to introduce breaking changes between minor releases, at 0.112, 0.127, 0.129 and 0.132 among others; Pydantic’s v1-to-v2 transition is the precedent. An unmanaged upgrade could break services at once.</w:t>
             </w:r>
           </w:p>
         </w:tc>
@@ -10497,31 +9509,7 @@
               <w:pStyle w:val="NoSpacing"/>
             </w:pPr>
             <w:r>
-              <w:t xml:space="preserve">Exact version pinning of </w:t>
-            </w:r>
-            <w:proofErr w:type="spellStart"/>
-            <w:r>
-              <w:t>FastAPI</w:t>
-            </w:r>
-            <w:proofErr w:type="spellEnd"/>
-            <w:r>
-              <w:t xml:space="preserve">, </w:t>
-            </w:r>
-            <w:proofErr w:type="spellStart"/>
-            <w:r>
-              <w:t>Pydantic</w:t>
-            </w:r>
-            <w:proofErr w:type="spellEnd"/>
-            <w:r>
-              <w:t xml:space="preserve">, Starlette and </w:t>
-            </w:r>
-            <w:proofErr w:type="spellStart"/>
-            <w:r>
-              <w:t>Uvicorn</w:t>
-            </w:r>
-            <w:proofErr w:type="spellEnd"/>
-            <w:r>
-              <w:t xml:space="preserve"> in every service, as the proof of concept already does. Upgrades are deliberate, changelog-reviewed changes validated by the automated test suite and released through the blue-green pipeline, one service at a time.</w:t>
+              <w:t>Exact version pinning of FastAPI, Pydantic, Starlette and Uvicorn in every service, as the proof of concept already does. Upgrades are deliberate, changelog-reviewed changes validated by the automated test suite and released through the blue-green pipeline, one service at a time.</w:t>
             </w:r>
           </w:p>
         </w:tc>
@@ -10602,7 +9590,7 @@
               <w:pStyle w:val="NoSpacing"/>
             </w:pPr>
             <w:r>
-              <w:t xml:space="preserve">Automated dependency and vulnerability scanning in the CI pipeline with build failure on high-severity findings; a scheduled upgrade cadence rather than upgrade-on-incident; the container base image rebuilt and redeployed on the same cadence. The first item on that cadence is the proof-of-concept stack itself: FastAPI 0.111 to 0.142 and Uvicorn 0.29 to 0.54, validated service by service.</w:t>
+              <w:t>Automated dependency and vulnerability scanning in the CI pipeline with build failure on high-severity findings; a scheduled upgrade cadence rather than upgrade-on-incident; the container base image rebuilt and redeployed on the same cadence. The first item on that cadence is the proof-of-concept stack itself: FastAPI 0.111 to 0.142 and Uvicorn 0.29 to 0.54, validated service by service.</w:t>
             </w:r>
           </w:p>
         </w:tc>
@@ -10665,15 +9653,7 @@
               <w:pStyle w:val="NoSpacing"/>
             </w:pPr>
             <w:r>
-              <w:t xml:space="preserve">Developers new to async Python write correct-looking code with poor concurrency </w:t>
-            </w:r>
-            <w:proofErr w:type="spellStart"/>
-            <w:r>
-              <w:t>behaviour</w:t>
-            </w:r>
-            <w:proofErr w:type="spellEnd"/>
-            <w:r>
-              <w:t>, which surfaces as latency under load rather than as test failures.</w:t>
+              <w:t>Developers new to async Python write correct-looking code with poor concurrency behaviour, which surfaces as latency under load rather than as test failures.</w:t>
             </w:r>
           </w:p>
         </w:tc>
@@ -10754,23 +9734,7 @@
               <w:pStyle w:val="NoSpacing"/>
             </w:pPr>
             <w:r>
-              <w:t xml:space="preserve">A capability available as a mature Flask or Django extension may have no </w:t>
-            </w:r>
-            <w:proofErr w:type="spellStart"/>
-            <w:r>
-              <w:t>FastAPI</w:t>
-            </w:r>
-            <w:proofErr w:type="spellEnd"/>
-            <w:r>
-              <w:t xml:space="preserve"> </w:t>
-            </w:r>
-            <w:proofErr w:type="gramStart"/>
-            <w:r>
-              <w:t>equivalent, and</w:t>
-            </w:r>
-            <w:proofErr w:type="gramEnd"/>
-            <w:r>
-              <w:t xml:space="preserve"> would then have to be written and maintained in-house.</w:t>
+              <w:t>A capability available as a mature Flask or Django extension may have no FastAPI equivalent, and would then have to be written and maintained in-house.</w:t>
             </w:r>
           </w:p>
         </w:tc>
@@ -10788,29 +9752,8 @@
             <w:pPr>
               <w:pStyle w:val="NoSpacing"/>
             </w:pPr>
-            <w:proofErr w:type="spellStart"/>
-            <w:r>
-              <w:t>FastAPI</w:t>
-            </w:r>
-            <w:proofErr w:type="spellEnd"/>
-            <w:r>
-              <w:t xml:space="preserve"> builds on Starlette and the wider ASGI ecosystem, so framework-agnostic libraries remain </w:t>
-            </w:r>
-            <w:proofErr w:type="gramStart"/>
-            <w:r>
-              <w:t>available</w:t>
-            </w:r>
-            <w:proofErr w:type="gramEnd"/>
-            <w:r>
-              <w:t xml:space="preserve"> and the effective catalogue is larger than </w:t>
-            </w:r>
-            <w:proofErr w:type="spellStart"/>
-            <w:r>
-              <w:t>FastAPI’s</w:t>
-            </w:r>
-            <w:proofErr w:type="spellEnd"/>
-            <w:r>
-              <w:t xml:space="preserve"> own. Any capability that must be built in-house is identified at design time and scoped rather than absorbed silently.</w:t>
+            <w:r>
+              <w:t>FastAPI builds on Starlette and the wider ASGI ecosystem, so framework-agnostic libraries remain available and the effective catalogue is larger than FastAPI’s own. Any capability that must be built in-house is identified at design time and scoped rather than absorbed silently.</w:t>
             </w:r>
           </w:p>
         </w:tc>
@@ -10872,31 +9815,7 @@
               <w:pStyle w:val="NoSpacing"/>
             </w:pPr>
             <w:r>
-              <w:t xml:space="preserve">Differences between versions of </w:t>
-            </w:r>
-            <w:proofErr w:type="spellStart"/>
-            <w:r>
-              <w:t>FastAPI</w:t>
-            </w:r>
-            <w:proofErr w:type="spellEnd"/>
-            <w:r>
-              <w:t xml:space="preserve">, </w:t>
-            </w:r>
-            <w:proofErr w:type="spellStart"/>
-            <w:r>
-              <w:t>Pydantic</w:t>
-            </w:r>
-            <w:proofErr w:type="spellEnd"/>
-            <w:r>
-              <w:t xml:space="preserve">, </w:t>
-            </w:r>
-            <w:proofErr w:type="spellStart"/>
-            <w:r>
-              <w:t>SQLAlchemy</w:t>
-            </w:r>
-            <w:proofErr w:type="spellEnd"/>
-            <w:r>
-              <w:t xml:space="preserve"> and the async drivers can cause compatibility problems that are not apparent from any one component’s release notes.</w:t>
+              <w:t>Differences between versions of FastAPI, Pydantic, SQLAlchemy and the async drivers can cause compatibility problems that are not apparent from any one component’s release notes.</w:t>
             </w:r>
           </w:p>
         </w:tc>
@@ -10977,23 +9896,7 @@
               <w:pStyle w:val="NoSpacing"/>
             </w:pPr>
             <w:r>
-              <w:t xml:space="preserve">Endpoints that bypass </w:t>
-            </w:r>
-            <w:proofErr w:type="spellStart"/>
-            <w:r>
-              <w:t>Pydantic</w:t>
-            </w:r>
-            <w:proofErr w:type="spellEnd"/>
-            <w:r>
-              <w:t xml:space="preserve"> models — accepting raw dictionaries for expedience — lose both validation and their place in the generated </w:t>
-            </w:r>
-            <w:proofErr w:type="spellStart"/>
-            <w:r>
-              <w:t>OpenAPI</w:t>
-            </w:r>
-            <w:proofErr w:type="spellEnd"/>
-            <w:r>
-              <w:t xml:space="preserve"> schema, eroding the two capabilities the framework was chosen for.</w:t>
+              <w:t>Endpoints that bypass Pydantic models — accepting raw dictionaries for expedience — lose both validation and their place in the generated OpenAPI schema, eroding the two capabilities the framework was chosen for.</w:t>
             </w:r>
           </w:p>
         </w:tc>
@@ -11012,15 +9915,7 @@
               <w:pStyle w:val="NoSpacing"/>
             </w:pPr>
             <w:r>
-              <w:t xml:space="preserve">Declared request and response models are mandatory for every endpoint and checked in review; the generated </w:t>
-            </w:r>
-            <w:proofErr w:type="spellStart"/>
-            <w:r>
-              <w:t>OpenAPI</w:t>
-            </w:r>
-            <w:proofErr w:type="spellEnd"/>
-            <w:r>
-              <w:t xml:space="preserve"> schema is published as a build artefact and contract-tested against the portal clients, so an undocumented or unvalidated endpoint fails the build.</w:t>
+              <w:t>Declared request and response models are mandatory for every endpoint and checked in review; the generated OpenAPI schema is published as a build artefact and contract-tested against the portal clients, so an undocumented or unvalidated endpoint fails the build.</w:t>
             </w:r>
           </w:p>
         </w:tc>
@@ -11033,10 +9928,36 @@
     </w:p>
     <w:p>
       <w:pPr>
+        <w:pStyle w:val="NoSpacing"/>
+      </w:pPr>
+    </w:p>
+    <w:p>
+      <w:pPr>
+        <w:pStyle w:val="NoSpacing"/>
+      </w:pPr>
+    </w:p>
+    <w:p>
+      <w:pPr>
+        <w:pStyle w:val="NoSpacing"/>
+      </w:pPr>
+    </w:p>
+    <w:p>
+      <w:pPr>
+        <w:pStyle w:val="NoSpacing"/>
+      </w:pPr>
+    </w:p>
+    <w:p>
+      <w:pPr>
+        <w:pStyle w:val="NoSpacing"/>
+      </w:pPr>
+    </w:p>
+    <w:p>
+      <w:pPr>
         <w:pStyle w:val="Heading1"/>
       </w:pPr>
       <w:bookmarkStart w:id="22" w:name="_Toc238143540"/>
       <w:r>
+        <w:lastRenderedPageBreak/>
         <w:t>Appendix</w:t>
       </w:r>
       <w:bookmarkEnd w:id="22"/>
@@ -11067,13 +9988,8 @@
           <w:numId w:val="8"/>
         </w:numPr>
       </w:pPr>
-      <w:proofErr w:type="spellStart"/>
-      <w:r>
-        <w:t xml:space="preserve">eClaims Solution Approach Document (SAD) v1.1 — docs/sad/solution-approach-document.md, Section 7 Non-Functional Requirements and Section 8 Technology Stack</w:t>
-      </w:r>
-      <w:proofErr w:type="spellEnd"/>
-      <w:r>
-        <w:t xml:space="preserve"/>
+      <w:r>
+        <w:t>eClaims Solution Approach Document (SAD) v1.1 — docs/sad/solution-approach-document.md, Section 7 Non-Functional Requirements and Section 8 Technology Stack</w:t>
       </w:r>
     </w:p>
     <w:p>
@@ -11084,21 +10000,8 @@
           <w:numId w:val="8"/>
         </w:numPr>
       </w:pPr>
-      <w:proofErr w:type="spellStart"/>
-      <w:r>
-        <w:t>eClaims</w:t>
-      </w:r>
-      <w:proofErr w:type="spellEnd"/>
-      <w:r>
-        <w:t xml:space="preserve"> Case Study — requirements/</w:t>
-      </w:r>
-      <w:proofErr w:type="spellStart"/>
-      <w:r>
-        <w:t>eClaims</w:t>
-      </w:r>
-      <w:proofErr w:type="spellEnd"/>
-      <w:r>
-        <w:t xml:space="preserve"> - Insurance - Senior Staff Engineer.pdf</w:t>
+      <w:r>
+        <w:t>eClaims Case Study — requirements/eClaims - Insurance - Senior Staff Engineer.pdf</w:t>
       </w:r>
     </w:p>
     <w:p>
@@ -11109,46 +10012,8 @@
           <w:numId w:val="8"/>
         </w:numPr>
       </w:pPr>
-      <w:proofErr w:type="spellStart"/>
-      <w:r>
-        <w:lastRenderedPageBreak/>
-        <w:t>eClaims</w:t>
-      </w:r>
-      <w:proofErr w:type="spellEnd"/>
-      <w:r>
-        <w:t xml:space="preserve"> Proof-of-Concept implementation — </w:t>
-      </w:r>
-      <w:proofErr w:type="spellStart"/>
-      <w:r>
-        <w:t>src</w:t>
-      </w:r>
-      <w:proofErr w:type="spellEnd"/>
-      <w:r>
-        <w:t xml:space="preserve">/backend/claims-service and </w:t>
-      </w:r>
-      <w:proofErr w:type="spellStart"/>
-      <w:r>
-        <w:t>src</w:t>
-      </w:r>
-      <w:proofErr w:type="spellEnd"/>
-      <w:r>
-        <w:t>/backend/auth-service (</w:t>
-      </w:r>
-      <w:proofErr w:type="spellStart"/>
-      <w:r>
-        <w:t>FastAPI</w:t>
-      </w:r>
-      <w:proofErr w:type="spellEnd"/>
-      <w:r>
-        <w:t xml:space="preserve"> 0.111 with </w:t>
-      </w:r>
-      <w:proofErr w:type="spellStart"/>
-      <w:r>
-        <w:t>Uvicorn</w:t>
-      </w:r>
-      <w:proofErr w:type="spellEnd"/>
-      <w:r>
-        <w:t xml:space="preserve"> 0.29, pending the upgrade tracked under risk R3)</w:t>
+      <w:r>
+        <w:t>eClaims Proof-of-Concept implementation — src/backend/claims-service and src/backend/auth-service (FastAPI 0.111 with Uvicorn 0.29, pending the upgrade tracked under risk R3)</w:t>
       </w:r>
     </w:p>
     <w:p>
@@ -11160,7 +10025,7 @@
         </w:numPr>
       </w:pPr>
       <w:r>
-        <w:t xml:space="preserve">DAR — Compute and Deployment Platform Selection — docs/dar/Utsav_eClaims_DAR_Compute.docx (companion document: ECS Fargate recommendation)</w:t>
+        <w:t>DAR — Compute and Deployment Platform Selection — docs/dar/Utsav_eClaims_DAR_Compute.docx (companion document: ECS Fargate recommendation)</w:t>
       </w:r>
     </w:p>
     <w:p>
@@ -11171,13 +10036,8 @@
           <w:numId w:val="8"/>
         </w:numPr>
       </w:pPr>
-      <w:proofErr w:type="spellStart"/>
-      <w:r>
-        <w:t>FastAPI</w:t>
-      </w:r>
-      <w:proofErr w:type="spellEnd"/>
-      <w:r>
-        <w:t xml:space="preserve"> documentation — https://fastapi.tiangolo.com/</w:t>
+      <w:r>
+        <w:t>FastAPI documentation — https://fastapi.tiangolo.com/</w:t>
       </w:r>
     </w:p>
     <w:p>
@@ -11200,13 +10060,8 @@
           <w:numId w:val="8"/>
         </w:numPr>
       </w:pPr>
-      <w:proofErr w:type="spellStart"/>
-      <w:r>
-        <w:t>Pydantic</w:t>
-      </w:r>
-      <w:proofErr w:type="spellEnd"/>
-      <w:r>
-        <w:t xml:space="preserve"> documentation — https://docs.pydantic.dev/</w:t>
+      <w:r>
+        <w:t>Pydantic documentation — https://docs.pydantic.dev/</w:t>
       </w:r>
     </w:p>
     <w:p>
@@ -11217,13 +10072,8 @@
           <w:numId w:val="8"/>
         </w:numPr>
       </w:pPr>
-      <w:proofErr w:type="spellStart"/>
-      <w:r>
-        <w:t>Uvicorn</w:t>
-      </w:r>
-      <w:proofErr w:type="spellEnd"/>
-      <w:r>
-        <w:t xml:space="preserve"> documentation — https://www.uvicorn.org/</w:t>
+      <w:r>
+        <w:t>Uvicorn documentation — https://www.uvicorn.org/</w:t>
       </w:r>
     </w:p>
     <w:p>
@@ -11270,13 +10120,8 @@
           <w:numId w:val="8"/>
         </w:numPr>
       </w:pPr>
-      <w:proofErr w:type="spellStart"/>
-      <w:r>
-        <w:t>OpenAPI</w:t>
-      </w:r>
-      <w:proofErr w:type="spellEnd"/>
-      <w:r>
-        <w:t xml:space="preserve"> Specification 3.1 — https://spec.openapis.org/oas/latest.html</w:t>
+      <w:r>
+        <w:t>OpenAPI Specification 3.1 — https://spec.openapis.org/oas/latest.html</w:t>
       </w:r>
     </w:p>
     <w:p>
@@ -11318,15 +10163,7 @@
         <w:pStyle w:val="Body"/>
       </w:pPr>
       <w:r>
-        <w:t xml:space="preserve">The method was fixed before scoring, in this order, so that the weighting could not be chosen to </w:t>
-      </w:r>
-      <w:proofErr w:type="spellStart"/>
-      <w:r>
-        <w:t>favour</w:t>
-      </w:r>
-      <w:proofErr w:type="spellEnd"/>
-      <w:r>
-        <w:t xml:space="preserve"> a conclusion:</w:t>
+        <w:t>The method was fixed before scoring, in this order, so that the weighting could not be chosen to favour a conclusion:</w:t>
       </w:r>
     </w:p>
     <w:p>
@@ -11338,23 +10175,7 @@
         </w:numPr>
       </w:pPr>
       <w:r>
-        <w:t xml:space="preserve">Evaluation attributes were derived from the </w:t>
-      </w:r>
-      <w:proofErr w:type="spellStart"/>
-      <w:r>
-        <w:t>eClaims</w:t>
-      </w:r>
-      <w:proofErr w:type="spellEnd"/>
-      <w:r>
-        <w:t xml:space="preserve"> functional and non-functional requirements </w:t>
-      </w:r>
-      <w:proofErr w:type="spellStart"/>
-      <w:r>
-        <w:t>summarised</w:t>
-      </w:r>
-      <w:proofErr w:type="spellEnd"/>
-      <w:r>
-        <w:t xml:space="preserve"> in Section 2, and each attribute is traced back to the requirement that justifies it in Section 4.1.</w:t>
+        <w:t>Evaluation attributes were derived from the eClaims functional and non-functional requirements summarised in Section 2, and each attribute is traced back to the requirement that justifies it in Section 4.1.</w:t>
       </w:r>
     </w:p>
     <w:p>
@@ -11378,15 +10199,7 @@
         </w:numPr>
       </w:pPr>
       <w:r>
-        <w:t xml:space="preserve">Each option was then scored 1 to 5 against every attribute on native capability relative to the </w:t>
-      </w:r>
-      <w:proofErr w:type="spellStart"/>
-      <w:r>
-        <w:t>eClaims</w:t>
-      </w:r>
-      <w:proofErr w:type="spellEnd"/>
-      <w:r>
-        <w:t xml:space="preserve"> requirement — not absolute product quality — with 5 denoting the simplest option where the attribute is complexity.</w:t>
+        <w:t>Each option was then scored 1 to 5 against every attribute on native capability relative to the eClaims requirement — not absolute product quality — with 5 denoting the simplest option where the attribute is complexity.</w:t>
       </w:r>
     </w:p>
     <w:p>
@@ -11406,15 +10219,8 @@
         <w:pStyle w:val="Body"/>
       </w:pPr>
       <w:r>
-        <w:t xml:space="preserve">Worked example, </w:t>
-      </w:r>
-      <w:proofErr w:type="spellStart"/>
-      <w:r>
-        <w:t>FastAPI</w:t>
-      </w:r>
-      <w:proofErr w:type="spellEnd"/>
-      <w:r>
-        <w:t>: (5×5 + 5×5 + 4×5 + 4×5 + 5×5 + 3×4 + 4×5 + 3×4 + 4×5 + 3×4) ÷ 40 = 191 ÷ 40 = 4.78.</w:t>
+        <w:lastRenderedPageBreak/>
+        <w:t>Worked example, FastAPI: (5×5 + 5×5 + 4×5 + 4×5 + 5×5 + 3×4 + 4×5 + 3×4 + 4×5 + 3×4) ÷ 40 = 191 ÷ 40 = 4.78.</w:t>
       </w:r>
     </w:p>
     <w:p>
@@ -11422,7 +10228,7 @@
         <w:pStyle w:val="Body"/>
       </w:pPr>
       <w:r>
-        <w:t xml:space="preserve">Two exclusions are deliberate. Licence cost is not scored, because all three options are free of licence cost and an attribute on which every candidate is identical cannot inform a decision. Architecture style is recorded descriptively in Section 4.3 rather than scored, because it describes the options rather than ranking them against a requirement.</w:t>
+        <w:t>Two exclusions are deliberate. Licence cost is not scored, because all three options are free of licence cost and an attribute on which every candidate is identical cannot inform a decision. Architecture style is recorded descriptively in Section 4.3 rather than scored, because it describes the options rather than ranking them against a requirement.</w:t>
       </w:r>
     </w:p>
     <w:p>
@@ -11430,7 +10236,7 @@
         <w:pStyle w:val="Body"/>
       </w:pPr>
       <w:r>
-        <w:t xml:space="preserve">Sensitivity. Automatic API documentation and request validation with type safety carry weight 4 each, and both favour FastAPI. They are included because well-defined data and interface standards and claim payload integrity are stated eClaims requirements for a backend that serves three portals and external partner integration. Were both excluded, FastAPI would still lead on the remaining eight attributes, at 4.72 against 4.28 for Flask, so they widen the margin rather than create the outcome.</w:t>
+        <w:t>Sensitivity. Automatic API documentation and request validation with type safety carry weight 4 each, and both favour FastAPI. They are included because well-defined data and interface standards and claim payload integrity are stated eClaims requirements for a backend that serves three portals and external partner integration. Were both excluded, FastAPI would still lead on the remaining eight attributes, at 4.72 against 4.28 for Flask, so they widen the margin rather than create the outcome.</w:t>
       </w:r>
     </w:p>
     <w:p>
@@ -11438,7 +10244,7 @@
         <w:pStyle w:val="Body"/>
       </w:pPr>
       <w:r>
-        <w:t xml:space="preserve">Two further attributes cut in opposite directions. Performance under load (weight 5) favours FastAPI and is scored separately from asynchronous support deliberately: one measures the mechanism and the other the outcome, and a 200-million-customer platform under a latency ceiling depends on the outcome. Ecosystem and community maturity (weight 3) counts against FastAPI, which scores 4 there while Flask and Django both score 5; it is included for exactly that reason, because an attribute set that favoured the preferred option uniformly would be evidence of a matrix built backwards from its conclusion.</w:t>
+        <w:t>Two further attributes cut in opposite directions. Performance under load (weight 5) favours FastAPI and is scored separately from asynchronous support deliberately: one measures the mechanism and the other the outcome, and a 200-million-customer platform under a latency ceiling depends on the outcome. Ecosystem and community maturity (weight 3) counts against FastAPI, which scores 4 there while Flask and Django both score 5; it is included for exactly that reason, because an attribute set that favoured the preferred option uniformly would be evidence of a matrix built backwards from its conclusion.</w:t>
       </w:r>
     </w:p>
     <w:p>
@@ -11446,47 +10252,7 @@
         <w:pStyle w:val="Body"/>
       </w:pPr>
       <w:r>
-        <w:t xml:space="preserve">The matrix is not constructed to produce this answer, and its shape shows that. </w:t>
-      </w:r>
-      <w:proofErr w:type="spellStart"/>
-      <w:r>
-        <w:t>FastAPI</w:t>
-      </w:r>
-      <w:proofErr w:type="spellEnd"/>
-      <w:r>
-        <w:t xml:space="preserve"> loses outright on extensibility and on ecosystem maturity, and merely ties on microservices fit, </w:t>
-      </w:r>
-      <w:proofErr w:type="spellStart"/>
-      <w:r>
-        <w:t>containerised</w:t>
-      </w:r>
-      <w:proofErr w:type="spellEnd"/>
-      <w:r>
-        <w:t xml:space="preserve"> deployment, scaling and complexity — four of the ten attributes, carrying 16 of the 40 </w:t>
-      </w:r>
-      <w:proofErr w:type="gramStart"/>
-      <w:r>
-        <w:t>weight</w:t>
-      </w:r>
-      <w:proofErr w:type="gramEnd"/>
-      <w:r>
-        <w:t xml:space="preserve">, where it wins nothing. Its lead comes from four attributes where a stated </w:t>
-      </w:r>
-      <w:proofErr w:type="spellStart"/>
-      <w:r>
-        <w:t>eClaims</w:t>
-      </w:r>
-      <w:proofErr w:type="spellEnd"/>
-      <w:r>
-        <w:t xml:space="preserve"> requirement points at a capability </w:t>
-      </w:r>
-      <w:proofErr w:type="spellStart"/>
-      <w:r>
-        <w:t>FastAPI</w:t>
-      </w:r>
-      <w:proofErr w:type="spellEnd"/>
-      <w:r>
-        <w:t xml:space="preserve"> has natively and the others do not.</w:t>
+        <w:t>The matrix is not constructed to produce this answer, and its shape shows that. FastAPI loses outright on extensibility and on ecosystem maturity, and merely ties on microservices fit, containerised deployment, scaling and complexity — four of the ten attributes, carrying 16 of the 40 weight, where it wins nothing. Its lead comes from four attributes where a stated eClaims requirement points at a capability FastAPI has natively and the others do not.</w:t>
       </w:r>
     </w:p>
     <w:p>
@@ -11494,24 +10260,19 @@
         <w:pStyle w:val="Body"/>
       </w:pPr>
       <w:r>
+        <w:t>Two limitations should be read alongside the result. A weighted average compresses capability differences, which is why Section 4.3 records native support separately — a 3 for a capability that is absent but buildable is not the same thing as a 3 for one that is present but awkward. And the scores are informed engineering judgement against documented product capability and the working proof of concept, not measurements from a controlled benchmark of all three options under eClaims load.</w:t>
+      </w:r>
+    </w:p>
+    <w:p>
+      <w:pPr>
+        <w:pStyle w:val="Body"/>
+      </w:pPr>
+      <w:r>
+        <w:t xml:space="preserve">Version currency. The candidates are assessed at the latest stable releases at the date of this document — Flask 3.1.3, FastAPI 0.142 and Django 6.1 — against every attribute in Section 4.1. Django 6.0 and 6.1 added content-security-policy support, a background-tasks framework, template partials and asynchronous pagination, but neither brought an asynchronous ORM or native OpenAPI generation, so Django’s scores on asynchronous support and API documentation are unaffected. FastAPI’s recent additions — parameter models for query, header and cookie parameters, and native server-sent-event and JSONL streaming — reinforce attributes where it </w:t>
+      </w:r>
+      <w:r>
         <w:lastRenderedPageBreak/>
-        <w:t xml:space="preserve">Two limitations should be read alongside the result. A weighted average compresses capability differences, which is why Section 4.3 records native support separately — a 3 for a capability that is absent but buildable is not the same thing as a 3 for one that is present but awkward. And the scores are informed engineering judgement against documented product capability and the working proof of concept, not measurements from a controlled benchmark of all three options under </w:t>
-      </w:r>
-      <w:proofErr w:type="spellStart"/>
-      <w:r>
-        <w:t>eClaims</w:t>
-      </w:r>
-      <w:proofErr w:type="spellEnd"/>
-      <w:r>
-        <w:t xml:space="preserve"> load.</w:t>
-      </w:r>
-    </w:p>
-    <w:p>
-      <w:pPr>
-        <w:pStyle w:val="Body"/>
-      </w:pPr>
-      <w:r>
-        <w:t xml:space="preserve">Version currency. The candidates are assessed at the latest stable releases at the date of this document — Flask 3.1.3, FastAPI 0.142 and Django 6.1 — against every attribute in Section 4.1. Django 6.0 and 6.1 added content-security-policy support, a background-tasks framework, template partials and asynchronous pagination, but neither brought an asynchronous ORM or native OpenAPI generation, so Django’s scores on asynchronous support and API documentation are unaffected. FastAPI’s recent additions — parameter models for query, header and cookie parameters, and native server-sent-event and JSONL streaming — reinforce attributes where it already scores 5 rather than adding new ones. FastAPI’s ecosystem and community maturity score is deliberately held at 4, so that no score moves in favour of the recommended option without new evidence.</w:t>
+        <w:t>already scores 5 rather than adding new ones. FastAPI’s ecosystem and community maturity score is deliberately held at 4, so that no score moves in favour of the recommended option without new evidence.</w:t>
       </w:r>
     </w:p>
     <w:sectPr>
@@ -11531,7 +10292,7 @@
 </file>
 
 <file path=word/endnotes.xml><?xml version="1.0" encoding="utf-8"?>
-<w:endnotes xmlns:wpc="http://schemas.microsoft.com/office/word/2010/wordprocessingCanvas" xmlns:cx="http://schemas.microsoft.com/office/drawing/2014/chartex" xmlns:cx1="http://schemas.microsoft.com/office/drawing/2015/9/8/chartex" xmlns:cx2="http://schemas.microsoft.com/office/drawing/2015/10/21/chartex" xmlns:cx3="http://schemas.microsoft.com/office/drawing/2016/5/9/chartex" xmlns:cx4="http://schemas.microsoft.com/office/drawing/2016/5/10/chartex" xmlns:cx5="http://schemas.microsoft.com/office/drawing/2016/5/11/chartex" xmlns:cx6="http://schemas.microsoft.com/office/drawing/2016/5/12/chartex" xmlns:cx7="http://schemas.microsoft.com/office/drawing/2016/5/13/chartex" xmlns:cx8="http://schemas.microsoft.com/office/drawing/2016/5/14/chartex" xmlns:mc="http://schemas.openxmlformats.org/markup-compatibility/2006" xmlns:aink="http://schemas.microsoft.com/office/drawing/2016/ink" xmlns:am3d="http://schemas.microsoft.com/office/drawing/2017/model3d" xmlns:o="urn:schemas-microsoft-com:office:office" xmlns:oel="http://schemas.microsoft.com/office/2019/extlst" xmlns:r="http://schemas.openxmlformats.org/officeDocument/2006/relationships" xmlns:m="http://schemas.openxmlformats.org/officeDocument/2006/math" xmlns:v="urn:schemas-microsoft-com:vml" xmlns:wp14="http://schemas.microsoft.com/office/word/2010/wordprocessingDrawing" xmlns:wp="http://schemas.openxmlformats.org/drawingml/2006/wordprocessingDrawing" xmlns:w10="urn:schemas-microsoft-com:office:word" xmlns:w="http://schemas.openxmlformats.org/wordprocessingml/2006/main" xmlns:w14="http://schemas.microsoft.com/office/word/2010/wordml" xmlns:w15="http://schemas.microsoft.com/office/word/2012/wordml" xmlns:w16cei="http://schemas.microsoft.com/office/word/2026/wordml/cei" xmlns:w16cex="http://schemas.microsoft.com/office/word/2018/wordml/cex" xmlns:w16cid="http://schemas.microsoft.com/office/word/2016/wordml/cid" xmlns:w16="http://schemas.microsoft.com/office/word/2018/wordml" xmlns:w16du="http://schemas.microsoft.com/office/word/2023/wordml/word16du" xmlns:w16sdtdh="http://schemas.microsoft.com/office/word/2020/wordml/sdtdatahash" xmlns:w16sdtfl="http://schemas.microsoft.com/office/word/2024/wordml/sdtformatlock" xmlns:w16se="http://schemas.microsoft.com/office/word/2015/wordml/symex" xmlns:wpg="http://schemas.microsoft.com/office/word/2010/wordprocessingGroup" xmlns:wpi="http://schemas.microsoft.com/office/word/2010/wordprocessingInk" xmlns:wne="http://schemas.microsoft.com/office/word/2006/wordml" xmlns:wps="http://schemas.microsoft.com/office/word/2010/wordprocessingShape" mc:Ignorable="w14 w15 w16se w16cid w16 w16cex w16sdtdh w16sdtfl w16du wp14">
+<w:endnotes xmlns:wpc="http://schemas.microsoft.com/office/word/2010/wordprocessingCanvas" xmlns:cx="http://schemas.microsoft.com/office/drawing/2014/chartex" xmlns:cx1="http://schemas.microsoft.com/office/drawing/2015/9/8/chartex" xmlns:cx2="http://schemas.microsoft.com/office/drawing/2015/10/21/chartex" xmlns:cx3="http://schemas.microsoft.com/office/drawing/2016/5/9/chartex" xmlns:cx4="http://schemas.microsoft.com/office/drawing/2016/5/10/chartex" xmlns:cx5="http://schemas.microsoft.com/office/drawing/2016/5/11/chartex" xmlns:cx6="http://schemas.microsoft.com/office/drawing/2016/5/12/chartex" xmlns:cx7="http://schemas.microsoft.com/office/drawing/2016/5/13/chartex" xmlns:cx8="http://schemas.microsoft.com/office/drawing/2016/5/14/chartex" xmlns:mc="http://schemas.openxmlformats.org/markup-compatibility/2006" xmlns:aink="http://schemas.microsoft.com/office/drawing/2016/ink" xmlns:am3d="http://schemas.microsoft.com/office/drawing/2017/model3d" xmlns:o="urn:schemas-microsoft-com:office:office" xmlns:oel="http://schemas.microsoft.com/office/2019/extlst" xmlns:r="http://schemas.openxmlformats.org/officeDocument/2006/relationships" xmlns:m="http://schemas.openxmlformats.org/officeDocument/2006/math" xmlns:v="urn:schemas-microsoft-com:vml" xmlns:wp14="http://schemas.microsoft.com/office/word/2010/wordprocessingDrawing" xmlns:wp="http://schemas.openxmlformats.org/drawingml/2006/wordprocessingDrawing" xmlns:w10="urn:schemas-microsoft-com:office:word" xmlns:w="http://schemas.openxmlformats.org/wordprocessingml/2006/main" xmlns:w14="http://schemas.microsoft.com/office/word/2010/wordml" xmlns:w15="http://schemas.microsoft.com/office/word/2012/wordml" xmlns:w16cex="http://schemas.microsoft.com/office/word/2018/wordml/cex" xmlns:w16cid="http://schemas.microsoft.com/office/word/2016/wordml/cid" xmlns:w16="http://schemas.microsoft.com/office/word/2018/wordml" xmlns:w16du="http://schemas.microsoft.com/office/word/2023/wordml/word16du" xmlns:w16sdtdh="http://schemas.microsoft.com/office/word/2020/wordml/sdtdatahash" xmlns:w16sdtfl="http://schemas.microsoft.com/office/word/2024/wordml/sdtformatlock" xmlns:w16se="http://schemas.microsoft.com/office/word/2015/wordml/symex" xmlns:wpg="http://schemas.microsoft.com/office/word/2010/wordprocessingGroup" xmlns:wpi="http://schemas.microsoft.com/office/word/2010/wordprocessingInk" xmlns:wne="http://schemas.microsoft.com/office/word/2006/wordml" xmlns:wps="http://schemas.microsoft.com/office/word/2010/wordprocessingShape" mc:Ignorable="w14 w15 w16se w16cid w16 w16cex w16sdtdh w16sdtfl w16du wp14">
   <w:endnote w:type="separator" w:id="-1">
     <w:p>
       <w:pPr>
@@ -11556,7 +10317,7 @@
 </file>
 
 <file path=word/footer1.xml><?xml version="1.0" encoding="utf-8"?>
-<w:ftr xmlns:wpc="http://schemas.microsoft.com/office/word/2010/wordprocessingCanvas" xmlns:cx="http://schemas.microsoft.com/office/drawing/2014/chartex" xmlns:cx1="http://schemas.microsoft.com/office/drawing/2015/9/8/chartex" xmlns:cx2="http://schemas.microsoft.com/office/drawing/2015/10/21/chartex" xmlns:cx3="http://schemas.microsoft.com/office/drawing/2016/5/9/chartex" xmlns:cx4="http://schemas.microsoft.com/office/drawing/2016/5/10/chartex" xmlns:cx5="http://schemas.microsoft.com/office/drawing/2016/5/11/chartex" xmlns:cx6="http://schemas.microsoft.com/office/drawing/2016/5/12/chartex" xmlns:cx7="http://schemas.microsoft.com/office/drawing/2016/5/13/chartex" xmlns:cx8="http://schemas.microsoft.com/office/drawing/2016/5/14/chartex" xmlns:mc="http://schemas.openxmlformats.org/markup-compatibility/2006" xmlns:aink="http://schemas.microsoft.com/office/drawing/2016/ink" xmlns:am3d="http://schemas.microsoft.com/office/drawing/2017/model3d" xmlns:o="urn:schemas-microsoft-com:office:office" xmlns:oel="http://schemas.microsoft.com/office/2019/extlst" xmlns:r="http://schemas.openxmlformats.org/officeDocument/2006/relationships" xmlns:m="http://schemas.openxmlformats.org/officeDocument/2006/math" xmlns:v="urn:schemas-microsoft-com:vml" xmlns:wp14="http://schemas.microsoft.com/office/word/2010/wordprocessingDrawing" xmlns:wp="http://schemas.openxmlformats.org/drawingml/2006/wordprocessingDrawing" xmlns:w10="urn:schemas-microsoft-com:office:word" xmlns:w="http://schemas.openxmlformats.org/wordprocessingml/2006/main" xmlns:w14="http://schemas.microsoft.com/office/word/2010/wordml" xmlns:w15="http://schemas.microsoft.com/office/word/2012/wordml" xmlns:w16cei="http://schemas.microsoft.com/office/word/2026/wordml/cei" xmlns:w16cex="http://schemas.microsoft.com/office/word/2018/wordml/cex" xmlns:w16cid="http://schemas.microsoft.com/office/word/2016/wordml/cid" xmlns:w16="http://schemas.microsoft.com/office/word/2018/wordml" xmlns:w16du="http://schemas.microsoft.com/office/word/2023/wordml/word16du" xmlns:w16sdtdh="http://schemas.microsoft.com/office/word/2020/wordml/sdtdatahash" xmlns:w16sdtfl="http://schemas.microsoft.com/office/word/2024/wordml/sdtformatlock" xmlns:w16se="http://schemas.microsoft.com/office/word/2015/wordml/symex" xmlns:wpg="http://schemas.microsoft.com/office/word/2010/wordprocessingGroup" xmlns:wpi="http://schemas.microsoft.com/office/word/2010/wordprocessingInk" xmlns:wne="http://schemas.microsoft.com/office/word/2006/wordml" xmlns:wps="http://schemas.microsoft.com/office/word/2010/wordprocessingShape" mc:Ignorable="w14 w15 w16se w16cid w16 w16cex w16sdtdh w16sdtfl w16du wp14">
+<w:ftr xmlns:wpc="http://schemas.microsoft.com/office/word/2010/wordprocessingCanvas" xmlns:cx="http://schemas.microsoft.com/office/drawing/2014/chartex" xmlns:cx1="http://schemas.microsoft.com/office/drawing/2015/9/8/chartex" xmlns:cx2="http://schemas.microsoft.com/office/drawing/2015/10/21/chartex" xmlns:cx3="http://schemas.microsoft.com/office/drawing/2016/5/9/chartex" xmlns:cx4="http://schemas.microsoft.com/office/drawing/2016/5/10/chartex" xmlns:cx5="http://schemas.microsoft.com/office/drawing/2016/5/11/chartex" xmlns:cx6="http://schemas.microsoft.com/office/drawing/2016/5/12/chartex" xmlns:cx7="http://schemas.microsoft.com/office/drawing/2016/5/13/chartex" xmlns:cx8="http://schemas.microsoft.com/office/drawing/2016/5/14/chartex" xmlns:mc="http://schemas.openxmlformats.org/markup-compatibility/2006" xmlns:aink="http://schemas.microsoft.com/office/drawing/2016/ink" xmlns:am3d="http://schemas.microsoft.com/office/drawing/2017/model3d" xmlns:o="urn:schemas-microsoft-com:office:office" xmlns:oel="http://schemas.microsoft.com/office/2019/extlst" xmlns:r="http://schemas.openxmlformats.org/officeDocument/2006/relationships" xmlns:m="http://schemas.openxmlformats.org/officeDocument/2006/math" xmlns:v="urn:schemas-microsoft-com:vml" xmlns:wp14="http://schemas.microsoft.com/office/word/2010/wordprocessingDrawing" xmlns:wp="http://schemas.openxmlformats.org/drawingml/2006/wordprocessingDrawing" xmlns:w10="urn:schemas-microsoft-com:office:word" xmlns:w="http://schemas.openxmlformats.org/wordprocessingml/2006/main" xmlns:w14="http://schemas.microsoft.com/office/word/2010/wordml" xmlns:w15="http://schemas.microsoft.com/office/word/2012/wordml" xmlns:w16cex="http://schemas.microsoft.com/office/word/2018/wordml/cex" xmlns:w16cid="http://schemas.microsoft.com/office/word/2016/wordml/cid" xmlns:w16="http://schemas.microsoft.com/office/word/2018/wordml" xmlns:w16du="http://schemas.microsoft.com/office/word/2023/wordml/word16du" xmlns:w16sdtdh="http://schemas.microsoft.com/office/word/2020/wordml/sdtdatahash" xmlns:w16sdtfl="http://schemas.microsoft.com/office/word/2024/wordml/sdtformatlock" xmlns:w16se="http://schemas.microsoft.com/office/word/2015/wordml/symex" xmlns:wpg="http://schemas.microsoft.com/office/word/2010/wordprocessingGroup" xmlns:wpi="http://schemas.microsoft.com/office/word/2010/wordprocessingInk" xmlns:wne="http://schemas.microsoft.com/office/word/2006/wordml" xmlns:wps="http://schemas.microsoft.com/office/word/2010/wordprocessingShape" mc:Ignorable="w14 w15 w16se w16cid w16 w16cex w16sdtdh w16sdtfl w16du wp14">
   <w:p>
     <w:pPr>
       <w:pStyle w:val="Footer"/>
@@ -11566,7 +10327,7 @@
 </file>
 
 <file path=word/footer2.xml><?xml version="1.0" encoding="utf-8"?>
-<w:ftr xmlns:wpc="http://schemas.microsoft.com/office/word/2010/wordprocessingCanvas" xmlns:cx="http://schemas.microsoft.com/office/drawing/2014/chartex" xmlns:cx1="http://schemas.microsoft.com/office/drawing/2015/9/8/chartex" xmlns:cx2="http://schemas.microsoft.com/office/drawing/2015/10/21/chartex" xmlns:cx3="http://schemas.microsoft.com/office/drawing/2016/5/9/chartex" xmlns:cx4="http://schemas.microsoft.com/office/drawing/2016/5/10/chartex" xmlns:cx5="http://schemas.microsoft.com/office/drawing/2016/5/11/chartex" xmlns:cx6="http://schemas.microsoft.com/office/drawing/2016/5/12/chartex" xmlns:cx7="http://schemas.microsoft.com/office/drawing/2016/5/13/chartex" xmlns:cx8="http://schemas.microsoft.com/office/drawing/2016/5/14/chartex" xmlns:mc="http://schemas.openxmlformats.org/markup-compatibility/2006" xmlns:aink="http://schemas.microsoft.com/office/drawing/2016/ink" xmlns:am3d="http://schemas.microsoft.com/office/drawing/2017/model3d" xmlns:o="urn:schemas-microsoft-com:office:office" xmlns:oel="http://schemas.microsoft.com/office/2019/extlst" xmlns:r="http://schemas.openxmlformats.org/officeDocument/2006/relationships" xmlns:m="http://schemas.openxmlformats.org/officeDocument/2006/math" xmlns:v="urn:schemas-microsoft-com:vml" xmlns:wp14="http://schemas.microsoft.com/office/word/2010/wordprocessingDrawing" xmlns:wp="http://schemas.openxmlformats.org/drawingml/2006/wordprocessingDrawing" xmlns:w10="urn:schemas-microsoft-com:office:word" xmlns:w="http://schemas.openxmlformats.org/wordprocessingml/2006/main" xmlns:w14="http://schemas.microsoft.com/office/word/2010/wordml" xmlns:w15="http://schemas.microsoft.com/office/word/2012/wordml" xmlns:w16cei="http://schemas.microsoft.com/office/word/2026/wordml/cei" xmlns:w16cex="http://schemas.microsoft.com/office/word/2018/wordml/cex" xmlns:w16cid="http://schemas.microsoft.com/office/word/2016/wordml/cid" xmlns:w16="http://schemas.microsoft.com/office/word/2018/wordml" xmlns:w16du="http://schemas.microsoft.com/office/word/2023/wordml/word16du" xmlns:w16sdtdh="http://schemas.microsoft.com/office/word/2020/wordml/sdtdatahash" xmlns:w16sdtfl="http://schemas.microsoft.com/office/word/2024/wordml/sdtformatlock" xmlns:w16se="http://schemas.microsoft.com/office/word/2015/wordml/symex" xmlns:wpg="http://schemas.microsoft.com/office/word/2010/wordprocessingGroup" xmlns:wpi="http://schemas.microsoft.com/office/word/2010/wordprocessingInk" xmlns:wne="http://schemas.microsoft.com/office/word/2006/wordml" xmlns:wps="http://schemas.microsoft.com/office/word/2010/wordprocessingShape" mc:Ignorable="w14 w15 w16se w16cid w16 w16cex w16sdtdh w16sdtfl w16du wp14">
+<w:ftr xmlns:wpc="http://schemas.microsoft.com/office/word/2010/wordprocessingCanvas" xmlns:cx="http://schemas.microsoft.com/office/drawing/2014/chartex" xmlns:cx1="http://schemas.microsoft.com/office/drawing/2015/9/8/chartex" xmlns:cx2="http://schemas.microsoft.com/office/drawing/2015/10/21/chartex" xmlns:cx3="http://schemas.microsoft.com/office/drawing/2016/5/9/chartex" xmlns:cx4="http://schemas.microsoft.com/office/drawing/2016/5/10/chartex" xmlns:cx5="http://schemas.microsoft.com/office/drawing/2016/5/11/chartex" xmlns:cx6="http://schemas.microsoft.com/office/drawing/2016/5/12/chartex" xmlns:cx7="http://schemas.microsoft.com/office/drawing/2016/5/13/chartex" xmlns:cx8="http://schemas.microsoft.com/office/drawing/2016/5/14/chartex" xmlns:mc="http://schemas.openxmlformats.org/markup-compatibility/2006" xmlns:aink="http://schemas.microsoft.com/office/drawing/2016/ink" xmlns:am3d="http://schemas.microsoft.com/office/drawing/2017/model3d" xmlns:o="urn:schemas-microsoft-com:office:office" xmlns:oel="http://schemas.microsoft.com/office/2019/extlst" xmlns:r="http://schemas.openxmlformats.org/officeDocument/2006/relationships" xmlns:m="http://schemas.openxmlformats.org/officeDocument/2006/math" xmlns:v="urn:schemas-microsoft-com:vml" xmlns:wp14="http://schemas.microsoft.com/office/word/2010/wordprocessingDrawing" xmlns:wp="http://schemas.openxmlformats.org/drawingml/2006/wordprocessingDrawing" xmlns:w10="urn:schemas-microsoft-com:office:word" xmlns:w="http://schemas.openxmlformats.org/wordprocessingml/2006/main" xmlns:w14="http://schemas.microsoft.com/office/word/2010/wordml" xmlns:w15="http://schemas.microsoft.com/office/word/2012/wordml" xmlns:w16cex="http://schemas.microsoft.com/office/word/2018/wordml/cex" xmlns:w16cid="http://schemas.microsoft.com/office/word/2016/wordml/cid" xmlns:w16="http://schemas.microsoft.com/office/word/2018/wordml" xmlns:w16du="http://schemas.microsoft.com/office/word/2023/wordml/word16du" xmlns:w16sdtdh="http://schemas.microsoft.com/office/word/2020/wordml/sdtdatahash" xmlns:w16sdtfl="http://schemas.microsoft.com/office/word/2024/wordml/sdtformatlock" xmlns:w16se="http://schemas.microsoft.com/office/word/2015/wordml/symex" xmlns:wpg="http://schemas.microsoft.com/office/word/2010/wordprocessingGroup" xmlns:wpi="http://schemas.microsoft.com/office/word/2010/wordprocessingInk" xmlns:wne="http://schemas.microsoft.com/office/word/2006/wordml" xmlns:wps="http://schemas.microsoft.com/office/word/2010/wordprocessingShape" mc:Ignorable="w14 w15 w16se w16cid w16 w16cex w16sdtdh w16sdtfl w16du wp14">
   <w:p>
     <w:pPr>
       <w:pStyle w:val="Footer"/>
@@ -11785,7 +10546,7 @@
             </wp:anchor>
           </w:drawing>
         </mc:Choice>
-        <mc:Fallback>
+        <mc:Fallback xmlns:w16cei="http://schemas.microsoft.com/office/word/2026/wordml/cei">
           <w:pict>
             <v:group w14:anchorId="5A2F42B2" id="Group 8" o:spid="_x0000_s1026" style="position:absolute;margin-left:0;margin-top:0;width:610.4pt;height:64.8pt;flip:y;z-index:251664384;mso-width-percent:1000;mso-height-percent:900;mso-position-horizontal:center;mso-position-horizontal-relative:page;mso-position-vertical:bottom;mso-position-vertical-relative:page;mso-width-percent:1000;mso-height-percent:900;mso-height-relative:bottom-margin-area" coordorigin="8,9" coordsize="15823,1439" o:gfxdata="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" o:allowincell="f">
               <v:shapetype id="_x0000_t32" coordsize="21600,21600" o:spt="32" o:oned="t" path="m,l21600,21600e" filled="f">
@@ -11869,7 +10630,7 @@
             </wp:anchor>
           </w:drawing>
         </mc:Choice>
-        <mc:Fallback>
+        <mc:Fallback xmlns:w16cei="http://schemas.microsoft.com/office/word/2026/wordml/cei">
           <w:pict>
             <v:rect w14:anchorId="30013B94" id="Rectangle 7" o:spid="_x0000_s1026" style="position:absolute;margin-left:0;margin-top:0;width:7.15pt;height:63.65pt;z-index:251663360;visibility:visible;mso-wrap-style:square;mso-width-percent:0;mso-height-percent:900;mso-wrap-distance-left:9pt;mso-wrap-distance-top:0;mso-wrap-distance-right:9pt;mso-wrap-distance-bottom:0;mso-position-horizontal:center;mso-position-horizontal-relative:left-margin-area;mso-position-vertical:bottom;mso-position-vertical-relative:page;mso-width-percent:0;mso-height-percent:900;mso-width-relative:page;mso-height-relative:bottom-margin-area;v-text-anchor:top" o:gfxdata="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" fillcolor="#4472c4 [3208]" strokecolor="#1f3763 [1608]">
               <w10:wrap anchorx="margin" anchory="page"/>
@@ -11947,7 +10708,7 @@
             </wp:anchor>
           </w:drawing>
         </mc:Choice>
-        <mc:Fallback>
+        <mc:Fallback xmlns:w16cei="http://schemas.microsoft.com/office/word/2026/wordml/cei">
           <w:pict>
             <v:rect w14:anchorId="6AC750AE" id="Rectangle 6" o:spid="_x0000_s1026" style="position:absolute;margin-left:0;margin-top:0;width:7.15pt;height:63.65pt;z-index:251662336;visibility:visible;mso-wrap-style:square;mso-width-percent:0;mso-height-percent:900;mso-wrap-distance-left:9pt;mso-wrap-distance-top:0;mso-wrap-distance-right:9pt;mso-wrap-distance-bottom:0;mso-position-horizontal:center;mso-position-horizontal-relative:right-margin-area;mso-position-vertical:bottom;mso-position-vertical-relative:page;mso-width-percent:0;mso-height-percent:900;mso-width-relative:page;mso-height-relative:bottom-margin-area;v-text-anchor:top" o:gfxdata="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" fillcolor="#4472c4 [3208]" strokecolor="#1f3763 [1608]">
               <w10:wrap anchorx="margin" anchory="page"/>
@@ -11966,7 +10727,7 @@
 </file>
 
 <file path=word/footer3.xml><?xml version="1.0" encoding="utf-8"?>
-<w:ftr xmlns:wpc="http://schemas.microsoft.com/office/word/2010/wordprocessingCanvas" xmlns:cx="http://schemas.microsoft.com/office/drawing/2014/chartex" xmlns:cx1="http://schemas.microsoft.com/office/drawing/2015/9/8/chartex" xmlns:cx2="http://schemas.microsoft.com/office/drawing/2015/10/21/chartex" xmlns:cx3="http://schemas.microsoft.com/office/drawing/2016/5/9/chartex" xmlns:cx4="http://schemas.microsoft.com/office/drawing/2016/5/10/chartex" xmlns:cx5="http://schemas.microsoft.com/office/drawing/2016/5/11/chartex" xmlns:cx6="http://schemas.microsoft.com/office/drawing/2016/5/12/chartex" xmlns:cx7="http://schemas.microsoft.com/office/drawing/2016/5/13/chartex" xmlns:cx8="http://schemas.microsoft.com/office/drawing/2016/5/14/chartex" xmlns:mc="http://schemas.openxmlformats.org/markup-compatibility/2006" xmlns:aink="http://schemas.microsoft.com/office/drawing/2016/ink" xmlns:am3d="http://schemas.microsoft.com/office/drawing/2017/model3d" xmlns:o="urn:schemas-microsoft-com:office:office" xmlns:oel="http://schemas.microsoft.com/office/2019/extlst" xmlns:r="http://schemas.openxmlformats.org/officeDocument/2006/relationships" xmlns:m="http://schemas.openxmlformats.org/officeDocument/2006/math" xmlns:v="urn:schemas-microsoft-com:vml" xmlns:wp14="http://schemas.microsoft.com/office/word/2010/wordprocessingDrawing" xmlns:wp="http://schemas.openxmlformats.org/drawingml/2006/wordprocessingDrawing" xmlns:w10="urn:schemas-microsoft-com:office:word" xmlns:w="http://schemas.openxmlformats.org/wordprocessingml/2006/main" xmlns:w14="http://schemas.microsoft.com/office/word/2010/wordml" xmlns:w15="http://schemas.microsoft.com/office/word/2012/wordml" xmlns:w16cei="http://schemas.microsoft.com/office/word/2026/wordml/cei" xmlns:w16cex="http://schemas.microsoft.com/office/word/2018/wordml/cex" xmlns:w16cid="http://schemas.microsoft.com/office/word/2016/wordml/cid" xmlns:w16="http://schemas.microsoft.com/office/word/2018/wordml" xmlns:w16du="http://schemas.microsoft.com/office/word/2023/wordml/word16du" xmlns:w16sdtdh="http://schemas.microsoft.com/office/word/2020/wordml/sdtdatahash" xmlns:w16sdtfl="http://schemas.microsoft.com/office/word/2024/wordml/sdtformatlock" xmlns:w16se="http://schemas.microsoft.com/office/word/2015/wordml/symex" xmlns:wpg="http://schemas.microsoft.com/office/word/2010/wordprocessingGroup" xmlns:wpi="http://schemas.microsoft.com/office/word/2010/wordprocessingInk" xmlns:wne="http://schemas.microsoft.com/office/word/2006/wordml" xmlns:wps="http://schemas.microsoft.com/office/word/2010/wordprocessingShape" mc:Ignorable="w14 w15 w16se w16cid w16 w16cex w16sdtdh w16sdtfl w16du wp14">
+<w:ftr xmlns:wpc="http://schemas.microsoft.com/office/word/2010/wordprocessingCanvas" xmlns:cx="http://schemas.microsoft.com/office/drawing/2014/chartex" xmlns:cx1="http://schemas.microsoft.com/office/drawing/2015/9/8/chartex" xmlns:cx2="http://schemas.microsoft.com/office/drawing/2015/10/21/chartex" xmlns:cx3="http://schemas.microsoft.com/office/drawing/2016/5/9/chartex" xmlns:cx4="http://schemas.microsoft.com/office/drawing/2016/5/10/chartex" xmlns:cx5="http://schemas.microsoft.com/office/drawing/2016/5/11/chartex" xmlns:cx6="http://schemas.microsoft.com/office/drawing/2016/5/12/chartex" xmlns:cx7="http://schemas.microsoft.com/office/drawing/2016/5/13/chartex" xmlns:cx8="http://schemas.microsoft.com/office/drawing/2016/5/14/chartex" xmlns:mc="http://schemas.openxmlformats.org/markup-compatibility/2006" xmlns:aink="http://schemas.microsoft.com/office/drawing/2016/ink" xmlns:am3d="http://schemas.microsoft.com/office/drawing/2017/model3d" xmlns:o="urn:schemas-microsoft-com:office:office" xmlns:oel="http://schemas.microsoft.com/office/2019/extlst" xmlns:r="http://schemas.openxmlformats.org/officeDocument/2006/relationships" xmlns:m="http://schemas.openxmlformats.org/officeDocument/2006/math" xmlns:v="urn:schemas-microsoft-com:vml" xmlns:wp14="http://schemas.microsoft.com/office/word/2010/wordprocessingDrawing" xmlns:wp="http://schemas.openxmlformats.org/drawingml/2006/wordprocessingDrawing" xmlns:w10="urn:schemas-microsoft-com:office:word" xmlns:w="http://schemas.openxmlformats.org/wordprocessingml/2006/main" xmlns:w14="http://schemas.microsoft.com/office/word/2010/wordml" xmlns:w15="http://schemas.microsoft.com/office/word/2012/wordml" xmlns:w16cex="http://schemas.microsoft.com/office/word/2018/wordml/cex" xmlns:w16cid="http://schemas.microsoft.com/office/word/2016/wordml/cid" xmlns:w16="http://schemas.microsoft.com/office/word/2018/wordml" xmlns:w16du="http://schemas.microsoft.com/office/word/2023/wordml/word16du" xmlns:w16sdtdh="http://schemas.microsoft.com/office/word/2020/wordml/sdtdatahash" xmlns:w16sdtfl="http://schemas.microsoft.com/office/word/2024/wordml/sdtformatlock" xmlns:w16se="http://schemas.microsoft.com/office/word/2015/wordml/symex" xmlns:wpg="http://schemas.microsoft.com/office/word/2010/wordprocessingGroup" xmlns:wpi="http://schemas.microsoft.com/office/word/2010/wordprocessingInk" xmlns:wne="http://schemas.microsoft.com/office/word/2006/wordml" xmlns:wps="http://schemas.microsoft.com/office/word/2010/wordprocessingShape" mc:Ignorable="w14 w15 w16se w16cid w16 w16cex w16sdtdh w16sdtfl w16du wp14">
   <w:p>
     <w:pPr>
       <w:pStyle w:val="Footer"/>
@@ -11976,7 +10737,7 @@
 </file>
 
 <file path=word/footnotes.xml><?xml version="1.0" encoding="utf-8"?>
-<w:footnotes xmlns:wpc="http://schemas.microsoft.com/office/word/2010/wordprocessingCanvas" xmlns:cx="http://schemas.microsoft.com/office/drawing/2014/chartex" xmlns:cx1="http://schemas.microsoft.com/office/drawing/2015/9/8/chartex" xmlns:cx2="http://schemas.microsoft.com/office/drawing/2015/10/21/chartex" xmlns:cx3="http://schemas.microsoft.com/office/drawing/2016/5/9/chartex" xmlns:cx4="http://schemas.microsoft.com/office/drawing/2016/5/10/chartex" xmlns:cx5="http://schemas.microsoft.com/office/drawing/2016/5/11/chartex" xmlns:cx6="http://schemas.microsoft.com/office/drawing/2016/5/12/chartex" xmlns:cx7="http://schemas.microsoft.com/office/drawing/2016/5/13/chartex" xmlns:cx8="http://schemas.microsoft.com/office/drawing/2016/5/14/chartex" xmlns:mc="http://schemas.openxmlformats.org/markup-compatibility/2006" xmlns:aink="http://schemas.microsoft.com/office/drawing/2016/ink" xmlns:am3d="http://schemas.microsoft.com/office/drawing/2017/model3d" xmlns:o="urn:schemas-microsoft-com:office:office" xmlns:oel="http://schemas.microsoft.com/office/2019/extlst" xmlns:r="http://schemas.openxmlformats.org/officeDocument/2006/relationships" xmlns:m="http://schemas.openxmlformats.org/officeDocument/2006/math" xmlns:v="urn:schemas-microsoft-com:vml" xmlns:wp14="http://schemas.microsoft.com/office/word/2010/wordprocessingDrawing" xmlns:wp="http://schemas.openxmlformats.org/drawingml/2006/wordprocessingDrawing" xmlns:w10="urn:schemas-microsoft-com:office:word" xmlns:w="http://schemas.openxmlformats.org/wordprocessingml/2006/main" xmlns:w14="http://schemas.microsoft.com/office/word/2010/wordml" xmlns:w15="http://schemas.microsoft.com/office/word/2012/wordml" xmlns:w16cei="http://schemas.microsoft.com/office/word/2026/wordml/cei" xmlns:w16cex="http://schemas.microsoft.com/office/word/2018/wordml/cex" xmlns:w16cid="http://schemas.microsoft.com/office/word/2016/wordml/cid" xmlns:w16="http://schemas.microsoft.com/office/word/2018/wordml" xmlns:w16du="http://schemas.microsoft.com/office/word/2023/wordml/word16du" xmlns:w16sdtdh="http://schemas.microsoft.com/office/word/2020/wordml/sdtdatahash" xmlns:w16sdtfl="http://schemas.microsoft.com/office/word/2024/wordml/sdtformatlock" xmlns:w16se="http://schemas.microsoft.com/office/word/2015/wordml/symex" xmlns:wpg="http://schemas.microsoft.com/office/word/2010/wordprocessingGroup" xmlns:wpi="http://schemas.microsoft.com/office/word/2010/wordprocessingInk" xmlns:wne="http://schemas.microsoft.com/office/word/2006/wordml" xmlns:wps="http://schemas.microsoft.com/office/word/2010/wordprocessingShape" mc:Ignorable="w14 w15 w16se w16cid w16 w16cex w16sdtdh w16sdtfl w16du wp14">
+<w:footnotes xmlns:wpc="http://schemas.microsoft.com/office/word/2010/wordprocessingCanvas" xmlns:cx="http://schemas.microsoft.com/office/drawing/2014/chartex" xmlns:cx1="http://schemas.microsoft.com/office/drawing/2015/9/8/chartex" xmlns:cx2="http://schemas.microsoft.com/office/drawing/2015/10/21/chartex" xmlns:cx3="http://schemas.microsoft.com/office/drawing/2016/5/9/chartex" xmlns:cx4="http://schemas.microsoft.com/office/drawing/2016/5/10/chartex" xmlns:cx5="http://schemas.microsoft.com/office/drawing/2016/5/11/chartex" xmlns:cx6="http://schemas.microsoft.com/office/drawing/2016/5/12/chartex" xmlns:cx7="http://schemas.microsoft.com/office/drawing/2016/5/13/chartex" xmlns:cx8="http://schemas.microsoft.com/office/drawing/2016/5/14/chartex" xmlns:mc="http://schemas.openxmlformats.org/markup-compatibility/2006" xmlns:aink="http://schemas.microsoft.com/office/drawing/2016/ink" xmlns:am3d="http://schemas.microsoft.com/office/drawing/2017/model3d" xmlns:o="urn:schemas-microsoft-com:office:office" xmlns:oel="http://schemas.microsoft.com/office/2019/extlst" xmlns:r="http://schemas.openxmlformats.org/officeDocument/2006/relationships" xmlns:m="http://schemas.openxmlformats.org/officeDocument/2006/math" xmlns:v="urn:schemas-microsoft-com:vml" xmlns:wp14="http://schemas.microsoft.com/office/word/2010/wordprocessingDrawing" xmlns:wp="http://schemas.openxmlformats.org/drawingml/2006/wordprocessingDrawing" xmlns:w10="urn:schemas-microsoft-com:office:word" xmlns:w="http://schemas.openxmlformats.org/wordprocessingml/2006/main" xmlns:w14="http://schemas.microsoft.com/office/word/2010/wordml" xmlns:w15="http://schemas.microsoft.com/office/word/2012/wordml" xmlns:w16cex="http://schemas.microsoft.com/office/word/2018/wordml/cex" xmlns:w16cid="http://schemas.microsoft.com/office/word/2016/wordml/cid" xmlns:w16="http://schemas.microsoft.com/office/word/2018/wordml" xmlns:w16du="http://schemas.microsoft.com/office/word/2023/wordml/word16du" xmlns:w16sdtdh="http://schemas.microsoft.com/office/word/2020/wordml/sdtdatahash" xmlns:w16sdtfl="http://schemas.microsoft.com/office/word/2024/wordml/sdtformatlock" xmlns:w16se="http://schemas.microsoft.com/office/word/2015/wordml/symex" xmlns:wpg="http://schemas.microsoft.com/office/word/2010/wordprocessingGroup" xmlns:wpi="http://schemas.microsoft.com/office/word/2010/wordprocessingInk" xmlns:wne="http://schemas.microsoft.com/office/word/2006/wordml" xmlns:wps="http://schemas.microsoft.com/office/word/2010/wordprocessingShape" mc:Ignorable="w14 w15 w16se w16cid w16 w16cex w16sdtdh w16sdtfl w16du wp14">
   <w:footnote w:type="separator" w:id="-1">
     <w:p>
       <w:pPr>
@@ -12001,7 +10762,7 @@
 </file>
 
 <file path=word/header1.xml><?xml version="1.0" encoding="utf-8"?>
-<w:hdr xmlns:wpc="http://schemas.microsoft.com/office/word/2010/wordprocessingCanvas" xmlns:cx="http://schemas.microsoft.com/office/drawing/2014/chartex" xmlns:cx1="http://schemas.microsoft.com/office/drawing/2015/9/8/chartex" xmlns:cx2="http://schemas.microsoft.com/office/drawing/2015/10/21/chartex" xmlns:cx3="http://schemas.microsoft.com/office/drawing/2016/5/9/chartex" xmlns:cx4="http://schemas.microsoft.com/office/drawing/2016/5/10/chartex" xmlns:cx5="http://schemas.microsoft.com/office/drawing/2016/5/11/chartex" xmlns:cx6="http://schemas.microsoft.com/office/drawing/2016/5/12/chartex" xmlns:cx7="http://schemas.microsoft.com/office/drawing/2016/5/13/chartex" xmlns:cx8="http://schemas.microsoft.com/office/drawing/2016/5/14/chartex" xmlns:mc="http://schemas.openxmlformats.org/markup-compatibility/2006" xmlns:aink="http://schemas.microsoft.com/office/drawing/2016/ink" xmlns:am3d="http://schemas.microsoft.com/office/drawing/2017/model3d" xmlns:o="urn:schemas-microsoft-com:office:office" xmlns:oel="http://schemas.microsoft.com/office/2019/extlst" xmlns:r="http://schemas.openxmlformats.org/officeDocument/2006/relationships" xmlns:m="http://schemas.openxmlformats.org/officeDocument/2006/math" xmlns:v="urn:schemas-microsoft-com:vml" xmlns:wp14="http://schemas.microsoft.com/office/word/2010/wordprocessingDrawing" xmlns:wp="http://schemas.openxmlformats.org/drawingml/2006/wordprocessingDrawing" xmlns:w10="urn:schemas-microsoft-com:office:word" xmlns:w="http://schemas.openxmlformats.org/wordprocessingml/2006/main" xmlns:w14="http://schemas.microsoft.com/office/word/2010/wordml" xmlns:w15="http://schemas.microsoft.com/office/word/2012/wordml" xmlns:w16cei="http://schemas.microsoft.com/office/word/2026/wordml/cei" xmlns:w16cex="http://schemas.microsoft.com/office/word/2018/wordml/cex" xmlns:w16cid="http://schemas.microsoft.com/office/word/2016/wordml/cid" xmlns:w16="http://schemas.microsoft.com/office/word/2018/wordml" xmlns:w16du="http://schemas.microsoft.com/office/word/2023/wordml/word16du" xmlns:w16sdtdh="http://schemas.microsoft.com/office/word/2020/wordml/sdtdatahash" xmlns:w16sdtfl="http://schemas.microsoft.com/office/word/2024/wordml/sdtformatlock" xmlns:w16se="http://schemas.microsoft.com/office/word/2015/wordml/symex" xmlns:wpg="http://schemas.microsoft.com/office/word/2010/wordprocessingGroup" xmlns:wpi="http://schemas.microsoft.com/office/word/2010/wordprocessingInk" xmlns:wne="http://schemas.microsoft.com/office/word/2006/wordml" xmlns:wps="http://schemas.microsoft.com/office/word/2010/wordprocessingShape" mc:Ignorable="w14 w15 w16se w16cid w16 w16cex w16sdtdh w16sdtfl w16du wp14">
+<w:hdr xmlns:wpc="http://schemas.microsoft.com/office/word/2010/wordprocessingCanvas" xmlns:cx="http://schemas.microsoft.com/office/drawing/2014/chartex" xmlns:cx1="http://schemas.microsoft.com/office/drawing/2015/9/8/chartex" xmlns:cx2="http://schemas.microsoft.com/office/drawing/2015/10/21/chartex" xmlns:cx3="http://schemas.microsoft.com/office/drawing/2016/5/9/chartex" xmlns:cx4="http://schemas.microsoft.com/office/drawing/2016/5/10/chartex" xmlns:cx5="http://schemas.microsoft.com/office/drawing/2016/5/11/chartex" xmlns:cx6="http://schemas.microsoft.com/office/drawing/2016/5/12/chartex" xmlns:cx7="http://schemas.microsoft.com/office/drawing/2016/5/13/chartex" xmlns:cx8="http://schemas.microsoft.com/office/drawing/2016/5/14/chartex" xmlns:mc="http://schemas.openxmlformats.org/markup-compatibility/2006" xmlns:aink="http://schemas.microsoft.com/office/drawing/2016/ink" xmlns:am3d="http://schemas.microsoft.com/office/drawing/2017/model3d" xmlns:o="urn:schemas-microsoft-com:office:office" xmlns:oel="http://schemas.microsoft.com/office/2019/extlst" xmlns:r="http://schemas.openxmlformats.org/officeDocument/2006/relationships" xmlns:m="http://schemas.openxmlformats.org/officeDocument/2006/math" xmlns:v="urn:schemas-microsoft-com:vml" xmlns:wp14="http://schemas.microsoft.com/office/word/2010/wordprocessingDrawing" xmlns:wp="http://schemas.openxmlformats.org/drawingml/2006/wordprocessingDrawing" xmlns:w10="urn:schemas-microsoft-com:office:word" xmlns:w="http://schemas.openxmlformats.org/wordprocessingml/2006/main" xmlns:w14="http://schemas.microsoft.com/office/word/2010/wordml" xmlns:w15="http://schemas.microsoft.com/office/word/2012/wordml" xmlns:w16cex="http://schemas.microsoft.com/office/word/2018/wordml/cex" xmlns:w16cid="http://schemas.microsoft.com/office/word/2016/wordml/cid" xmlns:w16="http://schemas.microsoft.com/office/word/2018/wordml" xmlns:w16du="http://schemas.microsoft.com/office/word/2023/wordml/word16du" xmlns:w16sdtdh="http://schemas.microsoft.com/office/word/2020/wordml/sdtdatahash" xmlns:w16sdtfl="http://schemas.microsoft.com/office/word/2024/wordml/sdtformatlock" xmlns:w16se="http://schemas.microsoft.com/office/word/2015/wordml/symex" xmlns:wpg="http://schemas.microsoft.com/office/word/2010/wordprocessingGroup" xmlns:wpi="http://schemas.microsoft.com/office/word/2010/wordprocessingInk" xmlns:wne="http://schemas.microsoft.com/office/word/2006/wordml" xmlns:wps="http://schemas.microsoft.com/office/word/2010/wordprocessingShape" mc:Ignorable="w14 w15 w16se w16cid w16 w16cex w16sdtdh w16sdtfl w16du wp14">
   <w:p>
     <w:pPr>
       <w:pStyle w:val="Header"/>
@@ -12011,7 +10772,7 @@
 </file>
 
 <file path=word/header2.xml><?xml version="1.0" encoding="utf-8"?>
-<w:hdr xmlns:wpc="http://schemas.microsoft.com/office/word/2010/wordprocessingCanvas" xmlns:cx="http://schemas.microsoft.com/office/drawing/2014/chartex" xmlns:cx1="http://schemas.microsoft.com/office/drawing/2015/9/8/chartex" xmlns:cx2="http://schemas.microsoft.com/office/drawing/2015/10/21/chartex" xmlns:cx3="http://schemas.microsoft.com/office/drawing/2016/5/9/chartex" xmlns:cx4="http://schemas.microsoft.com/office/drawing/2016/5/10/chartex" xmlns:cx5="http://schemas.microsoft.com/office/drawing/2016/5/11/chartex" xmlns:cx6="http://schemas.microsoft.com/office/drawing/2016/5/12/chartex" xmlns:cx7="http://schemas.microsoft.com/office/drawing/2016/5/13/chartex" xmlns:cx8="http://schemas.microsoft.com/office/drawing/2016/5/14/chartex" xmlns:mc="http://schemas.openxmlformats.org/markup-compatibility/2006" xmlns:aink="http://schemas.microsoft.com/office/drawing/2016/ink" xmlns:am3d="http://schemas.microsoft.com/office/drawing/2017/model3d" xmlns:o="urn:schemas-microsoft-com:office:office" xmlns:oel="http://schemas.microsoft.com/office/2019/extlst" xmlns:r="http://schemas.openxmlformats.org/officeDocument/2006/relationships" xmlns:m="http://schemas.openxmlformats.org/officeDocument/2006/math" xmlns:v="urn:schemas-microsoft-com:vml" xmlns:wp14="http://schemas.microsoft.com/office/word/2010/wordprocessingDrawing" xmlns:wp="http://schemas.openxmlformats.org/drawingml/2006/wordprocessingDrawing" xmlns:w10="urn:schemas-microsoft-com:office:word" xmlns:w="http://schemas.openxmlformats.org/wordprocessingml/2006/main" xmlns:w14="http://schemas.microsoft.com/office/word/2010/wordml" xmlns:w15="http://schemas.microsoft.com/office/word/2012/wordml" xmlns:w16cei="http://schemas.microsoft.com/office/word/2026/wordml/cei" xmlns:w16cex="http://schemas.microsoft.com/office/word/2018/wordml/cex" xmlns:w16cid="http://schemas.microsoft.com/office/word/2016/wordml/cid" xmlns:w16="http://schemas.microsoft.com/office/word/2018/wordml" xmlns:w16du="http://schemas.microsoft.com/office/word/2023/wordml/word16du" xmlns:w16sdtdh="http://schemas.microsoft.com/office/word/2020/wordml/sdtdatahash" xmlns:w16sdtfl="http://schemas.microsoft.com/office/word/2024/wordml/sdtformatlock" xmlns:w16se="http://schemas.microsoft.com/office/word/2015/wordml/symex" xmlns:wpg="http://schemas.microsoft.com/office/word/2010/wordprocessingGroup" xmlns:wpi="http://schemas.microsoft.com/office/word/2010/wordprocessingInk" xmlns:wne="http://schemas.microsoft.com/office/word/2006/wordml" xmlns:wps="http://schemas.microsoft.com/office/word/2010/wordprocessingShape" xmlns:a="http://schemas.openxmlformats.org/drawingml/2006/main" xmlns:a14="http://schemas.microsoft.com/office/drawing/2010/main" mc:Ignorable="w14 w15 w16se w16cid w16 w16cex w16sdtdh w16sdtfl w16du wp14">
+<w:hdr xmlns:wpc="http://schemas.microsoft.com/office/word/2010/wordprocessingCanvas" xmlns:cx="http://schemas.microsoft.com/office/drawing/2014/chartex" xmlns:cx1="http://schemas.microsoft.com/office/drawing/2015/9/8/chartex" xmlns:cx2="http://schemas.microsoft.com/office/drawing/2015/10/21/chartex" xmlns:cx3="http://schemas.microsoft.com/office/drawing/2016/5/9/chartex" xmlns:cx4="http://schemas.microsoft.com/office/drawing/2016/5/10/chartex" xmlns:cx5="http://schemas.microsoft.com/office/drawing/2016/5/11/chartex" xmlns:cx6="http://schemas.microsoft.com/office/drawing/2016/5/12/chartex" xmlns:cx7="http://schemas.microsoft.com/office/drawing/2016/5/13/chartex" xmlns:cx8="http://schemas.microsoft.com/office/drawing/2016/5/14/chartex" xmlns:mc="http://schemas.openxmlformats.org/markup-compatibility/2006" xmlns:aink="http://schemas.microsoft.com/office/drawing/2016/ink" xmlns:am3d="http://schemas.microsoft.com/office/drawing/2017/model3d" xmlns:o="urn:schemas-microsoft-com:office:office" xmlns:oel="http://schemas.microsoft.com/office/2019/extlst" xmlns:r="http://schemas.openxmlformats.org/officeDocument/2006/relationships" xmlns:m="http://schemas.openxmlformats.org/officeDocument/2006/math" xmlns:v="urn:schemas-microsoft-com:vml" xmlns:wp14="http://schemas.microsoft.com/office/word/2010/wordprocessingDrawing" xmlns:wp="http://schemas.openxmlformats.org/drawingml/2006/wordprocessingDrawing" xmlns:w10="urn:schemas-microsoft-com:office:word" xmlns:w="http://schemas.openxmlformats.org/wordprocessingml/2006/main" xmlns:w14="http://schemas.microsoft.com/office/word/2010/wordml" xmlns:w15="http://schemas.microsoft.com/office/word/2012/wordml" xmlns:w16cex="http://schemas.microsoft.com/office/word/2018/wordml/cex" xmlns:w16cid="http://schemas.microsoft.com/office/word/2016/wordml/cid" xmlns:w16="http://schemas.microsoft.com/office/word/2018/wordml" xmlns:w16du="http://schemas.microsoft.com/office/word/2023/wordml/word16du" xmlns:w16sdtdh="http://schemas.microsoft.com/office/word/2020/wordml/sdtdatahash" xmlns:w16sdtfl="http://schemas.microsoft.com/office/word/2024/wordml/sdtformatlock" xmlns:w16se="http://schemas.microsoft.com/office/word/2015/wordml/symex" xmlns:wpg="http://schemas.microsoft.com/office/word/2010/wordprocessingGroup" xmlns:wpi="http://schemas.microsoft.com/office/word/2010/wordprocessingInk" xmlns:wne="http://schemas.microsoft.com/office/word/2006/wordml" xmlns:wps="http://schemas.microsoft.com/office/word/2010/wordprocessingShape" mc:Ignorable="w14 w15 w16se w16cid w16 w16cex w16sdtdh w16sdtfl w16du wp14">
   <w:p>
     <w:pPr>
       <w:pStyle w:val="Header"/>
@@ -12039,21 +10800,14 @@
         <w:dataBinding w:prefixMappings="xmlns:ns0='http://schemas.openxmlformats.org/package/2006/metadata/core-properties' xmlns:ns1='http://purl.org/dc/elements/1.1/'" w:xpath="/ns0:coreProperties[1]/ns1:title[1]" w:storeItemID="{6C3C8BC8-F283-45AE-878A-BAB7291924A1}"/>
         <w:text/>
       </w:sdtPr>
+      <w:sdtEndPr/>
       <w:sdtContent>
         <w:r>
           <w:rPr>
             <w:rFonts w:asciiTheme="majorHAnsi" w:hAnsiTheme="majorHAnsi"/>
           </w:rPr>
-          <w:t xml:space="preserve">YCompany – eClaims</w:t>
+          <w:t>YCompany – eClaims</w:t>
         </w:r>
-        <w:proofErr w:type="spellStart"/>
-        <w:r>
-          <w:rPr>
-            <w:rFonts w:asciiTheme="majorHAnsi" w:hAnsiTheme="majorHAnsi"/>
-          </w:rPr>
-          <w:t/>
-        </w:r>
-        <w:proofErr w:type="spellEnd"/>
       </w:sdtContent>
     </w:sdt>
     <w:r>
@@ -12075,6 +10829,7 @@
         <w:dataBinding w:prefixMappings="xmlns:ns0='http://schemas.openxmlformats.org/package/2006/metadata/core-properties' xmlns:ns1='http://purl.org/dc/elements/1.1/'" w:xpath="/ns0:coreProperties[1]/ns1:subject[1]" w:storeItemID="{6C3C8BC8-F283-45AE-878A-BAB7291924A1}"/>
         <w:text/>
       </w:sdtPr>
+      <w:sdtEndPr/>
       <w:sdtContent>
         <w:r>
           <w:rPr>
@@ -12108,9 +10863,9 @@
               <wp:wrapNone/>
               <wp:docPr id="11" name="Group 3"/>
               <wp:cNvGraphicFramePr>
-                <a:graphicFrameLocks/>
+                <a:graphicFrameLocks xmlns:a="http://schemas.openxmlformats.org/drawingml/2006/main"/>
               </wp:cNvGraphicFramePr>
-              <a:graphic>
+              <a:graphic xmlns:a="http://schemas.openxmlformats.org/drawingml/2006/main">
                 <a:graphicData uri="http://schemas.microsoft.com/office/word/2010/wordprocessingGroup">
                   <wpg:wgp>
                     <wpg:cNvGrpSpPr>
@@ -12151,7 +10906,7 @@
                         </a:ln>
                         <a:extLst>
                           <a:ext uri="{909E8E84-426E-40DD-AFC4-6F175D3DCCD1}">
-                            <a14:hiddenFill>
+                            <a14:hiddenFill xmlns:a14="http://schemas.microsoft.com/office/drawing/2010/main">
                               <a:noFill/>
                             </a14:hiddenFill>
                           </a:ext>
@@ -12178,14 +10933,14 @@
                         </a:ln>
                         <a:extLst>
                           <a:ext uri="{909E8E84-426E-40DD-AFC4-6F175D3DCCD1}">
-                            <a14:hiddenFill>
+                            <a14:hiddenFill xmlns:a14="http://schemas.microsoft.com/office/drawing/2010/main">
                               <a:solidFill>
                                 <a:srgbClr val="FFFFFF"/>
                               </a:solidFill>
                             </a14:hiddenFill>
                           </a:ext>
                           <a:ext uri="{91240B29-F687-4F45-9708-019B960494DF}">
-                            <a14:hiddenLine w="9525">
+                            <a14:hiddenLine xmlns:a14="http://schemas.microsoft.com/office/drawing/2010/main" w="9525">
                               <a:solidFill>
                                 <a:srgbClr val="000000"/>
                               </a:solidFill>
@@ -12212,7 +10967,7 @@
             </wp:anchor>
           </w:drawing>
         </mc:Choice>
-        <mc:Fallback>
+        <mc:Fallback xmlns:w16cei="http://schemas.microsoft.com/office/word/2026/wordml/cei" xmlns:a="http://schemas.openxmlformats.org/drawingml/2006/main" xmlns:a14="http://schemas.microsoft.com/office/drawing/2010/main">
           <w:pict>
             <v:group w14:anchorId="7E66157F" id="Group 3" o:spid="_x0000_s1026" style="position:absolute;margin-left:0;margin-top:0;width:610.4pt;height:64.8pt;z-index:251661312;mso-width-percent:1000;mso-height-percent:900;mso-position-horizontal:center;mso-position-horizontal-relative:page;mso-position-vertical:top;mso-position-vertical-relative:page;mso-width-percent:1000;mso-height-percent:900;mso-height-relative:top-margin-area" coordorigin="8,9" coordsize="15823,1439" o:gfxdata="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">
               <v:shapetype id="_x0000_t32" coordsize="21600,21600" o:spt="32" o:oned="t" path="m,l21600,21600e" filled="f">
@@ -12248,9 +11003,9 @@
               <wp:wrapNone/>
               <wp:docPr id="10" name="Rectangle 2"/>
               <wp:cNvGraphicFramePr>
-                <a:graphicFrameLocks/>
+                <a:graphicFrameLocks xmlns:a="http://schemas.openxmlformats.org/drawingml/2006/main"/>
               </wp:cNvGraphicFramePr>
-              <a:graphic>
+              <a:graphic xmlns:a="http://schemas.openxmlformats.org/drawingml/2006/main">
                 <a:graphicData uri="http://schemas.microsoft.com/office/word/2010/wordprocessingShape">
                   <wps:wsp>
                     <wps:cNvSpPr>
@@ -12297,7 +11052,7 @@
             </wp:anchor>
           </w:drawing>
         </mc:Choice>
-        <mc:Fallback>
+        <mc:Fallback xmlns:w16cei="http://schemas.microsoft.com/office/word/2026/wordml/cei" xmlns:a="http://schemas.openxmlformats.org/drawingml/2006/main" xmlns:a14="http://schemas.microsoft.com/office/drawing/2010/main">
           <w:pict>
             <v:rect w14:anchorId="0ECB8EDB" id="Rectangle 2" o:spid="_x0000_s1026" style="position:absolute;margin-left:0;margin-top:0;width:7.15pt;height:62.95pt;z-index:251660288;visibility:visible;mso-wrap-style:square;mso-width-percent:0;mso-height-percent:900;mso-wrap-distance-left:9pt;mso-wrap-distance-top:0;mso-wrap-distance-right:9pt;mso-wrap-distance-bottom:0;mso-position-horizontal:center;mso-position-horizontal-relative:right-margin-area;mso-position-vertical:top;mso-position-vertical-relative:page;mso-width-percent:0;mso-height-percent:900;mso-width-relative:page;mso-height-relative:top-margin-area;v-text-anchor:top" o:gfxdata="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" fillcolor="#4472c4 [3208]" strokecolor="#1f3763 [1608]">
               <w10:wrap anchorx="margin" anchory="page"/>
@@ -12327,9 +11082,9 @@
               <wp:wrapNone/>
               <wp:docPr id="9" name="Rectangle 1"/>
               <wp:cNvGraphicFramePr>
-                <a:graphicFrameLocks/>
+                <a:graphicFrameLocks xmlns:a="http://schemas.openxmlformats.org/drawingml/2006/main"/>
               </wp:cNvGraphicFramePr>
-              <a:graphic>
+              <a:graphic xmlns:a="http://schemas.openxmlformats.org/drawingml/2006/main">
                 <a:graphicData uri="http://schemas.microsoft.com/office/word/2010/wordprocessingShape">
                   <wps:wsp>
                     <wps:cNvSpPr>
@@ -12376,7 +11131,7 @@
             </wp:anchor>
           </w:drawing>
         </mc:Choice>
-        <mc:Fallback>
+        <mc:Fallback xmlns:w16cei="http://schemas.microsoft.com/office/word/2026/wordml/cei" xmlns:a="http://schemas.openxmlformats.org/drawingml/2006/main" xmlns:a14="http://schemas.microsoft.com/office/drawing/2010/main">
           <w:pict>
             <v:rect w14:anchorId="70E789E4" id="Rectangle 1" o:spid="_x0000_s1026" style="position:absolute;margin-left:0;margin-top:0;width:7.15pt;height:62.95pt;z-index:251659264;visibility:visible;mso-wrap-style:square;mso-width-percent:0;mso-height-percent:900;mso-wrap-distance-left:9pt;mso-wrap-distance-top:0;mso-wrap-distance-right:9pt;mso-wrap-distance-bottom:0;mso-position-horizontal:center;mso-position-horizontal-relative:left-margin-area;mso-position-vertical:top;mso-position-vertical-relative:page;mso-width-percent:0;mso-height-percent:900;mso-width-relative:page;mso-height-relative:top-margin-area;v-text-anchor:top" o:gfxdata="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" fillcolor="#4472c4 [3208]" strokecolor="#1f3763 [1608]">
               <w10:wrap anchorx="margin" anchory="page"/>
@@ -12400,7 +11155,7 @@
 </file>
 
 <file path=word/header3.xml><?xml version="1.0" encoding="utf-8"?>
-<w:hdr xmlns:wpc="http://schemas.microsoft.com/office/word/2010/wordprocessingCanvas" xmlns:cx="http://schemas.microsoft.com/office/drawing/2014/chartex" xmlns:cx1="http://schemas.microsoft.com/office/drawing/2015/9/8/chartex" xmlns:cx2="http://schemas.microsoft.com/office/drawing/2015/10/21/chartex" xmlns:cx3="http://schemas.microsoft.com/office/drawing/2016/5/9/chartex" xmlns:cx4="http://schemas.microsoft.com/office/drawing/2016/5/10/chartex" xmlns:cx5="http://schemas.microsoft.com/office/drawing/2016/5/11/chartex" xmlns:cx6="http://schemas.microsoft.com/office/drawing/2016/5/12/chartex" xmlns:cx7="http://schemas.microsoft.com/office/drawing/2016/5/13/chartex" xmlns:cx8="http://schemas.microsoft.com/office/drawing/2016/5/14/chartex" xmlns:mc="http://schemas.openxmlformats.org/markup-compatibility/2006" xmlns:aink="http://schemas.microsoft.com/office/drawing/2016/ink" xmlns:am3d="http://schemas.microsoft.com/office/drawing/2017/model3d" xmlns:o="urn:schemas-microsoft-com:office:office" xmlns:oel="http://schemas.microsoft.com/office/2019/extlst" xmlns:r="http://schemas.openxmlformats.org/officeDocument/2006/relationships" xmlns:m="http://schemas.openxmlformats.org/officeDocument/2006/math" xmlns:v="urn:schemas-microsoft-com:vml" xmlns:wp14="http://schemas.microsoft.com/office/word/2010/wordprocessingDrawing" xmlns:wp="http://schemas.openxmlformats.org/drawingml/2006/wordprocessingDrawing" xmlns:w10="urn:schemas-microsoft-com:office:word" xmlns:w="http://schemas.openxmlformats.org/wordprocessingml/2006/main" xmlns:w14="http://schemas.microsoft.com/office/word/2010/wordml" xmlns:w15="http://schemas.microsoft.com/office/word/2012/wordml" xmlns:w16cei="http://schemas.microsoft.com/office/word/2026/wordml/cei" xmlns:w16cex="http://schemas.microsoft.com/office/word/2018/wordml/cex" xmlns:w16cid="http://schemas.microsoft.com/office/word/2016/wordml/cid" xmlns:w16="http://schemas.microsoft.com/office/word/2018/wordml" xmlns:w16du="http://schemas.microsoft.com/office/word/2023/wordml/word16du" xmlns:w16sdtdh="http://schemas.microsoft.com/office/word/2020/wordml/sdtdatahash" xmlns:w16sdtfl="http://schemas.microsoft.com/office/word/2024/wordml/sdtformatlock" xmlns:w16se="http://schemas.microsoft.com/office/word/2015/wordml/symex" xmlns:wpg="http://schemas.microsoft.com/office/word/2010/wordprocessingGroup" xmlns:wpi="http://schemas.microsoft.com/office/word/2010/wordprocessingInk" xmlns:wne="http://schemas.microsoft.com/office/word/2006/wordml" xmlns:wps="http://schemas.microsoft.com/office/word/2010/wordprocessingShape" mc:Ignorable="w14 w15 w16se w16cid w16 w16cex w16sdtdh w16sdtfl w16du wp14">
+<w:hdr xmlns:wpc="http://schemas.microsoft.com/office/word/2010/wordprocessingCanvas" xmlns:cx="http://schemas.microsoft.com/office/drawing/2014/chartex" xmlns:cx1="http://schemas.microsoft.com/office/drawing/2015/9/8/chartex" xmlns:cx2="http://schemas.microsoft.com/office/drawing/2015/10/21/chartex" xmlns:cx3="http://schemas.microsoft.com/office/drawing/2016/5/9/chartex" xmlns:cx4="http://schemas.microsoft.com/office/drawing/2016/5/10/chartex" xmlns:cx5="http://schemas.microsoft.com/office/drawing/2016/5/11/chartex" xmlns:cx6="http://schemas.microsoft.com/office/drawing/2016/5/12/chartex" xmlns:cx7="http://schemas.microsoft.com/office/drawing/2016/5/13/chartex" xmlns:cx8="http://schemas.microsoft.com/office/drawing/2016/5/14/chartex" xmlns:mc="http://schemas.openxmlformats.org/markup-compatibility/2006" xmlns:aink="http://schemas.microsoft.com/office/drawing/2016/ink" xmlns:am3d="http://schemas.microsoft.com/office/drawing/2017/model3d" xmlns:o="urn:schemas-microsoft-com:office:office" xmlns:oel="http://schemas.microsoft.com/office/2019/extlst" xmlns:r="http://schemas.openxmlformats.org/officeDocument/2006/relationships" xmlns:m="http://schemas.openxmlformats.org/officeDocument/2006/math" xmlns:v="urn:schemas-microsoft-com:vml" xmlns:wp14="http://schemas.microsoft.com/office/word/2010/wordprocessingDrawing" xmlns:wp="http://schemas.openxmlformats.org/drawingml/2006/wordprocessingDrawing" xmlns:w10="urn:schemas-microsoft-com:office:word" xmlns:w="http://schemas.openxmlformats.org/wordprocessingml/2006/main" xmlns:w14="http://schemas.microsoft.com/office/word/2010/wordml" xmlns:w15="http://schemas.microsoft.com/office/word/2012/wordml" xmlns:w16cex="http://schemas.microsoft.com/office/word/2018/wordml/cex" xmlns:w16cid="http://schemas.microsoft.com/office/word/2016/wordml/cid" xmlns:w16="http://schemas.microsoft.com/office/word/2018/wordml" xmlns:w16du="http://schemas.microsoft.com/office/word/2023/wordml/word16du" xmlns:w16sdtdh="http://schemas.microsoft.com/office/word/2020/wordml/sdtdatahash" xmlns:w16sdtfl="http://schemas.microsoft.com/office/word/2024/wordml/sdtformatlock" xmlns:w16se="http://schemas.microsoft.com/office/word/2015/wordml/symex" xmlns:wpg="http://schemas.microsoft.com/office/word/2010/wordprocessingGroup" xmlns:wpi="http://schemas.microsoft.com/office/word/2010/wordprocessingInk" xmlns:wne="http://schemas.microsoft.com/office/word/2006/wordml" xmlns:wps="http://schemas.microsoft.com/office/word/2010/wordprocessingShape" mc:Ignorable="w14 w15 w16se w16cid w16 w16cex w16sdtdh w16sdtfl w16du wp14">
   <w:p>
     <w:pPr>
       <w:pStyle w:val="Header"/>
@@ -12410,7 +11165,7 @@
 </file>
 
 <file path=word/numbering.xml><?xml version="1.0" encoding="utf-8"?>
-<w:numbering xmlns:wpc="http://schemas.microsoft.com/office/word/2010/wordprocessingCanvas" xmlns:cx="http://schemas.microsoft.com/office/drawing/2014/chartex" xmlns:cx1="http://schemas.microsoft.com/office/drawing/2015/9/8/chartex" xmlns:cx2="http://schemas.microsoft.com/office/drawing/2015/10/21/chartex" xmlns:cx3="http://schemas.microsoft.com/office/drawing/2016/5/9/chartex" xmlns:cx4="http://schemas.microsoft.com/office/drawing/2016/5/10/chartex" xmlns:cx5="http://schemas.microsoft.com/office/drawing/2016/5/11/chartex" xmlns:cx6="http://schemas.microsoft.com/office/drawing/2016/5/12/chartex" xmlns:cx7="http://schemas.microsoft.com/office/drawing/2016/5/13/chartex" xmlns:cx8="http://schemas.microsoft.com/office/drawing/2016/5/14/chartex" xmlns:mc="http://schemas.openxmlformats.org/markup-compatibility/2006" xmlns:aink="http://schemas.microsoft.com/office/drawing/2016/ink" xmlns:am3d="http://schemas.microsoft.com/office/drawing/2017/model3d" xmlns:o="urn:schemas-microsoft-com:office:office" xmlns:oel="http://schemas.microsoft.com/office/2019/extlst" xmlns:r="http://schemas.openxmlformats.org/officeDocument/2006/relationships" xmlns:m="http://schemas.openxmlformats.org/officeDocument/2006/math" xmlns:v="urn:schemas-microsoft-com:vml" xmlns:wp14="http://schemas.microsoft.com/office/word/2010/wordprocessingDrawing" xmlns:wp="http://schemas.openxmlformats.org/drawingml/2006/wordprocessingDrawing" xmlns:w10="urn:schemas-microsoft-com:office:word" xmlns:w="http://schemas.openxmlformats.org/wordprocessingml/2006/main" xmlns:w14="http://schemas.microsoft.com/office/word/2010/wordml" xmlns:w15="http://schemas.microsoft.com/office/word/2012/wordml" xmlns:w16cei="http://schemas.microsoft.com/office/word/2026/wordml/cei" xmlns:w16cex="http://schemas.microsoft.com/office/word/2018/wordml/cex" xmlns:w16cid="http://schemas.microsoft.com/office/word/2016/wordml/cid" xmlns:w16="http://schemas.microsoft.com/office/word/2018/wordml" xmlns:w16du="http://schemas.microsoft.com/office/word/2023/wordml/word16du" xmlns:w16sdtdh="http://schemas.microsoft.com/office/word/2020/wordml/sdtdatahash" xmlns:w16sdtfl="http://schemas.microsoft.com/office/word/2024/wordml/sdtformatlock" xmlns:w16se="http://schemas.microsoft.com/office/word/2015/wordml/symex" xmlns:wpg="http://schemas.microsoft.com/office/word/2010/wordprocessingGroup" xmlns:wpi="http://schemas.microsoft.com/office/word/2010/wordprocessingInk" xmlns:wne="http://schemas.microsoft.com/office/word/2006/wordml" xmlns:wps="http://schemas.microsoft.com/office/word/2010/wordprocessingShape" mc:Ignorable="w14 w15 w16se w16cid w16 w16cex w16sdtdh w16sdtfl w16du wp14">
+<w:numbering xmlns:wpc="http://schemas.microsoft.com/office/word/2010/wordprocessingCanvas" xmlns:cx="http://schemas.microsoft.com/office/drawing/2014/chartex" xmlns:cx1="http://schemas.microsoft.com/office/drawing/2015/9/8/chartex" xmlns:cx2="http://schemas.microsoft.com/office/drawing/2015/10/21/chartex" xmlns:cx3="http://schemas.microsoft.com/office/drawing/2016/5/9/chartex" xmlns:cx4="http://schemas.microsoft.com/office/drawing/2016/5/10/chartex" xmlns:cx5="http://schemas.microsoft.com/office/drawing/2016/5/11/chartex" xmlns:cx6="http://schemas.microsoft.com/office/drawing/2016/5/12/chartex" xmlns:cx7="http://schemas.microsoft.com/office/drawing/2016/5/13/chartex" xmlns:cx8="http://schemas.microsoft.com/office/drawing/2016/5/14/chartex" xmlns:mc="http://schemas.openxmlformats.org/markup-compatibility/2006" xmlns:aink="http://schemas.microsoft.com/office/drawing/2016/ink" xmlns:am3d="http://schemas.microsoft.com/office/drawing/2017/model3d" xmlns:o="urn:schemas-microsoft-com:office:office" xmlns:oel="http://schemas.microsoft.com/office/2019/extlst" xmlns:r="http://schemas.openxmlformats.org/officeDocument/2006/relationships" xmlns:m="http://schemas.openxmlformats.org/officeDocument/2006/math" xmlns:v="urn:schemas-microsoft-com:vml" xmlns:wp14="http://schemas.microsoft.com/office/word/2010/wordprocessingDrawing" xmlns:wp="http://schemas.openxmlformats.org/drawingml/2006/wordprocessingDrawing" xmlns:w10="urn:schemas-microsoft-com:office:word" xmlns:w="http://schemas.openxmlformats.org/wordprocessingml/2006/main" xmlns:w14="http://schemas.microsoft.com/office/word/2010/wordml" xmlns:w15="http://schemas.microsoft.com/office/word/2012/wordml" xmlns:w16cex="http://schemas.microsoft.com/office/word/2018/wordml/cex" xmlns:w16cid="http://schemas.microsoft.com/office/word/2016/wordml/cid" xmlns:w16="http://schemas.microsoft.com/office/word/2018/wordml" xmlns:w16du="http://schemas.microsoft.com/office/word/2023/wordml/word16du" xmlns:w16sdtdh="http://schemas.microsoft.com/office/word/2020/wordml/sdtdatahash" xmlns:w16sdtfl="http://schemas.microsoft.com/office/word/2024/wordml/sdtformatlock" xmlns:w16se="http://schemas.microsoft.com/office/word/2015/wordml/symex" xmlns:wpg="http://schemas.microsoft.com/office/word/2010/wordprocessingGroup" xmlns:wpi="http://schemas.microsoft.com/office/word/2010/wordprocessingInk" xmlns:wne="http://schemas.microsoft.com/office/word/2006/wordml" xmlns:wps="http://schemas.microsoft.com/office/word/2010/wordprocessingShape" mc:Ignorable="w14 w15 w16se w16cid w16 w16cex w16sdtdh w16sdtfl w16du wp14">
   <w:abstractNum w:abstractNumId="0" w15:restartNumberingAfterBreak="0">
     <w:nsid w:val="013A4BB7"/>
     <w:multiLevelType w:val="multilevel"/>

</xml_diff>

<commit_message>
Fixing gaps with the requirement shared
</commit_message>
<xml_diff>
--- a/docs/dar/Utsav_eClaims_DAR_Backend.docx
+++ b/docs/dar/Utsav_eClaims_DAR_Backend.docx
@@ -1188,6 +1188,12 @@
                 <w:rFonts w:asciiTheme="majorHAnsi" w:hAnsiTheme="majorHAnsi"/>
               </w:rPr>
             </w:pPr>
+            <w:r>
+              <w:rPr>
+                <w:rFonts w:asciiTheme="majorHAnsi" w:hAnsiTheme="majorHAnsi"/>
+              </w:rPr>
+              <w:t>1.3</w:t>
+            </w:r>
           </w:p>
         </w:tc>
         <w:tc>
@@ -1207,6 +1213,12 @@
                 <w:rFonts w:asciiTheme="majorHAnsi" w:hAnsiTheme="majorHAnsi"/>
               </w:rPr>
             </w:pPr>
+            <w:r>
+              <w:rPr>
+                <w:rFonts w:asciiTheme="majorHAnsi" w:hAnsiTheme="majorHAnsi"/>
+              </w:rPr>
+              <w:t>30-10-2026</w:t>
+            </w:r>
           </w:p>
         </w:tc>
         <w:tc>
@@ -1226,6 +1238,12 @@
                 <w:rFonts w:asciiTheme="majorHAnsi" w:hAnsiTheme="majorHAnsi"/>
               </w:rPr>
             </w:pPr>
+            <w:r>
+              <w:rPr>
+                <w:rFonts w:asciiTheme="majorHAnsi" w:hAnsiTheme="majorHAnsi"/>
+              </w:rPr>
+              <w:t>Utsav Verma</w:t>
+            </w:r>
           </w:p>
         </w:tc>
         <w:tc>
@@ -1245,6 +1263,12 @@
                 <w:rFonts w:asciiTheme="majorHAnsi" w:hAnsiTheme="majorHAnsi"/>
               </w:rPr>
             </w:pPr>
+            <w:r>
+              <w:rPr>
+                <w:rFonts w:asciiTheme="majorHAnsi" w:hAnsiTheme="majorHAnsi"/>
+              </w:rPr>
+              <w:t>Aligned with SAD v2.0: API versioning and the pipeline contract check under well-defined interface standards; SAD reference updated to v2.0</w:t>
+            </w:r>
           </w:p>
         </w:tc>
       </w:tr>
@@ -3897,10 +3921,10 @@
         <w:rPr>
           <w:b/>
         </w:rPr>
-        <w:t>Well-defined data and interface standards</w:t>
-      </w:r>
-      <w:r>
-        <w:t xml:space="preserve"> — the contract between each service and its consumers — the three portals and the mobile app — and between services, must be explicit, published and kept in step with the implementation.</w:t>
+        <w:t>Well-defined data and interface standards — the contract between each service and its consumers — the three portals and the mobile app — and between services, must be explicit, published and kept in step with the implementation. Paths carry a major version, and the pipeline compares each OpenAPI contract with the last released one, so a breaking change fails the build (SAD Section 4, Interface standards and versioning).</w:t>
+      </w:r>
+      <w:r>
+        <w:t xml:space="preserve"/>
       </w:r>
     </w:p>
     <w:p>
@@ -10037,7 +10061,7 @@
         </w:numPr>
       </w:pPr>
       <w:r>
-        <w:t>eClaims Solution Approach Document (SAD) v1.9 — docs/sad/solution-approach-document.md, Section 7 Non-Functional Requirements and Section 8 Technology Stack</w:t>
+        <w:t>eClaims Solution Approach Document (SAD) v2.0 — docs/sad/solution-approach-document.md, Section 7 Non-Functional Requirements and Section 8 Technology Stack</w:t>
       </w:r>
     </w:p>
     <w:p>

</xml_diff>